<commit_message>
output voltage swing method  done
</commit_message>
<xml_diff>
--- a/report_lab3.docx
+++ b/report_lab3.docx
@@ -1925,16 +1925,6 @@
     </w:p>
     <w:p>
       <w:pPr>
-        <w:spacing w:before="100" w:beforeAutospacing="1" w:after="100" w:afterAutospacing="1" w:line="240" w:lineRule="auto"/>
-        <w:jc w:val="left"/>
-        <w:rPr>
-          <w:szCs w:val="24"/>
-          <w:lang w:val="en-US" w:eastAsia="en-GB"/>
-        </w:rPr>
-      </w:pPr>
-    </w:p>
-    <w:p>
-      <w:pPr>
         <w:keepNext/>
         <w:spacing w:before="100" w:beforeAutospacing="1" w:after="100" w:afterAutospacing="1" w:line="240" w:lineRule="auto"/>
         <w:jc w:val="center"/>
@@ -1942,13 +1932,13 @@
       <w:r>
         <w:rPr>
           <w:szCs w:val="24"/>
-          <w:lang w:val="en-FI" w:eastAsia="en-GB"/>
+          <w:lang w:val="en-US" w:eastAsia="en-GB"/>
         </w:rPr>
         <w:drawing>
-          <wp:inline distT="0" distB="0" distL="0" distR="0" wp14:anchorId="3158E071" wp14:editId="3ECCDC6D">
-            <wp:extent cx="4014788" cy="2606238"/>
-            <wp:effectExtent l="0" t="0" r="0" b="0"/>
-            <wp:docPr id="1129224664" name="Picture 1"/>
+          <wp:inline distT="0" distB="0" distL="0" distR="0" wp14:anchorId="457AE85B" wp14:editId="6D446D41">
+            <wp:extent cx="5069795" cy="2383277"/>
+            <wp:effectExtent l="0" t="0" r="0" b="4445"/>
+            <wp:docPr id="2103784444" name="Picture 1"/>
             <wp:cNvGraphicFramePr>
               <a:graphicFrameLocks xmlns:a="http://schemas.openxmlformats.org/drawingml/2006/main" noChangeAspect="1"/>
             </wp:cNvGraphicFramePr>
@@ -1956,7 +1946,7 @@
               <a:graphicData uri="http://schemas.openxmlformats.org/drawingml/2006/picture">
                 <pic:pic xmlns:pic="http://schemas.openxmlformats.org/drawingml/2006/picture">
                   <pic:nvPicPr>
-                    <pic:cNvPr id="1129224664" name=""/>
+                    <pic:cNvPr id="2103784444" name=""/>
                     <pic:cNvPicPr/>
                   </pic:nvPicPr>
                   <pic:blipFill>
@@ -1968,7 +1958,7 @@
                   <pic:spPr>
                     <a:xfrm>
                       <a:off x="0" y="0"/>
-                      <a:ext cx="4057593" cy="2634026"/>
+                      <a:ext cx="5094537" cy="2394908"/>
                     </a:xfrm>
                     <a:prstGeom prst="rect">
                       <a:avLst/>
@@ -1987,7 +1977,8 @@
         <w:ind w:left="0" w:firstLine="0"/>
         <w:jc w:val="left"/>
         <w:rPr>
-          <w:lang w:val="en-US"/>
+          <w:szCs w:val="24"/>
+          <w:lang w:val="en-US" w:eastAsia="en-GB"/>
         </w:rPr>
       </w:pPr>
       <w:r>
@@ -2033,8 +2024,11 @@
     </w:p>
     <w:p>
       <w:pPr>
-        <w:rPr>
-          <w:lang w:val="en-US" w:eastAsia="en-GB"/>
+        <w:pStyle w:val="Caption"/>
+        <w:ind w:left="0" w:firstLine="0"/>
+        <w:jc w:val="left"/>
+        <w:rPr>
+          <w:lang w:val="en-US"/>
         </w:rPr>
       </w:pPr>
     </w:p>
@@ -2174,9 +2168,632 @@
     <w:p>
       <w:pPr>
         <w:rPr>
-          <w:lang w:val="en-FI"/>
-        </w:rPr>
-      </w:pPr>
+          <w:lang w:val="en-US"/>
+        </w:rPr>
+      </w:pPr>
+      <w:r>
+        <w:rPr>
+          <w:lang w:val="en-US"/>
+        </w:rPr>
+        <w:t>When no input signal is applied, the output of an op-amp is ideally 0 V, which is known as the quiescent output voltage. When an input signal is applied, the output could ideally swing as far as ±V</w:t>
+      </w:r>
+      <w:r>
+        <w:rPr>
+          <w:vertAlign w:val="subscript"/>
+          <w:lang w:val="en-US"/>
+        </w:rPr>
+        <w:t>CC</w:t>
+      </w:r>
+      <w:r>
+        <w:rPr>
+          <w:lang w:val="en-US"/>
+        </w:rPr>
+        <w:t xml:space="preserve">, </w:t>
+      </w:r>
+      <w:r>
+        <w:rPr>
+          <w:lang w:val="en-US"/>
+        </w:rPr>
+        <w:t>the suppl</w:t>
+      </w:r>
+      <w:r>
+        <w:rPr>
+          <w:lang w:val="en-US"/>
+        </w:rPr>
+        <w:t>y rail</w:t>
+      </w:r>
+      <w:r>
+        <w:rPr>
+          <w:lang w:val="en-US"/>
+        </w:rPr>
+        <w:t xml:space="preserve"> voltages. In practice, the output can come close to these limits but never quite reaches them. The peak-to-peak output swing depends on the load connected to the op-amp, and it increases as the load resistance increases</w:t>
+      </w:r>
+      <w:r>
+        <w:rPr>
+          <w:lang w:val="en-US"/>
+        </w:rPr>
+        <w:t xml:space="preserve"> </w:t>
+      </w:r>
+      <w:r>
+        <w:rPr>
+          <w:szCs w:val="24"/>
+          <w:lang w:val="en-FI" w:eastAsia="en-GB"/>
+        </w:rPr>
+        <w:t>(Floyd, 2005, p</w:t>
+      </w:r>
+      <w:r>
+        <w:rPr>
+          <w:szCs w:val="24"/>
+          <w:lang w:val="en-FI" w:eastAsia="en-GB"/>
+        </w:rPr>
+        <w:t>.</w:t>
+      </w:r>
+      <w:r>
+        <w:rPr>
+          <w:szCs w:val="24"/>
+          <w:lang w:val="en-FI" w:eastAsia="en-GB"/>
+        </w:rPr>
+        <w:t>60</w:t>
+      </w:r>
+      <w:r>
+        <w:rPr>
+          <w:szCs w:val="24"/>
+          <w:lang w:val="en-FI" w:eastAsia="en-GB"/>
+        </w:rPr>
+        <w:t>7</w:t>
+      </w:r>
+      <w:r>
+        <w:rPr>
+          <w:szCs w:val="24"/>
+          <w:lang w:val="en-FI" w:eastAsia="en-GB"/>
+        </w:rPr>
+        <w:t>)</w:t>
+      </w:r>
+      <w:r>
+        <w:rPr>
+          <w:lang w:val="en-US"/>
+        </w:rPr>
+        <w:t>.</w:t>
+      </w:r>
+      <w:r>
+        <w:rPr>
+          <w:lang w:val="en-US"/>
+        </w:rPr>
+        <w:t xml:space="preserve"> </w:t>
+      </w:r>
+    </w:p>
+    <w:p>
+      <w:pPr>
+        <w:rPr>
+          <w:lang w:val="en-US"/>
+        </w:rPr>
+      </w:pPr>
+      <w:r>
+        <w:rPr>
+          <w:lang w:val="en-US"/>
+        </w:rPr>
+        <w:t>The LM358 is a</w:t>
+      </w:r>
+      <w:r>
+        <w:rPr>
+          <w:lang w:val="en-US"/>
+        </w:rPr>
+        <w:t xml:space="preserve"> so-called single-supply op amp. It has a C-M</w:t>
+      </w:r>
+      <w:r>
+        <w:rPr>
+          <w:lang w:val="en-US"/>
+        </w:rPr>
+        <w:t xml:space="preserve"> </w:t>
+      </w:r>
+      <w:r>
+        <w:rPr>
+          <w:lang w:val="en-US"/>
+        </w:rPr>
+        <w:t xml:space="preserve">(Common mode) </w:t>
+      </w:r>
+      <w:r>
+        <w:rPr>
+          <w:lang w:val="en-US"/>
+        </w:rPr>
+        <w:t>range that extends to, and often slightly below, the negative rail.</w:t>
+      </w:r>
+      <w:r>
+        <w:rPr>
+          <w:lang w:val="en-US"/>
+        </w:rPr>
+        <w:t xml:space="preserve"> </w:t>
+      </w:r>
+      <w:r>
+        <w:rPr>
+          <w:lang w:val="en-US"/>
+        </w:rPr>
+        <w:t>That range allows its use in a wider range of circuits that operate</w:t>
+      </w:r>
+      <w:r>
+        <w:rPr>
+          <w:lang w:val="en-US"/>
+        </w:rPr>
+        <w:t xml:space="preserve"> </w:t>
+      </w:r>
+      <w:r>
+        <w:rPr>
+          <w:lang w:val="en-US"/>
+        </w:rPr>
+        <w:t>close to ground.</w:t>
+      </w:r>
+      <w:r>
+        <w:rPr>
+          <w:lang w:val="en-US"/>
+        </w:rPr>
+        <w:t xml:space="preserve"> </w:t>
+      </w:r>
+      <w:r>
+        <w:rPr>
+          <w:lang w:val="en-US"/>
+        </w:rPr>
+        <w:t>A “rail-to-rail” op-amp goes further, since it can operate with input voltages equal to, or even slightly beyond, both supply rails</w:t>
+      </w:r>
+      <w:r>
+        <w:rPr>
+          <w:lang w:val="en-US"/>
+        </w:rPr>
+        <w:t xml:space="preserve"> </w:t>
+      </w:r>
+      <w:r>
+        <w:rPr>
+          <w:lang w:val="en-US"/>
+        </w:rPr>
+        <w:t>(Trump, 2017, p.4)</w:t>
+      </w:r>
+      <w:r>
+        <w:rPr>
+          <w:lang w:val="en-US"/>
+        </w:rPr>
+        <w:t>.</w:t>
+      </w:r>
+    </w:p>
+    <w:p>
+      <w:pPr>
+        <w:rPr>
+          <w:lang w:val="en-US"/>
+        </w:rPr>
+      </w:pPr>
+    </w:p>
+    <w:p>
+      <w:pPr>
+        <w:keepNext/>
+        <w:jc w:val="center"/>
+      </w:pPr>
+      <w:r>
+        <w:rPr>
+          <w:lang w:val="en-FI" w:eastAsia="en-GB"/>
+        </w:rPr>
+        <w:drawing>
+          <wp:inline distT="0" distB="0" distL="0" distR="0" wp14:anchorId="1CFF150C" wp14:editId="75BAEBD5">
+            <wp:extent cx="4474724" cy="2044136"/>
+            <wp:effectExtent l="0" t="0" r="0" b="635"/>
+            <wp:docPr id="460185193" name="Picture 1"/>
+            <wp:cNvGraphicFramePr>
+              <a:graphicFrameLocks xmlns:a="http://schemas.openxmlformats.org/drawingml/2006/main" noChangeAspect="1"/>
+            </wp:cNvGraphicFramePr>
+            <a:graphic xmlns:a="http://schemas.openxmlformats.org/drawingml/2006/main">
+              <a:graphicData uri="http://schemas.openxmlformats.org/drawingml/2006/picture">
+                <pic:pic xmlns:pic="http://schemas.openxmlformats.org/drawingml/2006/picture">
+                  <pic:nvPicPr>
+                    <pic:cNvPr id="460185193" name=""/>
+                    <pic:cNvPicPr/>
+                  </pic:nvPicPr>
+                  <pic:blipFill>
+                    <a:blip r:embed="rId15"/>
+                    <a:stretch>
+                      <a:fillRect/>
+                    </a:stretch>
+                  </pic:blipFill>
+                  <pic:spPr>
+                    <a:xfrm>
+                      <a:off x="0" y="0"/>
+                      <a:ext cx="4538201" cy="2073134"/>
+                    </a:xfrm>
+                    <a:prstGeom prst="rect">
+                      <a:avLst/>
+                    </a:prstGeom>
+                  </pic:spPr>
+                </pic:pic>
+              </a:graphicData>
+            </a:graphic>
+          </wp:inline>
+        </w:drawing>
+      </w:r>
+    </w:p>
+    <w:p>
+      <w:pPr>
+        <w:pStyle w:val="Caption"/>
+        <w:ind w:left="0" w:firstLine="0"/>
+        <w:jc w:val="left"/>
+        <w:rPr>
+          <w:lang w:val="en-US"/>
+        </w:rPr>
+      </w:pPr>
+      <w:r>
+        <w:rPr>
+          <w:lang w:val="en-US"/>
+        </w:rPr>
+        <w:t xml:space="preserve">Figure </w:t>
+      </w:r>
+      <w:r>
+        <w:fldChar w:fldCharType="begin"/>
+      </w:r>
+      <w:r>
+        <w:rPr>
+          <w:lang w:val="en-US"/>
+        </w:rPr>
+        <w:instrText xml:space="preserve"> SEQ Figure \* ARABIC </w:instrText>
+      </w:r>
+      <w:r>
+        <w:fldChar w:fldCharType="separate"/>
+      </w:r>
+      <w:r>
+        <w:rPr>
+          <w:noProof/>
+          <w:lang w:val="en-US"/>
+        </w:rPr>
+        <w:t>5</w:t>
+      </w:r>
+      <w:r>
+        <w:fldChar w:fldCharType="end"/>
+      </w:r>
+      <w:r>
+        <w:rPr>
+          <w:lang w:val="en-US"/>
+        </w:rPr>
+        <w:t>.</w:t>
+      </w:r>
+      <w:r>
+        <w:rPr>
+          <w:lang w:val="en-US"/>
+        </w:rPr>
+        <w:t xml:space="preserve"> </w:t>
+      </w:r>
+      <w:r>
+        <w:rPr>
+          <w:lang w:val="en-US"/>
+        </w:rPr>
+        <w:t>Input and output voltage ranges of a typical op amp used</w:t>
+      </w:r>
+      <w:r>
+        <w:rPr>
+          <w:lang w:val="en-US"/>
+        </w:rPr>
+        <w:t xml:space="preserve"> </w:t>
+      </w:r>
+      <w:r>
+        <w:rPr>
+          <w:lang w:val="en-US"/>
+        </w:rPr>
+        <w:t>on dual supplies</w:t>
+      </w:r>
+      <w:r>
+        <w:rPr>
+          <w:lang w:val="en-US"/>
+        </w:rPr>
+        <w:t xml:space="preserve">. </w:t>
+      </w:r>
+      <w:r>
+        <w:rPr>
+          <w:lang w:val="en-US"/>
+        </w:rPr>
+        <w:t xml:space="preserve">The output capability of the example </w:t>
+      </w:r>
+      <w:r>
+        <w:rPr>
+          <w:lang w:val="en-US"/>
+        </w:rPr>
+        <w:t>is</w:t>
+      </w:r>
+      <w:r>
+        <w:rPr>
+          <w:lang w:val="en-US"/>
+        </w:rPr>
+        <w:t xml:space="preserve"> limited</w:t>
+      </w:r>
+      <w:r>
+        <w:rPr>
+          <w:lang w:val="en-US"/>
+        </w:rPr>
+        <w:t xml:space="preserve"> </w:t>
+      </w:r>
+      <w:r>
+        <w:rPr>
+          <w:lang w:val="en-US"/>
+        </w:rPr>
+        <w:t>to 2 V from the negative rail and 2.5 V from the positive rail, which</w:t>
+      </w:r>
+      <w:r>
+        <w:rPr>
+          <w:lang w:val="en-US"/>
+        </w:rPr>
+        <w:t xml:space="preserve"> </w:t>
+      </w:r>
+      <w:r>
+        <w:rPr>
+          <w:lang w:val="en-US"/>
+        </w:rPr>
+        <w:t xml:space="preserve">is due to the limited-input C-M range. </w:t>
+      </w:r>
+      <w:r>
+        <w:rPr>
+          <w:lang w:val="en-US"/>
+        </w:rPr>
+        <w:t xml:space="preserve">One </w:t>
+      </w:r>
+      <w:r>
+        <w:rPr>
+          <w:lang w:val="en-US"/>
+        </w:rPr>
+        <w:t>would need to configure</w:t>
+      </w:r>
+      <w:r>
+        <w:rPr>
+          <w:lang w:val="en-US"/>
+        </w:rPr>
+        <w:t xml:space="preserve"> </w:t>
+      </w:r>
+      <w:r>
+        <w:rPr>
+          <w:lang w:val="en-US"/>
+        </w:rPr>
+        <w:t>this op amp in a higher gain to deliver its full output-voltage range.</w:t>
+      </w:r>
+      <w:r>
+        <w:rPr>
+          <w:lang w:val="en-US"/>
+        </w:rPr>
+        <w:t xml:space="preserve"> </w:t>
+      </w:r>
+      <w:r>
+        <w:rPr>
+          <w:lang w:val="en-US"/>
+        </w:rPr>
+        <w:t>(</w:t>
+      </w:r>
+      <w:r>
+        <w:rPr>
+          <w:lang w:val="en-US"/>
+        </w:rPr>
+        <w:t>Trump, 2017, p.4</w:t>
+      </w:r>
+      <w:r>
+        <w:rPr>
+          <w:lang w:val="en-US"/>
+        </w:rPr>
+        <w:t>)</w:t>
+      </w:r>
+      <w:r>
+        <w:rPr>
+          <w:lang w:val="en-US"/>
+        </w:rPr>
+        <w:t>.</w:t>
+      </w:r>
+    </w:p>
+    <w:p>
+      <w:pPr>
+        <w:rPr>
+          <w:lang w:val="en-US"/>
+        </w:rPr>
+      </w:pPr>
+    </w:p>
+    <w:p>
+      <w:pPr>
+        <w:rPr>
+          <w:lang w:val="en-US"/>
+        </w:rPr>
+      </w:pPr>
+      <w:r>
+        <w:rPr>
+          <w:lang w:val="en-US"/>
+        </w:rPr>
+        <w:t xml:space="preserve">The simulated output swing limits, </w:t>
+      </w:r>
+      <w:r>
+        <w:rPr>
+          <w:lang w:val="en-US"/>
+        </w:rPr>
+        <w:t>V</w:t>
+      </w:r>
+      <w:r>
+        <w:rPr>
+          <w:vertAlign w:val="subscript"/>
+          <w:lang w:val="en-US"/>
+        </w:rPr>
+        <w:t>OH</w:t>
+      </w:r>
+      <w:r>
+        <w:rPr>
+          <w:lang w:val="en-US"/>
+        </w:rPr>
+        <w:t xml:space="preserve"> and V</w:t>
+      </w:r>
+      <w:r>
+        <w:rPr>
+          <w:vertAlign w:val="subscript"/>
+          <w:lang w:val="en-US"/>
+        </w:rPr>
+        <w:t>OL</w:t>
+      </w:r>
+      <w:r>
+        <w:rPr>
+          <w:lang w:val="en-US"/>
+        </w:rPr>
+        <w:t>, were estimated using the circuit shown in Figure 6.</w:t>
+      </w:r>
+      <w:r>
+        <w:rPr>
+          <w:lang w:val="en-US"/>
+        </w:rPr>
+        <w:t xml:space="preserve"> I</w:t>
+      </w:r>
+      <w:r>
+        <w:rPr>
+          <w:lang w:val="en-US"/>
+        </w:rPr>
+        <w:t>n the laboratory measurements, a sinusoidal input was used instead.</w:t>
+      </w:r>
+    </w:p>
+    <w:p>
+      <w:pPr>
+        <w:rPr>
+          <w:lang w:val="en-US"/>
+        </w:rPr>
+      </w:pPr>
+    </w:p>
+    <w:p>
+      <w:pPr>
+        <w:keepNext/>
+        <w:jc w:val="center"/>
+      </w:pPr>
+      <w:r>
+        <w:rPr>
+          <w:vertAlign w:val="subscript"/>
+          <w:lang w:val="en-US"/>
+        </w:rPr>
+        <w:drawing>
+          <wp:inline distT="0" distB="0" distL="0" distR="0" wp14:anchorId="1BE83E39" wp14:editId="0F374465">
+            <wp:extent cx="4623827" cy="2156078"/>
+            <wp:effectExtent l="0" t="0" r="0" b="3175"/>
+            <wp:docPr id="1199161760" name="Picture 1"/>
+            <wp:cNvGraphicFramePr>
+              <a:graphicFrameLocks xmlns:a="http://schemas.openxmlformats.org/drawingml/2006/main" noChangeAspect="1"/>
+            </wp:cNvGraphicFramePr>
+            <a:graphic xmlns:a="http://schemas.openxmlformats.org/drawingml/2006/main">
+              <a:graphicData uri="http://schemas.openxmlformats.org/drawingml/2006/picture">
+                <pic:pic xmlns:pic="http://schemas.openxmlformats.org/drawingml/2006/picture">
+                  <pic:nvPicPr>
+                    <pic:cNvPr id="1199161760" name=""/>
+                    <pic:cNvPicPr/>
+                  </pic:nvPicPr>
+                  <pic:blipFill>
+                    <a:blip r:embed="rId16"/>
+                    <a:stretch>
+                      <a:fillRect/>
+                    </a:stretch>
+                  </pic:blipFill>
+                  <pic:spPr>
+                    <a:xfrm>
+                      <a:off x="0" y="0"/>
+                      <a:ext cx="4696373" cy="2189906"/>
+                    </a:xfrm>
+                    <a:prstGeom prst="rect">
+                      <a:avLst/>
+                    </a:prstGeom>
+                  </pic:spPr>
+                </pic:pic>
+              </a:graphicData>
+            </a:graphic>
+          </wp:inline>
+        </w:drawing>
+      </w:r>
+    </w:p>
+    <w:p>
+      <w:pPr>
+        <w:pStyle w:val="Caption"/>
+        <w:ind w:left="0" w:firstLine="0"/>
+        <w:jc w:val="left"/>
+        <w:rPr>
+          <w:lang w:val="en-US"/>
+        </w:rPr>
+      </w:pPr>
+      <w:r>
+        <w:rPr>
+          <w:lang w:val="en-US"/>
+        </w:rPr>
+        <w:t xml:space="preserve">Figure </w:t>
+      </w:r>
+      <w:r>
+        <w:fldChar w:fldCharType="begin"/>
+      </w:r>
+      <w:r>
+        <w:rPr>
+          <w:lang w:val="en-US"/>
+        </w:rPr>
+        <w:instrText xml:space="preserve"> SEQ Figure \* ARABIC </w:instrText>
+      </w:r>
+      <w:r>
+        <w:fldChar w:fldCharType="separate"/>
+      </w:r>
+      <w:r>
+        <w:rPr>
+          <w:noProof/>
+          <w:lang w:val="en-US"/>
+        </w:rPr>
+        <w:t>6</w:t>
+      </w:r>
+      <w:r>
+        <w:fldChar w:fldCharType="end"/>
+      </w:r>
+      <w:r>
+        <w:rPr>
+          <w:lang w:val="en-US"/>
+        </w:rPr>
+        <w:t xml:space="preserve">. </w:t>
+      </w:r>
+      <w:r>
+        <w:rPr>
+          <w:lang w:val="en-US"/>
+        </w:rPr>
+        <w:t>C</w:t>
+      </w:r>
+      <w:r>
+        <w:rPr>
+          <w:lang w:val="en-US"/>
+        </w:rPr>
+        <w:t>ircuit used to estimate V</w:t>
+      </w:r>
+      <w:r>
+        <w:rPr>
+          <w:vertAlign w:val="subscript"/>
+          <w:lang w:val="en-US"/>
+        </w:rPr>
+        <w:t>OH</w:t>
+      </w:r>
+      <w:r>
+        <w:rPr>
+          <w:lang w:val="en-US"/>
+        </w:rPr>
+        <w:t xml:space="preserve"> and V</w:t>
+      </w:r>
+      <w:r>
+        <w:rPr>
+          <w:vertAlign w:val="subscript"/>
+          <w:lang w:val="en-US"/>
+        </w:rPr>
+        <w:t>OL</w:t>
+      </w:r>
+      <w:r>
+        <w:rPr>
+          <w:lang w:val="en-US"/>
+        </w:rPr>
+        <w:t>. A pulse source V1, configured to produce a triangular wave, drives an LM358 voltage follower powered from ±10 V supplies, with a load resistor R</w:t>
+      </w:r>
+      <w:r>
+        <w:rPr>
+          <w:vertAlign w:val="subscript"/>
+          <w:lang w:val="en-US"/>
+        </w:rPr>
+        <w:t>L</w:t>
+      </w:r>
+      <w:r>
+        <w:rPr>
+          <w:lang w:val="en-US"/>
+        </w:rPr>
+        <w:t xml:space="preserve"> </w:t>
+      </w:r>
+      <w:r>
+        <w:rPr>
+          <w:lang w:val="en-US"/>
+        </w:rPr>
+        <w:t>is swept through a set of values.</w:t>
+      </w:r>
     </w:p>
     <w:p>
       <w:pPr>
@@ -2330,7 +2947,7 @@
                     <pic:cNvPicPr/>
                   </pic:nvPicPr>
                   <pic:blipFill>
-                    <a:blip r:embed="rId15" cstate="print">
+                    <a:blip r:embed="rId17" cstate="print">
                       <a:extLst>
                         <a:ext uri="{28A0092B-C50C-407E-A947-70E740481C1C}">
                           <a14:useLocalDpi xmlns:a14="http://schemas.microsoft.com/office/drawing/2010/main" val="0"/>
@@ -3012,7 +3629,6 @@
         <w:rPr>
           <w:noProof/>
         </w:rPr>
-        <w:lastRenderedPageBreak/>
         <w:drawing>
           <wp:inline distT="0" distB="0" distL="0" distR="0" wp14:anchorId="04ADC335" wp14:editId="3777AD4C">
             <wp:extent cx="4381641" cy="2690397"/>
@@ -3029,7 +3645,7 @@
                     <pic:cNvPicPr/>
                   </pic:nvPicPr>
                   <pic:blipFill rotWithShape="1">
-                    <a:blip r:embed="rId16" cstate="print">
+                    <a:blip r:embed="rId18" cstate="print">
                       <a:extLst>
                         <a:ext uri="{28A0092B-C50C-407E-A947-70E740481C1C}">
                           <a14:useLocalDpi xmlns:a14="http://schemas.microsoft.com/office/drawing/2010/main" val="0"/>
@@ -3074,6 +3690,7 @@
         <w:rPr>
           <w:lang w:val="en-US"/>
         </w:rPr>
+        <w:lastRenderedPageBreak/>
         <w:t>Figure</w:t>
       </w:r>
       <w:r>
@@ -3390,7 +4007,7 @@
                     <pic:cNvPicPr/>
                   </pic:nvPicPr>
                   <pic:blipFill>
-                    <a:blip r:embed="rId17"/>
+                    <a:blip r:embed="rId19"/>
                     <a:stretch>
                       <a:fillRect/>
                     </a:stretch>
@@ -3441,7 +4058,7 @@
           <w:noProof/>
           <w:lang w:val="en-US"/>
         </w:rPr>
-        <w:t>5</w:t>
+        <w:t>7</w:t>
       </w:r>
       <w:r>
         <w:fldChar w:fldCharType="end"/>
@@ -3506,267 +4123,6 @@
                 <pic:pic xmlns:pic="http://schemas.openxmlformats.org/drawingml/2006/picture">
                   <pic:nvPicPr>
                     <pic:cNvPr id="202929633" name="Picture 202929633"/>
-                    <pic:cNvPicPr/>
-                  </pic:nvPicPr>
-                  <pic:blipFill>
-                    <a:blip r:embed="rId18"/>
-                    <a:stretch>
-                      <a:fillRect/>
-                    </a:stretch>
-                  </pic:blipFill>
-                  <pic:spPr>
-                    <a:xfrm>
-                      <a:off x="0" y="0"/>
-                      <a:ext cx="6189345" cy="1899285"/>
-                    </a:xfrm>
-                    <a:prstGeom prst="rect">
-                      <a:avLst/>
-                    </a:prstGeom>
-                  </pic:spPr>
-                </pic:pic>
-              </a:graphicData>
-            </a:graphic>
-          </wp:inline>
-        </w:drawing>
-      </w:r>
-    </w:p>
-    <w:p>
-      <w:pPr>
-        <w:pStyle w:val="Caption"/>
-        <w:rPr>
-          <w:lang w:val="en-US"/>
-        </w:rPr>
-      </w:pPr>
-      <w:r>
-        <w:rPr>
-          <w:lang w:val="en-US"/>
-        </w:rPr>
-        <w:t xml:space="preserve">Figure </w:t>
-      </w:r>
-      <w:r>
-        <w:fldChar w:fldCharType="begin"/>
-      </w:r>
-      <w:r>
-        <w:rPr>
-          <w:lang w:val="en-US"/>
-        </w:rPr>
-        <w:instrText xml:space="preserve"> SEQ Figure \* ARABIC </w:instrText>
-      </w:r>
-      <w:r>
-        <w:fldChar w:fldCharType="separate"/>
-      </w:r>
-      <w:r>
-        <w:rPr>
-          <w:noProof/>
-          <w:lang w:val="en-US"/>
-        </w:rPr>
-        <w:t>6</w:t>
-      </w:r>
-      <w:r>
-        <w:fldChar w:fldCharType="end"/>
-      </w:r>
-      <w:r>
-        <w:rPr>
-          <w:lang w:val="en-US"/>
-        </w:rPr>
-        <w:t xml:space="preserve">. The measured frequency response of a </w:t>
-      </w:r>
-      <w:r>
-        <w:rPr>
-          <w:lang w:val="en-US"/>
-        </w:rPr>
-        <w:t>LM358</w:t>
-      </w:r>
-      <w:r>
-        <w:rPr>
-          <w:lang w:val="en-US"/>
-        </w:rPr>
-        <w:t xml:space="preserve"> </w:t>
-      </w:r>
-      <w:r>
-        <w:rPr>
-          <w:lang w:val="en-US"/>
-        </w:rPr>
-        <w:t>voltage follower</w:t>
-      </w:r>
-      <w:r>
-        <w:rPr>
-          <w:lang w:val="en-US"/>
-        </w:rPr>
-        <w:t xml:space="preserve"> </w:t>
-      </w:r>
-      <w:r>
-        <w:rPr>
-          <w:lang w:val="en-US"/>
-        </w:rPr>
-        <w:t>from 100Hz to 24.8</w:t>
-      </w:r>
-      <w:r>
-        <w:rPr>
-          <w:lang w:val="en-US"/>
-        </w:rPr>
-        <w:t>3MHz</w:t>
-      </w:r>
-      <w:r>
-        <w:rPr>
-          <w:lang w:val="en-US"/>
-        </w:rPr>
-        <w:t>.</w:t>
-      </w:r>
-    </w:p>
-    <w:p>
-      <w:pPr>
-        <w:rPr>
-          <w:lang w:val="en-US"/>
-        </w:rPr>
-      </w:pPr>
-    </w:p>
-    <w:p>
-      <w:pPr>
-        <w:keepNext/>
-      </w:pPr>
-      <w:r>
-        <w:rPr>
-          <w:noProof/>
-        </w:rPr>
-        <w:drawing>
-          <wp:inline distT="0" distB="0" distL="0" distR="0" wp14:anchorId="799A7238" wp14:editId="351CBD77">
-            <wp:extent cx="6189345" cy="1905635"/>
-            <wp:effectExtent l="0" t="0" r="0" b="0"/>
-            <wp:docPr id="201516813" name="Picture 7"/>
-            <wp:cNvGraphicFramePr>
-              <a:graphicFrameLocks xmlns:a="http://schemas.openxmlformats.org/drawingml/2006/main" noChangeAspect="1"/>
-            </wp:cNvGraphicFramePr>
-            <a:graphic xmlns:a="http://schemas.openxmlformats.org/drawingml/2006/main">
-              <a:graphicData uri="http://schemas.openxmlformats.org/drawingml/2006/picture">
-                <pic:pic xmlns:pic="http://schemas.openxmlformats.org/drawingml/2006/picture">
-                  <pic:nvPicPr>
-                    <pic:cNvPr id="201516813" name="Picture 201516813"/>
-                    <pic:cNvPicPr/>
-                  </pic:nvPicPr>
-                  <pic:blipFill>
-                    <a:blip r:embed="rId19"/>
-                    <a:stretch>
-                      <a:fillRect/>
-                    </a:stretch>
-                  </pic:blipFill>
-                  <pic:spPr>
-                    <a:xfrm>
-                      <a:off x="0" y="0"/>
-                      <a:ext cx="6189345" cy="1905635"/>
-                    </a:xfrm>
-                    <a:prstGeom prst="rect">
-                      <a:avLst/>
-                    </a:prstGeom>
-                  </pic:spPr>
-                </pic:pic>
-              </a:graphicData>
-            </a:graphic>
-          </wp:inline>
-        </w:drawing>
-      </w:r>
-    </w:p>
-    <w:p>
-      <w:pPr>
-        <w:pStyle w:val="Caption"/>
-        <w:rPr>
-          <w:lang w:val="en-US"/>
-        </w:rPr>
-      </w:pPr>
-      <w:r>
-        <w:rPr>
-          <w:lang w:val="en-US"/>
-        </w:rPr>
-        <w:t xml:space="preserve">Figure </w:t>
-      </w:r>
-      <w:r>
-        <w:fldChar w:fldCharType="begin"/>
-      </w:r>
-      <w:r>
-        <w:rPr>
-          <w:lang w:val="en-US"/>
-        </w:rPr>
-        <w:instrText xml:space="preserve"> SEQ Figure \* ARABIC </w:instrText>
-      </w:r>
-      <w:r>
-        <w:fldChar w:fldCharType="separate"/>
-      </w:r>
-      <w:r>
-        <w:rPr>
-          <w:noProof/>
-          <w:lang w:val="en-US"/>
-        </w:rPr>
-        <w:t>7</w:t>
-      </w:r>
-      <w:r>
-        <w:fldChar w:fldCharType="end"/>
-      </w:r>
-      <w:r>
-        <w:rPr>
-          <w:lang w:val="en-US"/>
-        </w:rPr>
-        <w:t xml:space="preserve">. The simulated frequency response of </w:t>
-      </w:r>
-      <w:r>
-        <w:rPr>
-          <w:lang w:val="en-US"/>
-        </w:rPr>
-        <w:t xml:space="preserve">a </w:t>
-      </w:r>
-      <w:r>
-        <w:rPr>
-          <w:lang w:val="en-US"/>
-        </w:rPr>
-        <w:t xml:space="preserve">LM358 inverting operational amplifier </w:t>
-      </w:r>
-      <w:r>
-        <w:rPr>
-          <w:lang w:val="en-US"/>
-        </w:rPr>
-        <w:t xml:space="preserve">with unity </w:t>
-      </w:r>
-      <w:r>
-        <w:rPr>
-          <w:lang w:val="en-US"/>
-        </w:rPr>
-        <w:t>gain</w:t>
-      </w:r>
-      <w:r>
-        <w:rPr>
-          <w:lang w:val="en-US"/>
-        </w:rPr>
-        <w:t xml:space="preserve"> from 10Hz to 10MHz.</w:t>
-      </w:r>
-    </w:p>
-    <w:p>
-      <w:pPr>
-        <w:rPr>
-          <w:lang w:val="en-US"/>
-        </w:rPr>
-      </w:pPr>
-    </w:p>
-    <w:p>
-      <w:pPr>
-        <w:keepNext/>
-      </w:pPr>
-      <w:r>
-        <w:rPr>
-          <w:noProof/>
-          <w:lang w:val="en-US"/>
-        </w:rPr>
-        <w:drawing>
-          <wp:inline distT="0" distB="0" distL="0" distR="0" wp14:anchorId="0D156E4B" wp14:editId="006CB1CA">
-            <wp:extent cx="6189345" cy="1899285"/>
-            <wp:effectExtent l="0" t="0" r="0" b="5715"/>
-            <wp:docPr id="1562323562" name="Picture 11"/>
-            <wp:cNvGraphicFramePr>
-              <a:graphicFrameLocks xmlns:a="http://schemas.openxmlformats.org/drawingml/2006/main" noChangeAspect="1"/>
-            </wp:cNvGraphicFramePr>
-            <a:graphic xmlns:a="http://schemas.openxmlformats.org/drawingml/2006/main">
-              <a:graphicData uri="http://schemas.openxmlformats.org/drawingml/2006/picture">
-                <pic:pic xmlns:pic="http://schemas.openxmlformats.org/drawingml/2006/picture">
-                  <pic:nvPicPr>
-                    <pic:cNvPr id="1562323562" name="Picture 1562323562"/>
                     <pic:cNvPicPr/>
                   </pic:nvPicPr>
                   <pic:blipFill>
@@ -3830,13 +4186,49 @@
         <w:rPr>
           <w:lang w:val="en-US"/>
         </w:rPr>
-        <w:t>. The measured frequency response of a LM358 inverting amplifier with unity gain from</w:t>
-      </w:r>
-      <w:r>
-        <w:rPr>
-          <w:lang w:val="en-US"/>
-        </w:rPr>
-        <w:t xml:space="preserve"> 100Hz to 24.83MHz.</w:t>
+        <w:t xml:space="preserve">. The measured frequency response of a </w:t>
+      </w:r>
+      <w:r>
+        <w:rPr>
+          <w:lang w:val="en-US"/>
+        </w:rPr>
+        <w:t>LM358</w:t>
+      </w:r>
+      <w:r>
+        <w:rPr>
+          <w:lang w:val="en-US"/>
+        </w:rPr>
+        <w:t xml:space="preserve"> </w:t>
+      </w:r>
+      <w:r>
+        <w:rPr>
+          <w:lang w:val="en-US"/>
+        </w:rPr>
+        <w:t>voltage follower</w:t>
+      </w:r>
+      <w:r>
+        <w:rPr>
+          <w:lang w:val="en-US"/>
+        </w:rPr>
+        <w:t xml:space="preserve"> </w:t>
+      </w:r>
+      <w:r>
+        <w:rPr>
+          <w:lang w:val="en-US"/>
+        </w:rPr>
+        <w:t>from 100Hz to 24.8</w:t>
+      </w:r>
+      <w:r>
+        <w:rPr>
+          <w:lang w:val="en-US"/>
+        </w:rPr>
+        <w:t>3MHz</w:t>
+      </w:r>
+      <w:r>
+        <w:rPr>
+          <w:lang w:val="en-US"/>
+        </w:rPr>
+        <w:t>.</w:t>
       </w:r>
     </w:p>
     <w:p>
@@ -3856,10 +4248,10 @@
         </w:rPr>
         <w:lastRenderedPageBreak/>
         <w:drawing>
-          <wp:inline distT="0" distB="0" distL="0" distR="0" wp14:anchorId="2A9D4018" wp14:editId="6DB0A598">
-            <wp:extent cx="6189345" cy="1899285"/>
-            <wp:effectExtent l="0" t="0" r="0" b="5715"/>
-            <wp:docPr id="406557912" name="Picture 8"/>
+          <wp:inline distT="0" distB="0" distL="0" distR="0" wp14:anchorId="799A7238" wp14:editId="351CBD77">
+            <wp:extent cx="6189345" cy="1905635"/>
+            <wp:effectExtent l="0" t="0" r="0" b="0"/>
+            <wp:docPr id="201516813" name="Picture 7"/>
             <wp:cNvGraphicFramePr>
               <a:graphicFrameLocks xmlns:a="http://schemas.openxmlformats.org/drawingml/2006/main" noChangeAspect="1"/>
             </wp:cNvGraphicFramePr>
@@ -3867,7 +4259,7 @@
               <a:graphicData uri="http://schemas.openxmlformats.org/drawingml/2006/picture">
                 <pic:pic xmlns:pic="http://schemas.openxmlformats.org/drawingml/2006/picture">
                   <pic:nvPicPr>
-                    <pic:cNvPr id="406557912" name="Picture 406557912"/>
+                    <pic:cNvPr id="201516813" name="Picture 201516813"/>
                     <pic:cNvPicPr/>
                   </pic:nvPicPr>
                   <pic:blipFill>
@@ -3879,7 +4271,7 @@
                   <pic:spPr>
                     <a:xfrm>
                       <a:off x="0" y="0"/>
-                      <a:ext cx="6189345" cy="1899285"/>
+                      <a:ext cx="6189345" cy="1905635"/>
                     </a:xfrm>
                     <a:prstGeom prst="rect">
                       <a:avLst/>
@@ -3943,38 +4335,25 @@
         <w:rPr>
           <w:lang w:val="en-US"/>
         </w:rPr>
-        <w:t xml:space="preserve">LM358 </w:t>
-      </w:r>
-      <w:r>
-        <w:rPr>
-          <w:lang w:val="en-US"/>
-        </w:rPr>
-        <w:t>non-</w:t>
-      </w:r>
-      <w:r>
-        <w:rPr>
-          <w:lang w:val="en-US"/>
-        </w:rPr>
-        <w:t xml:space="preserve">inverting amplifier with a gain </w:t>
-      </w:r>
-      <w:r>
-        <w:rPr>
-          <w:lang w:val="en-US"/>
-        </w:rPr>
-        <w:t>(A</w:t>
-      </w:r>
-      <w:r>
-        <w:rPr>
-          <w:vertAlign w:val="subscript"/>
-          <w:lang w:val="en-US"/>
-        </w:rPr>
-        <w:t>v</w:t>
-      </w:r>
-      <w:r>
-        <w:rPr>
-          <w:lang w:val="en-US"/>
-        </w:rPr>
-        <w:t>) = 100 (40dB) from 10Hz to 10MHz.</w:t>
+        <w:t xml:space="preserve">LM358 inverting operational amplifier </w:t>
+      </w:r>
+      <w:r>
+        <w:rPr>
+          <w:lang w:val="en-US"/>
+        </w:rPr>
+        <w:t xml:space="preserve">with unity </w:t>
+      </w:r>
+      <w:r>
+        <w:rPr>
+          <w:lang w:val="en-US"/>
+        </w:rPr>
+        <w:t>gain</w:t>
+      </w:r>
+      <w:r>
+        <w:rPr>
+          <w:lang w:val="en-US"/>
+        </w:rPr>
+        <w:t xml:space="preserve"> from 10Hz to 10MHz.</w:t>
       </w:r>
     </w:p>
     <w:p>
@@ -3994,10 +4373,10 @@
           <w:lang w:val="en-US"/>
         </w:rPr>
         <w:drawing>
-          <wp:inline distT="0" distB="0" distL="0" distR="0" wp14:anchorId="783AA0A3" wp14:editId="64CBB4E2">
+          <wp:inline distT="0" distB="0" distL="0" distR="0" wp14:anchorId="0D156E4B" wp14:editId="006CB1CA">
             <wp:extent cx="6189345" cy="1899285"/>
             <wp:effectExtent l="0" t="0" r="0" b="5715"/>
-            <wp:docPr id="1485130847" name="Picture 12"/>
+            <wp:docPr id="1562323562" name="Picture 11"/>
             <wp:cNvGraphicFramePr>
               <a:graphicFrameLocks xmlns:a="http://schemas.openxmlformats.org/drawingml/2006/main" noChangeAspect="1"/>
             </wp:cNvGraphicFramePr>
@@ -4005,7 +4384,7 @@
               <a:graphicData uri="http://schemas.openxmlformats.org/drawingml/2006/picture">
                 <pic:pic xmlns:pic="http://schemas.openxmlformats.org/drawingml/2006/picture">
                   <pic:nvPicPr>
-                    <pic:cNvPr id="1485130847" name="Picture 1485130847"/>
+                    <pic:cNvPr id="1562323562" name="Picture 1562323562"/>
                     <pic:cNvPicPr/>
                   </pic:nvPicPr>
                   <pic:blipFill>
@@ -4069,6 +4448,245 @@
         <w:rPr>
           <w:lang w:val="en-US"/>
         </w:rPr>
+        <w:t>. The measured frequency response of a LM358 inverting amplifier with unity gain from</w:t>
+      </w:r>
+      <w:r>
+        <w:rPr>
+          <w:lang w:val="en-US"/>
+        </w:rPr>
+        <w:t xml:space="preserve"> 100Hz to 24.83MHz.</w:t>
+      </w:r>
+    </w:p>
+    <w:p>
+      <w:pPr>
+        <w:rPr>
+          <w:lang w:val="en-US"/>
+        </w:rPr>
+      </w:pPr>
+    </w:p>
+    <w:p>
+      <w:pPr>
+        <w:keepNext/>
+      </w:pPr>
+      <w:r>
+        <w:rPr>
+          <w:noProof/>
+        </w:rPr>
+        <w:drawing>
+          <wp:inline distT="0" distB="0" distL="0" distR="0" wp14:anchorId="2A9D4018" wp14:editId="6DB0A598">
+            <wp:extent cx="6189345" cy="1899285"/>
+            <wp:effectExtent l="0" t="0" r="0" b="5715"/>
+            <wp:docPr id="406557912" name="Picture 8"/>
+            <wp:cNvGraphicFramePr>
+              <a:graphicFrameLocks xmlns:a="http://schemas.openxmlformats.org/drawingml/2006/main" noChangeAspect="1"/>
+            </wp:cNvGraphicFramePr>
+            <a:graphic xmlns:a="http://schemas.openxmlformats.org/drawingml/2006/main">
+              <a:graphicData uri="http://schemas.openxmlformats.org/drawingml/2006/picture">
+                <pic:pic xmlns:pic="http://schemas.openxmlformats.org/drawingml/2006/picture">
+                  <pic:nvPicPr>
+                    <pic:cNvPr id="406557912" name="Picture 406557912"/>
+                    <pic:cNvPicPr/>
+                  </pic:nvPicPr>
+                  <pic:blipFill>
+                    <a:blip r:embed="rId23"/>
+                    <a:stretch>
+                      <a:fillRect/>
+                    </a:stretch>
+                  </pic:blipFill>
+                  <pic:spPr>
+                    <a:xfrm>
+                      <a:off x="0" y="0"/>
+                      <a:ext cx="6189345" cy="1899285"/>
+                    </a:xfrm>
+                    <a:prstGeom prst="rect">
+                      <a:avLst/>
+                    </a:prstGeom>
+                  </pic:spPr>
+                </pic:pic>
+              </a:graphicData>
+            </a:graphic>
+          </wp:inline>
+        </w:drawing>
+      </w:r>
+    </w:p>
+    <w:p>
+      <w:pPr>
+        <w:pStyle w:val="Caption"/>
+        <w:rPr>
+          <w:lang w:val="en-US"/>
+        </w:rPr>
+      </w:pPr>
+      <w:r>
+        <w:rPr>
+          <w:lang w:val="en-US"/>
+        </w:rPr>
+        <w:t xml:space="preserve">Figure </w:t>
+      </w:r>
+      <w:r>
+        <w:fldChar w:fldCharType="begin"/>
+      </w:r>
+      <w:r>
+        <w:rPr>
+          <w:lang w:val="en-US"/>
+        </w:rPr>
+        <w:instrText xml:space="preserve"> SEQ Figure \* ARABIC </w:instrText>
+      </w:r>
+      <w:r>
+        <w:fldChar w:fldCharType="separate"/>
+      </w:r>
+      <w:r>
+        <w:rPr>
+          <w:noProof/>
+          <w:lang w:val="en-US"/>
+        </w:rPr>
+        <w:t>11</w:t>
+      </w:r>
+      <w:r>
+        <w:fldChar w:fldCharType="end"/>
+      </w:r>
+      <w:r>
+        <w:rPr>
+          <w:lang w:val="en-US"/>
+        </w:rPr>
+        <w:t xml:space="preserve">. The simulated frequency response of </w:t>
+      </w:r>
+      <w:r>
+        <w:rPr>
+          <w:lang w:val="en-US"/>
+        </w:rPr>
+        <w:t xml:space="preserve">a </w:t>
+      </w:r>
+      <w:r>
+        <w:rPr>
+          <w:lang w:val="en-US"/>
+        </w:rPr>
+        <w:t xml:space="preserve">LM358 </w:t>
+      </w:r>
+      <w:r>
+        <w:rPr>
+          <w:lang w:val="en-US"/>
+        </w:rPr>
+        <w:t>non-</w:t>
+      </w:r>
+      <w:r>
+        <w:rPr>
+          <w:lang w:val="en-US"/>
+        </w:rPr>
+        <w:t xml:space="preserve">inverting amplifier with a gain </w:t>
+      </w:r>
+      <w:r>
+        <w:rPr>
+          <w:lang w:val="en-US"/>
+        </w:rPr>
+        <w:t>(A</w:t>
+      </w:r>
+      <w:r>
+        <w:rPr>
+          <w:vertAlign w:val="subscript"/>
+          <w:lang w:val="en-US"/>
+        </w:rPr>
+        <w:t>v</w:t>
+      </w:r>
+      <w:r>
+        <w:rPr>
+          <w:lang w:val="en-US"/>
+        </w:rPr>
+        <w:t>) = 100 (40dB) from 10Hz to 10MHz.</w:t>
+      </w:r>
+    </w:p>
+    <w:p>
+      <w:pPr>
+        <w:rPr>
+          <w:lang w:val="en-US"/>
+        </w:rPr>
+      </w:pPr>
+    </w:p>
+    <w:p>
+      <w:pPr>
+        <w:keepNext/>
+      </w:pPr>
+      <w:r>
+        <w:rPr>
+          <w:noProof/>
+          <w:lang w:val="en-US"/>
+        </w:rPr>
+        <w:lastRenderedPageBreak/>
+        <w:drawing>
+          <wp:inline distT="0" distB="0" distL="0" distR="0" wp14:anchorId="783AA0A3" wp14:editId="64CBB4E2">
+            <wp:extent cx="6189345" cy="1899285"/>
+            <wp:effectExtent l="0" t="0" r="0" b="5715"/>
+            <wp:docPr id="1485130847" name="Picture 12"/>
+            <wp:cNvGraphicFramePr>
+              <a:graphicFrameLocks xmlns:a="http://schemas.openxmlformats.org/drawingml/2006/main" noChangeAspect="1"/>
+            </wp:cNvGraphicFramePr>
+            <a:graphic xmlns:a="http://schemas.openxmlformats.org/drawingml/2006/main">
+              <a:graphicData uri="http://schemas.openxmlformats.org/drawingml/2006/picture">
+                <pic:pic xmlns:pic="http://schemas.openxmlformats.org/drawingml/2006/picture">
+                  <pic:nvPicPr>
+                    <pic:cNvPr id="1485130847" name="Picture 1485130847"/>
+                    <pic:cNvPicPr/>
+                  </pic:nvPicPr>
+                  <pic:blipFill>
+                    <a:blip r:embed="rId24"/>
+                    <a:stretch>
+                      <a:fillRect/>
+                    </a:stretch>
+                  </pic:blipFill>
+                  <pic:spPr>
+                    <a:xfrm>
+                      <a:off x="0" y="0"/>
+                      <a:ext cx="6189345" cy="1899285"/>
+                    </a:xfrm>
+                    <a:prstGeom prst="rect">
+                      <a:avLst/>
+                    </a:prstGeom>
+                  </pic:spPr>
+                </pic:pic>
+              </a:graphicData>
+            </a:graphic>
+          </wp:inline>
+        </w:drawing>
+      </w:r>
+    </w:p>
+    <w:p>
+      <w:pPr>
+        <w:pStyle w:val="Caption"/>
+        <w:rPr>
+          <w:lang w:val="en-US"/>
+        </w:rPr>
+      </w:pPr>
+      <w:r>
+        <w:rPr>
+          <w:lang w:val="en-US"/>
+        </w:rPr>
+        <w:t xml:space="preserve">Figure </w:t>
+      </w:r>
+      <w:r>
+        <w:fldChar w:fldCharType="begin"/>
+      </w:r>
+      <w:r>
+        <w:rPr>
+          <w:lang w:val="en-US"/>
+        </w:rPr>
+        <w:instrText xml:space="preserve"> SEQ Figure \* ARABIC </w:instrText>
+      </w:r>
+      <w:r>
+        <w:fldChar w:fldCharType="separate"/>
+      </w:r>
+      <w:r>
+        <w:rPr>
+          <w:noProof/>
+          <w:lang w:val="en-US"/>
+        </w:rPr>
+        <w:t>12</w:t>
+      </w:r>
+      <w:r>
+        <w:fldChar w:fldCharType="end"/>
+      </w:r>
+      <w:r>
+        <w:rPr>
+          <w:lang w:val="en-US"/>
+        </w:rPr>
         <w:t xml:space="preserve">. The measured </w:t>
       </w:r>
       <w:proofErr w:type="spellStart"/>
@@ -4167,7 +4785,7 @@
                     <pic:cNvPicPr/>
                   </pic:nvPicPr>
                   <pic:blipFill>
-                    <a:blip r:embed="rId23"/>
+                    <a:blip r:embed="rId25"/>
                     <a:stretch>
                       <a:fillRect/>
                     </a:stretch>
@@ -4218,7 +4836,7 @@
           <w:noProof/>
           <w:lang w:val="en-US"/>
         </w:rPr>
-        <w:t>11</w:t>
+        <w:t>13</w:t>
       </w:r>
       <w:r>
         <w:fldChar w:fldCharType="end"/>
@@ -4289,7 +4907,6 @@
           <w:noProof/>
           <w:lang w:val="en-US"/>
         </w:rPr>
-        <w:lastRenderedPageBreak/>
         <w:drawing>
           <wp:inline distT="0" distB="0" distL="0" distR="0" wp14:anchorId="5EFACDC9" wp14:editId="3F4FF81F">
             <wp:extent cx="6189345" cy="1905635"/>
@@ -4306,7 +4923,7 @@
                     <pic:cNvPicPr/>
                   </pic:nvPicPr>
                   <pic:blipFill>
-                    <a:blip r:embed="rId24"/>
+                    <a:blip r:embed="rId26"/>
                     <a:stretch>
                       <a:fillRect/>
                     </a:stretch>
@@ -4357,7 +4974,7 @@
           <w:noProof/>
           <w:lang w:val="en-US"/>
         </w:rPr>
-        <w:t>12</w:t>
+        <w:t>14</w:t>
       </w:r>
       <w:r>
         <w:fldChar w:fldCharType="end"/>
@@ -4469,6 +5086,7 @@
         <w:rPr>
           <w:lang w:val="en-US"/>
         </w:rPr>
+        <w:lastRenderedPageBreak/>
         <w:t>The results section presents t</w:t>
       </w:r>
       <w:r>
@@ -6676,7 +7294,7 @@
                           </pic:cNvPicPr>
                         </pic:nvPicPr>
                         <pic:blipFill>
-                          <a:blip r:embed="rId25"/>
+                          <a:blip r:embed="rId27"/>
                           <a:stretch>
                             <a:fillRect/>
                           </a:stretch>
@@ -6705,7 +7323,7 @@
                           </pic:cNvPicPr>
                         </pic:nvPicPr>
                         <pic:blipFill>
-                          <a:blip r:embed="rId26"/>
+                          <a:blip r:embed="rId28"/>
                           <a:stretch>
                             <a:fillRect/>
                           </a:stretch>
@@ -6734,7 +7352,7 @@
                           </pic:cNvPicPr>
                         </pic:nvPicPr>
                         <pic:blipFill>
-                          <a:blip r:embed="rId27"/>
+                          <a:blip r:embed="rId29"/>
                           <a:stretch>
                             <a:fillRect/>
                           </a:stretch>
@@ -6763,7 +7381,7 @@
                           </pic:cNvPicPr>
                         </pic:nvPicPr>
                         <pic:blipFill>
-                          <a:blip r:embed="rId28"/>
+                          <a:blip r:embed="rId30"/>
                           <a:stretch>
                             <a:fillRect/>
                           </a:stretch>
@@ -6792,7 +7410,7 @@
                           </pic:cNvPicPr>
                         </pic:nvPicPr>
                         <pic:blipFill>
-                          <a:blip r:embed="rId29"/>
+                          <a:blip r:embed="rId31"/>
                           <a:stretch>
                             <a:fillRect/>
                           </a:stretch>
@@ -6842,19 +7460,19 @@
                   <o:lock v:ext="edit" aspectratio="t"/>
                 </v:shapetype>
                 <v:shape id="Picture 2" o:spid="_x0000_s1027" type="#_x0000_t75" style="position:absolute;width:22384;height:19252;visibility:visible;mso-wrap-style:square" o:gfxdata="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">
-                  <v:imagedata r:id="rId30" o:title=""/>
+                  <v:imagedata r:id="rId32" o:title=""/>
                 </v:shape>
                 <v:shape id="Picture 3" o:spid="_x0000_s1028" type="#_x0000_t75" style="position:absolute;left:23399;width:22385;height:19252;visibility:visible;mso-wrap-style:square" o:gfxdata="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">
-                  <v:imagedata r:id="rId31" o:title=""/>
+                  <v:imagedata r:id="rId33" o:title=""/>
                 </v:shape>
                 <v:shape id="Picture 4" o:spid="_x0000_s1029" type="#_x0000_t75" style="position:absolute;top:18071;width:22384;height:18417;visibility:visible;mso-wrap-style:square" o:gfxdata="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">
-                  <v:imagedata r:id="rId32" o:title=""/>
+                  <v:imagedata r:id="rId34" o:title=""/>
                 </v:shape>
                 <v:shape id="Picture 5" o:spid="_x0000_s1030" type="#_x0000_t75" style="position:absolute;left:22384;top:17653;width:23400;height:19253;visibility:visible;mso-wrap-style:square" o:gfxdata="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">
-                  <v:imagedata r:id="rId33" o:title=""/>
+                  <v:imagedata r:id="rId35" o:title=""/>
                 </v:shape>
                 <v:shape id="Picture 6" o:spid="_x0000_s1031" type="#_x0000_t75" style="position:absolute;left:11688;top:36756;width:22396;height:3494;visibility:visible;mso-wrap-style:square" o:gfxdata="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">
-                  <v:imagedata r:id="rId34" o:title=""/>
+                  <v:imagedata r:id="rId36" o:title=""/>
                 </v:shape>
                 <w10:wrap type="topAndBottom" anchory="page"/>
               </v:group>
@@ -7573,7 +8191,7 @@
         </w:rPr>
         <w:t xml:space="preserve"> Available </w:t>
       </w:r>
-      <w:hyperlink r:id="rId35" w:history="1">
+      <w:hyperlink r:id="rId37" w:history="1">
         <w:r>
           <w:rPr>
             <w:rStyle w:val="Hyperlink"/>
@@ -7586,6 +8204,7 @@
     <w:p>
       <w:pPr>
         <w:rPr>
+          <w:rStyle w:val="normaltextrun"/>
           <w:lang w:val="en-US"/>
         </w:rPr>
       </w:pPr>
@@ -7619,9 +8238,44 @@
           <w:lang w:val="en-US"/>
         </w:rPr>
       </w:pPr>
+      <w:r>
+        <w:rPr>
+          <w:lang w:val="en-US"/>
+        </w:rPr>
+        <w:t xml:space="preserve">Trump, B. (2017) </w:t>
+      </w:r>
+      <w:r>
+        <w:rPr>
+          <w:rStyle w:val="Emphasis"/>
+          <w:lang w:val="en-US"/>
+        </w:rPr>
+        <w:t>The Signal: a compendium of blog posts on op amp design topics</w:t>
+      </w:r>
+      <w:r>
+        <w:rPr>
+          <w:lang w:val="en-US"/>
+        </w:rPr>
+        <w:t xml:space="preserve">. Dallas, TX: Texas Instruments. Available at: </w:t>
+      </w:r>
+      <w:hyperlink r:id="rId38" w:history="1">
+        <w:r>
+          <w:rPr>
+            <w:rStyle w:val="Hyperlink"/>
+            <w:lang w:val="en-US"/>
+          </w:rPr>
+          <w:t>https://www.ti.com/lit/eb/slyt701/slyt701.pdf</w:t>
+        </w:r>
+      </w:hyperlink>
     </w:p>
     <w:p>
       <w:pPr>
+        <w:rPr>
+          <w:lang w:val="en-US"/>
+        </w:rPr>
+      </w:pPr>
+    </w:p>
+    <w:p>
+      <w:pPr>
         <w:suppressAutoHyphens/>
         <w:rPr>
           <w:lang w:val="en-US"/>
@@ -7675,7 +8329,7 @@
         </w:rPr>
         <w:t xml:space="preserve">. The references are sorted in alphabetical order. Instructions for referencing: </w:t>
       </w:r>
-      <w:hyperlink r:id="rId36" w:history="1">
+      <w:hyperlink r:id="rId39" w:history="1">
         <w:r>
           <w:rPr>
             <w:rStyle w:val="Hyperlink"/>
@@ -7897,7 +8551,7 @@
         </w:rPr>
         <w:br/>
       </w:r>
-      <w:hyperlink r:id="rId37" w:history="1">
+      <w:hyperlink r:id="rId40" w:history="1">
         <w:r>
           <w:rPr>
             <w:rStyle w:val="Hyperlink"/>
@@ -8144,7 +8798,7 @@
         </w:rPr>
         <w:t xml:space="preserve"> </w:t>
       </w:r>
-      <w:hyperlink r:id="rId38" w:history="1">
+      <w:hyperlink r:id="rId41" w:history="1">
         <w:r>
           <w:rPr>
             <w:rStyle w:val="Hyperlink"/>
@@ -8380,10 +9034,10 @@
       </w:pPr>
     </w:p>
     <w:sectPr>
-      <w:headerReference w:type="default" r:id="rId39"/>
-      <w:footerReference w:type="default" r:id="rId40"/>
-      <w:headerReference w:type="first" r:id="rId41"/>
-      <w:footerReference w:type="first" r:id="rId42"/>
+      <w:headerReference w:type="default" r:id="rId42"/>
+      <w:footerReference w:type="default" r:id="rId43"/>
+      <w:headerReference w:type="first" r:id="rId44"/>
+      <w:footerReference w:type="first" r:id="rId45"/>
       <w:type w:val="continuous"/>
       <w:pgSz w:w="11907" w:h="16840" w:code="9"/>
       <w:pgMar w:top="1440" w:right="1080" w:bottom="1440" w:left="1080" w:header="708" w:footer="708" w:gutter="0"/>
@@ -13005,6 +13659,17 @@
     <w:name w:val="normaltextrun"/>
     <w:basedOn w:val="DefaultParagraphFont"/>
     <w:rsid w:val="00507DCF"/>
+  </w:style>
+  <w:style w:type="character" w:styleId="Emphasis">
+    <w:name w:val="Emphasis"/>
+    <w:basedOn w:val="DefaultParagraphFont"/>
+    <w:uiPriority w:val="20"/>
+    <w:qFormat/>
+    <w:rsid w:val="00CA2353"/>
+    <w:rPr>
+      <w:i/>
+      <w:iCs/>
+    </w:rPr>
   </w:style>
 </w:styles>
 </file>

</xml_diff>

<commit_message>
Starting filter design method
</commit_message>
<xml_diff>
--- a/report_lab3.docx
+++ b/report_lab3.docx
@@ -98,117 +98,23 @@
     </w:p>
     <w:p>
       <w:pPr>
-        <w:rPr>
-          <w:lang w:val="en-US"/>
-        </w:rPr>
-      </w:pPr>
-      <w:r>
-        <w:rPr>
-          <w:lang w:val="en-US"/>
-        </w:rPr>
-        <w:t xml:space="preserve">The operational amplifiers </w:t>
-      </w:r>
-      <w:r>
-        <w:rPr>
-          <w:lang w:val="en-US"/>
-        </w:rPr>
-        <w:t xml:space="preserve">are </w:t>
-      </w:r>
-      <w:r>
-        <w:rPr>
-          <w:lang w:val="en-US"/>
-        </w:rPr>
-        <w:t>extremely</w:t>
-      </w:r>
-      <w:r>
-        <w:rPr>
-          <w:lang w:val="en-US"/>
-        </w:rPr>
-        <w:t xml:space="preserve"> </w:t>
-      </w:r>
-      <w:r>
-        <w:rPr>
-          <w:lang w:val="en-US"/>
-        </w:rPr>
-        <w:t xml:space="preserve">efficient and versatile devices. Their applications span the broad </w:t>
-      </w:r>
-      <w:r>
-        <w:rPr>
-          <w:lang w:val="en-US"/>
-        </w:rPr>
-        <w:t xml:space="preserve">electronic industry filling requirements for signal conditioning, special transfer functions, analog instrumentation, analog </w:t>
-      </w:r>
-      <w:r>
-        <w:rPr>
-          <w:lang w:val="en-US"/>
-        </w:rPr>
-        <w:t>computation, and special system design</w:t>
-      </w:r>
-      <w:r>
-        <w:rPr>
-          <w:lang w:val="en-US"/>
-        </w:rPr>
-        <w:t xml:space="preserve"> (Carter </w:t>
-      </w:r>
-      <w:r>
-        <w:rPr>
-          <w:lang w:val="en-US"/>
-        </w:rPr>
-        <w:t>and Brown, 2001</w:t>
-      </w:r>
-      <w:r>
-        <w:rPr>
-          <w:lang w:val="en-US"/>
-        </w:rPr>
-        <w:t>, p.</w:t>
-      </w:r>
-      <w:r>
-        <w:rPr>
-          <w:lang w:val="en-US"/>
-        </w:rPr>
-        <w:t>7)</w:t>
-      </w:r>
-      <w:r>
-        <w:rPr>
-          <w:lang w:val="en-US"/>
-        </w:rPr>
-        <w:t>.</w:t>
-      </w:r>
-      <w:r>
-        <w:rPr>
-          <w:lang w:val="en-US"/>
-        </w:rPr>
-        <w:t xml:space="preserve"> In this exercise we </w:t>
-      </w:r>
-      <w:r>
-        <w:rPr>
-          <w:lang w:val="en-US"/>
-        </w:rPr>
-        <w:t xml:space="preserve">study the </w:t>
-      </w:r>
-      <w:r>
-        <w:rPr>
-          <w:lang w:val="en-US"/>
-        </w:rPr>
-        <w:t>amplifier behavior by examining the performance limitations of a basic operational amplifier, the</w:t>
-      </w:r>
-      <w:r>
-        <w:rPr>
-          <w:lang w:val="en-US"/>
-        </w:rPr>
-        <w:t xml:space="preserve"> LM</w:t>
-      </w:r>
-      <w:r>
-        <w:rPr>
-          <w:lang w:val="en-US"/>
-        </w:rPr>
-        <w:t>358</w:t>
-      </w:r>
-      <w:r>
-        <w:rPr>
-          <w:lang w:val="en-US"/>
-        </w:rPr>
-        <w:t xml:space="preserve"> (KA358).</w:t>
+        <w:pStyle w:val="paragraph"/>
+        <w:spacing w:before="0" w:beforeAutospacing="0" w:after="120" w:afterAutospacing="0"/>
+        <w:jc w:val="both"/>
+        <w:textAlignment w:val="baseline"/>
+      </w:pPr>
+      <w:r>
+        <w:rPr>
+          <w:rStyle w:val="normaltextrun"/>
+          <w:lang w:val="en-US"/>
+        </w:rPr>
+        <w:t>The operational amplifiers are extremely efficient and versatile devices. Their applications span the broad electronic industry filling requirements for signal conditioning, special transfer functions, analog instrumentation, analog computation, and special system design (Carter and Brown, 2001, p.7). Sometimes, they are used for simple uses, such as a simple comparator, even if this might not always be advisable. In this exercise we study the amplifier behavior by examining the performance limitations of a basic operational amplifier, the LM358 (specifically its KA358 variant). Throughout this report we will be comparing measured and simulated performance to each other when both were done; if a performance measure was done only in simulation or only in measurement, then we note this accordingly. We analyze bandwidth, slew rate, output voltage limits, bias current and amplifier input impedance, offset voltage, and crossover distortion. We also attempted to measure the op-amp’s noise. </w:t>
+      </w:r>
+      <w:r>
+        <w:rPr>
+          <w:rStyle w:val="eop"/>
+        </w:rPr>
+        <w:t> </w:t>
       </w:r>
     </w:p>
     <w:p>
@@ -622,7 +528,14 @@
         <w:rPr>
           <w:lang w:val="en-US"/>
         </w:rPr>
-        <w:t xml:space="preserve">ntroduced to the field of the study from a little wider perspective than the study in the report is about, however by supporting the study of the report. This way the reader is introduced to the subject of the report smoothly. </w:t>
+        <w:t xml:space="preserve">ntroduced to the field of the study from a little wider perspective than the study in the report is about, however by supporting the study of the report. This </w:t>
+      </w:r>
+      <w:r>
+        <w:rPr>
+          <w:lang w:val="en-US"/>
+        </w:rPr>
+        <w:lastRenderedPageBreak/>
+        <w:t xml:space="preserve">way the reader is introduced to the subject of the report smoothly. </w:t>
       </w:r>
       <w:r>
         <w:rPr>
@@ -677,7 +590,6 @@
         <w:rPr>
           <w:lang w:val="en-US"/>
         </w:rPr>
-        <w:lastRenderedPageBreak/>
         <w:t>The language of a scientific report is clear, precise, and compac</w:t>
       </w:r>
       <w:r>
@@ -1473,17 +1385,19 @@
     </w:p>
     <w:p>
       <w:pPr>
-        <w:keepNext/>
+        <w:rPr>
+          <w:lang w:val="en-US"/>
+        </w:rPr>
       </w:pPr>
       <w:r>
         <w:rPr>
           <w:lang w:val="en-US"/>
         </w:rPr>
         <w:drawing>
-          <wp:inline distT="0" distB="0" distL="0" distR="0" wp14:anchorId="237579A7" wp14:editId="7D369A59">
-            <wp:extent cx="6189345" cy="2491105"/>
+          <wp:inline distT="0" distB="0" distL="0" distR="0" wp14:anchorId="2F95E02A" wp14:editId="60657D42">
+            <wp:extent cx="6189345" cy="2592070"/>
             <wp:effectExtent l="0" t="0" r="0" b="0"/>
-            <wp:docPr id="1797676351" name="Picture 1"/>
+            <wp:docPr id="875232455" name="Picture 1"/>
             <wp:cNvGraphicFramePr>
               <a:graphicFrameLocks xmlns:a="http://schemas.openxmlformats.org/drawingml/2006/main" noChangeAspect="1"/>
             </wp:cNvGraphicFramePr>
@@ -1491,7 +1405,7 @@
               <a:graphicData uri="http://schemas.openxmlformats.org/drawingml/2006/picture">
                 <pic:pic xmlns:pic="http://schemas.openxmlformats.org/drawingml/2006/picture">
                   <pic:nvPicPr>
-                    <pic:cNvPr id="1797676351" name=""/>
+                    <pic:cNvPr id="875232455" name=""/>
                     <pic:cNvPicPr/>
                   </pic:nvPicPr>
                   <pic:blipFill>
@@ -1503,7 +1417,7 @@
                   <pic:spPr>
                     <a:xfrm>
                       <a:off x="0" y="0"/>
-                      <a:ext cx="6189345" cy="2491105"/>
+                      <a:ext cx="6189345" cy="2592070"/>
                     </a:xfrm>
                     <a:prstGeom prst="rect">
                       <a:avLst/>
@@ -1863,6 +1777,70 @@
         <w:spacing w:before="100" w:beforeAutospacing="1" w:after="100" w:afterAutospacing="1" w:line="240" w:lineRule="auto"/>
         <w:jc w:val="left"/>
         <w:rPr>
+          <w:lang w:val="en-US"/>
+        </w:rPr>
+      </w:pPr>
+      <w:r>
+        <w:rPr>
+          <w:szCs w:val="24"/>
+          <w:lang w:val="en-FI" w:eastAsia="en-GB"/>
+        </w:rPr>
+        <w:t>The slew rate of an op-amp is the maximum rate at which its output voltage can change in response to a step input voltage. It depends on the high-frequency response of the amplifier stages inside the op-amp.</w:t>
+      </w:r>
+      <w:r>
+        <w:rPr>
+          <w:szCs w:val="24"/>
+          <w:lang w:val="en-FI" w:eastAsia="en-GB"/>
+        </w:rPr>
+        <w:t xml:space="preserve"> T</w:t>
+      </w:r>
+      <w:r>
+        <w:rPr>
+          <w:szCs w:val="24"/>
+          <w:lang w:val="en-FI" w:eastAsia="en-GB"/>
+        </w:rPr>
+        <w:t>he high-frequency components of a voltage step are contained in its rising edge, and the upper critical frequency of an amplifier limits how well it can respond to a step input</w:t>
+      </w:r>
+      <w:r>
+        <w:rPr>
+          <w:szCs w:val="24"/>
+          <w:lang w:val="en-FI" w:eastAsia="en-GB"/>
+        </w:rPr>
+        <w:t xml:space="preserve"> (Floyd, 2005, p</w:t>
+      </w:r>
+      <w:r>
+        <w:rPr>
+          <w:szCs w:val="24"/>
+          <w:lang w:val="en-FI" w:eastAsia="en-GB"/>
+        </w:rPr>
+        <w:t>.</w:t>
+      </w:r>
+      <w:r>
+        <w:rPr>
+          <w:szCs w:val="24"/>
+          <w:lang w:val="en-FI" w:eastAsia="en-GB"/>
+        </w:rPr>
+        <w:t>609).</w:t>
+      </w:r>
+      <w:r>
+        <w:rPr>
+          <w:szCs w:val="24"/>
+          <w:lang w:val="en-FI" w:eastAsia="en-GB"/>
+        </w:rPr>
+        <w:t xml:space="preserve"> </w:t>
+      </w:r>
+      <w:r>
+        <w:rPr>
+          <w:lang w:val="en-US"/>
+        </w:rPr>
+        <w:t>The slew rate was measured with the op-amp connected as a unity-gain voltage follower, as shown in Figure 4.</w:t>
+      </w:r>
+    </w:p>
+    <w:p>
+      <w:pPr>
+        <w:spacing w:before="100" w:beforeAutospacing="1" w:after="100" w:afterAutospacing="1" w:line="240" w:lineRule="auto"/>
+        <w:jc w:val="center"/>
+        <w:rPr>
           <w:szCs w:val="24"/>
           <w:lang w:val="en-US" w:eastAsia="en-GB"/>
         </w:rPr>
@@ -1870,75 +1848,13 @@
       <w:r>
         <w:rPr>
           <w:szCs w:val="24"/>
-          <w:lang w:val="en-FI" w:eastAsia="en-GB"/>
-        </w:rPr>
-        <w:t>The slew rate of an op-amp is the maximum rate at which its output voltage can change in response to a step input voltage. It depends on the high-frequency response of the amplifier stages inside the op-amp.</w:t>
-      </w:r>
-      <w:r>
-        <w:rPr>
-          <w:szCs w:val="24"/>
-          <w:lang w:val="en-FI" w:eastAsia="en-GB"/>
-        </w:rPr>
-        <w:t xml:space="preserve"> T</w:t>
-      </w:r>
-      <w:r>
-        <w:rPr>
-          <w:szCs w:val="24"/>
-          <w:lang w:val="en-FI" w:eastAsia="en-GB"/>
-        </w:rPr>
-        <w:t>he high-frequency components of a voltage step are contained in its rising edge, and the upper critical frequency of an amplifier limits how well it can respond to a step input</w:t>
-      </w:r>
-      <w:r>
-        <w:rPr>
-          <w:szCs w:val="24"/>
-          <w:lang w:val="en-FI" w:eastAsia="en-GB"/>
-        </w:rPr>
-        <w:t xml:space="preserve"> (Floyd, 2005, p</w:t>
-      </w:r>
-      <w:r>
-        <w:rPr>
-          <w:szCs w:val="24"/>
-          <w:lang w:val="en-FI" w:eastAsia="en-GB"/>
-        </w:rPr>
-        <w:t>.</w:t>
-      </w:r>
-      <w:r>
-        <w:rPr>
-          <w:szCs w:val="24"/>
-          <w:lang w:val="en-FI" w:eastAsia="en-GB"/>
-        </w:rPr>
-        <w:t>609).</w:t>
-      </w:r>
-      <w:r>
-        <w:rPr>
-          <w:szCs w:val="24"/>
-          <w:lang w:val="en-FI" w:eastAsia="en-GB"/>
-        </w:rPr>
-        <w:t xml:space="preserve"> </w:t>
-      </w:r>
-      <w:r>
-        <w:rPr>
-          <w:lang w:val="en-US"/>
-        </w:rPr>
-        <w:t>The slew rate was measured with the op-amp connected as a unity-gain voltage follower, as shown in Figure 4.</w:t>
-      </w:r>
-    </w:p>
-    <w:p>
-      <w:pPr>
-        <w:keepNext/>
-        <w:spacing w:before="100" w:beforeAutospacing="1" w:after="100" w:afterAutospacing="1" w:line="240" w:lineRule="auto"/>
-        <w:jc w:val="center"/>
-      </w:pPr>
-      <w:r>
-        <w:rPr>
-          <w:szCs w:val="24"/>
           <w:lang w:val="en-US" w:eastAsia="en-GB"/>
         </w:rPr>
         <w:drawing>
-          <wp:inline distT="0" distB="0" distL="0" distR="0" wp14:anchorId="457AE85B" wp14:editId="6D446D41">
-            <wp:extent cx="5069795" cy="2383277"/>
-            <wp:effectExtent l="0" t="0" r="0" b="4445"/>
-            <wp:docPr id="2103784444" name="Picture 1"/>
+          <wp:inline distT="0" distB="0" distL="0" distR="0" wp14:anchorId="17BE110D" wp14:editId="54AB8003">
+            <wp:extent cx="5367867" cy="2637398"/>
+            <wp:effectExtent l="0" t="0" r="4445" b="4445"/>
+            <wp:docPr id="314455512" name="Picture 1"/>
             <wp:cNvGraphicFramePr>
               <a:graphicFrameLocks xmlns:a="http://schemas.openxmlformats.org/drawingml/2006/main" noChangeAspect="1"/>
             </wp:cNvGraphicFramePr>
@@ -1946,7 +1862,7 @@
               <a:graphicData uri="http://schemas.openxmlformats.org/drawingml/2006/picture">
                 <pic:pic xmlns:pic="http://schemas.openxmlformats.org/drawingml/2006/picture">
                   <pic:nvPicPr>
-                    <pic:cNvPr id="2103784444" name=""/>
+                    <pic:cNvPr id="314455512" name=""/>
                     <pic:cNvPicPr/>
                   </pic:nvPicPr>
                   <pic:blipFill>
@@ -1958,7 +1874,7 @@
                   <pic:spPr>
                     <a:xfrm>
                       <a:off x="0" y="0"/>
-                      <a:ext cx="5094537" cy="2394908"/>
+                      <a:ext cx="5388336" cy="2647455"/>
                     </a:xfrm>
                     <a:prstGeom prst="rect">
                       <a:avLst/>
@@ -2649,19 +2565,20 @@
     </w:p>
     <w:p>
       <w:pPr>
-        <w:keepNext/>
         <w:jc w:val="center"/>
-      </w:pPr>
-      <w:r>
-        <w:rPr>
-          <w:vertAlign w:val="subscript"/>
+        <w:rPr>
+          <w:lang w:val="en-US"/>
+        </w:rPr>
+      </w:pPr>
+      <w:r>
+        <w:rPr>
           <w:lang w:val="en-US"/>
         </w:rPr>
         <w:drawing>
-          <wp:inline distT="0" distB="0" distL="0" distR="0" wp14:anchorId="1BE83E39" wp14:editId="0F374465">
-            <wp:extent cx="4623827" cy="2156078"/>
-            <wp:effectExtent l="0" t="0" r="0" b="3175"/>
-            <wp:docPr id="1199161760" name="Picture 1"/>
+          <wp:inline distT="0" distB="0" distL="0" distR="0" wp14:anchorId="6864352B" wp14:editId="5E5113DB">
+            <wp:extent cx="5147733" cy="2351786"/>
+            <wp:effectExtent l="0" t="0" r="0" b="0"/>
+            <wp:docPr id="645695927" name="Picture 1"/>
             <wp:cNvGraphicFramePr>
               <a:graphicFrameLocks xmlns:a="http://schemas.openxmlformats.org/drawingml/2006/main" noChangeAspect="1"/>
             </wp:cNvGraphicFramePr>
@@ -2669,7 +2586,7 @@
               <a:graphicData uri="http://schemas.openxmlformats.org/drawingml/2006/picture">
                 <pic:pic xmlns:pic="http://schemas.openxmlformats.org/drawingml/2006/picture">
                   <pic:nvPicPr>
-                    <pic:cNvPr id="1199161760" name=""/>
+                    <pic:cNvPr id="645695927" name=""/>
                     <pic:cNvPicPr/>
                   </pic:nvPicPr>
                   <pic:blipFill>
@@ -2681,7 +2598,7 @@
                   <pic:spPr>
                     <a:xfrm>
                       <a:off x="0" y="0"/>
-                      <a:ext cx="4696373" cy="2189906"/>
+                      <a:ext cx="5199920" cy="2375628"/>
                     </a:xfrm>
                     <a:prstGeom prst="rect">
                       <a:avLst/>
@@ -2793,6 +2710,68 @@
           <w:lang w:val="en-US"/>
         </w:rPr>
         <w:t>is swept through a set of values.</w:t>
+      </w:r>
+    </w:p>
+    <w:p>
+      <w:pPr>
+        <w:pStyle w:val="Heading2"/>
+        <w:rPr>
+          <w:lang w:val="en-US"/>
+        </w:rPr>
+      </w:pPr>
+      <w:r>
+        <w:rPr>
+          <w:lang w:val="en-US"/>
+        </w:rPr>
+        <w:lastRenderedPageBreak/>
+        <w:t>Filter design</w:t>
+      </w:r>
+    </w:p>
+    <w:p>
+      <w:pPr>
+        <w:rPr>
+          <w:lang w:val="en-US"/>
+        </w:rPr>
+      </w:pPr>
+      <w:r>
+        <w:rPr>
+          <w:lang w:val="en-US"/>
+        </w:rPr>
+        <w:drawing>
+          <wp:inline distT="0" distB="0" distL="0" distR="0" wp14:anchorId="661C2F90" wp14:editId="63A58277">
+            <wp:extent cx="6189345" cy="3340100"/>
+            <wp:effectExtent l="0" t="0" r="0" b="0"/>
+            <wp:docPr id="372971274" name="Picture 1"/>
+            <wp:cNvGraphicFramePr>
+              <a:graphicFrameLocks xmlns:a="http://schemas.openxmlformats.org/drawingml/2006/main" noChangeAspect="1"/>
+            </wp:cNvGraphicFramePr>
+            <a:graphic xmlns:a="http://schemas.openxmlformats.org/drawingml/2006/main">
+              <a:graphicData uri="http://schemas.openxmlformats.org/drawingml/2006/picture">
+                <pic:pic xmlns:pic="http://schemas.openxmlformats.org/drawingml/2006/picture">
+                  <pic:nvPicPr>
+                    <pic:cNvPr id="372971274" name=""/>
+                    <pic:cNvPicPr/>
+                  </pic:nvPicPr>
+                  <pic:blipFill>
+                    <a:blip r:embed="rId17"/>
+                    <a:stretch>
+                      <a:fillRect/>
+                    </a:stretch>
+                  </pic:blipFill>
+                  <pic:spPr>
+                    <a:xfrm>
+                      <a:off x="0" y="0"/>
+                      <a:ext cx="6189345" cy="3340100"/>
+                    </a:xfrm>
+                    <a:prstGeom prst="rect">
+                      <a:avLst/>
+                    </a:prstGeom>
+                  </pic:spPr>
+                </pic:pic>
+              </a:graphicData>
+            </a:graphic>
+          </wp:inline>
+        </w:drawing>
       </w:r>
     </w:p>
     <w:p>
@@ -2947,7 +2926,7 @@
                     <pic:cNvPicPr/>
                   </pic:nvPicPr>
                   <pic:blipFill>
-                    <a:blip r:embed="rId17" cstate="print">
+                    <a:blip r:embed="rId18" cstate="print">
                       <a:extLst>
                         <a:ext uri="{28A0092B-C50C-407E-A947-70E740481C1C}">
                           <a14:useLocalDpi xmlns:a14="http://schemas.microsoft.com/office/drawing/2010/main" val="0"/>
@@ -3258,6 +3237,7 @@
                   <w:caps/>
                   <w:sz w:val="22"/>
                 </w:rPr>
+                <w:lastRenderedPageBreak/>
                 <m:t>i</m:t>
               </m:r>
               <m:d>
@@ -3645,7 +3625,7 @@
                     <pic:cNvPicPr/>
                   </pic:nvPicPr>
                   <pic:blipFill rotWithShape="1">
-                    <a:blip r:embed="rId18" cstate="print">
+                    <a:blip r:embed="rId19" cstate="print">
                       <a:extLst>
                         <a:ext uri="{28A0092B-C50C-407E-A947-70E740481C1C}">
                           <a14:useLocalDpi xmlns:a14="http://schemas.microsoft.com/office/drawing/2010/main" val="0"/>
@@ -3690,7 +3670,6 @@
         <w:rPr>
           <w:lang w:val="en-US"/>
         </w:rPr>
-        <w:lastRenderedPageBreak/>
         <w:t>Figure</w:t>
       </w:r>
       <w:r>
@@ -3991,6 +3970,7 @@
         <w:rPr>
           <w:noProof/>
         </w:rPr>
+        <w:lastRenderedPageBreak/>
         <w:drawing>
           <wp:inline distT="0" distB="0" distL="0" distR="0" wp14:anchorId="453A8EE3" wp14:editId="72887FC4">
             <wp:extent cx="6189345" cy="1899285"/>
@@ -4004,125 +3984,6 @@
                 <pic:pic xmlns:pic="http://schemas.openxmlformats.org/drawingml/2006/picture">
                   <pic:nvPicPr>
                     <pic:cNvPr id="558697205" name="Picture 558697205"/>
-                    <pic:cNvPicPr/>
-                  </pic:nvPicPr>
-                  <pic:blipFill>
-                    <a:blip r:embed="rId19"/>
-                    <a:stretch>
-                      <a:fillRect/>
-                    </a:stretch>
-                  </pic:blipFill>
-                  <pic:spPr>
-                    <a:xfrm>
-                      <a:off x="0" y="0"/>
-                      <a:ext cx="6189345" cy="1899285"/>
-                    </a:xfrm>
-                    <a:prstGeom prst="rect">
-                      <a:avLst/>
-                    </a:prstGeom>
-                  </pic:spPr>
-                </pic:pic>
-              </a:graphicData>
-            </a:graphic>
-          </wp:inline>
-        </w:drawing>
-      </w:r>
-    </w:p>
-    <w:p>
-      <w:pPr>
-        <w:pStyle w:val="Caption"/>
-        <w:rPr>
-          <w:lang w:val="en-US"/>
-        </w:rPr>
-      </w:pPr>
-      <w:r>
-        <w:rPr>
-          <w:lang w:val="en-US"/>
-        </w:rPr>
-        <w:t xml:space="preserve">Figure </w:t>
-      </w:r>
-      <w:r>
-        <w:fldChar w:fldCharType="begin"/>
-      </w:r>
-      <w:r>
-        <w:rPr>
-          <w:lang w:val="en-US"/>
-        </w:rPr>
-        <w:instrText xml:space="preserve"> SEQ Figure \* ARABIC </w:instrText>
-      </w:r>
-      <w:r>
-        <w:fldChar w:fldCharType="separate"/>
-      </w:r>
-      <w:r>
-        <w:rPr>
-          <w:noProof/>
-          <w:lang w:val="en-US"/>
-        </w:rPr>
-        <w:t>7</w:t>
-      </w:r>
-      <w:r>
-        <w:fldChar w:fldCharType="end"/>
-      </w:r>
-      <w:r>
-        <w:rPr>
-          <w:lang w:val="en-US"/>
-        </w:rPr>
-        <w:t>. The simulated frequency response of</w:t>
-      </w:r>
-      <w:r>
-        <w:rPr>
-          <w:lang w:val="en-US"/>
-        </w:rPr>
-        <w:t xml:space="preserve"> a</w:t>
-      </w:r>
-      <w:r>
-        <w:rPr>
-          <w:lang w:val="en-US"/>
-        </w:rPr>
-        <w:t xml:space="preserve"> LM358</w:t>
-      </w:r>
-      <w:r>
-        <w:rPr>
-          <w:lang w:val="en-US"/>
-        </w:rPr>
-        <w:t xml:space="preserve"> voltage follower</w:t>
-      </w:r>
-      <w:r>
-        <w:rPr>
-          <w:lang w:val="en-US"/>
-        </w:rPr>
-        <w:t xml:space="preserve"> from 10Hz to 10MHz.</w:t>
-      </w:r>
-    </w:p>
-    <w:p>
-      <w:pPr>
-        <w:rPr>
-          <w:lang w:val="en-US"/>
-        </w:rPr>
-      </w:pPr>
-    </w:p>
-    <w:p>
-      <w:pPr>
-        <w:keepNext/>
-      </w:pPr>
-      <w:r>
-        <w:rPr>
-          <w:noProof/>
-          <w:lang w:val="en-US"/>
-        </w:rPr>
-        <w:drawing>
-          <wp:inline distT="0" distB="0" distL="0" distR="0" wp14:anchorId="07708657" wp14:editId="24868DF6">
-            <wp:extent cx="6189345" cy="1899285"/>
-            <wp:effectExtent l="0" t="0" r="0" b="5715"/>
-            <wp:docPr id="202929633" name="Picture 10"/>
-            <wp:cNvGraphicFramePr>
-              <a:graphicFrameLocks xmlns:a="http://schemas.openxmlformats.org/drawingml/2006/main" noChangeAspect="1"/>
-            </wp:cNvGraphicFramePr>
-            <a:graphic xmlns:a="http://schemas.openxmlformats.org/drawingml/2006/main">
-              <a:graphicData uri="http://schemas.openxmlformats.org/drawingml/2006/picture">
-                <pic:pic xmlns:pic="http://schemas.openxmlformats.org/drawingml/2006/picture">
-                  <pic:nvPicPr>
-                    <pic:cNvPr id="202929633" name="Picture 202929633"/>
                     <pic:cNvPicPr/>
                   </pic:nvPicPr>
                   <pic:blipFill>
@@ -4177,6 +4038,125 @@
           <w:noProof/>
           <w:lang w:val="en-US"/>
         </w:rPr>
+        <w:t>7</w:t>
+      </w:r>
+      <w:r>
+        <w:fldChar w:fldCharType="end"/>
+      </w:r>
+      <w:r>
+        <w:rPr>
+          <w:lang w:val="en-US"/>
+        </w:rPr>
+        <w:t>. The simulated frequency response of</w:t>
+      </w:r>
+      <w:r>
+        <w:rPr>
+          <w:lang w:val="en-US"/>
+        </w:rPr>
+        <w:t xml:space="preserve"> a</w:t>
+      </w:r>
+      <w:r>
+        <w:rPr>
+          <w:lang w:val="en-US"/>
+        </w:rPr>
+        <w:t xml:space="preserve"> LM358</w:t>
+      </w:r>
+      <w:r>
+        <w:rPr>
+          <w:lang w:val="en-US"/>
+        </w:rPr>
+        <w:t xml:space="preserve"> voltage follower</w:t>
+      </w:r>
+      <w:r>
+        <w:rPr>
+          <w:lang w:val="en-US"/>
+        </w:rPr>
+        <w:t xml:space="preserve"> from 10Hz to 10MHz.</w:t>
+      </w:r>
+    </w:p>
+    <w:p>
+      <w:pPr>
+        <w:rPr>
+          <w:lang w:val="en-US"/>
+        </w:rPr>
+      </w:pPr>
+    </w:p>
+    <w:p>
+      <w:pPr>
+        <w:keepNext/>
+      </w:pPr>
+      <w:r>
+        <w:rPr>
+          <w:noProof/>
+          <w:lang w:val="en-US"/>
+        </w:rPr>
+        <w:drawing>
+          <wp:inline distT="0" distB="0" distL="0" distR="0" wp14:anchorId="07708657" wp14:editId="24868DF6">
+            <wp:extent cx="6189345" cy="1899285"/>
+            <wp:effectExtent l="0" t="0" r="0" b="5715"/>
+            <wp:docPr id="202929633" name="Picture 10"/>
+            <wp:cNvGraphicFramePr>
+              <a:graphicFrameLocks xmlns:a="http://schemas.openxmlformats.org/drawingml/2006/main" noChangeAspect="1"/>
+            </wp:cNvGraphicFramePr>
+            <a:graphic xmlns:a="http://schemas.openxmlformats.org/drawingml/2006/main">
+              <a:graphicData uri="http://schemas.openxmlformats.org/drawingml/2006/picture">
+                <pic:pic xmlns:pic="http://schemas.openxmlformats.org/drawingml/2006/picture">
+                  <pic:nvPicPr>
+                    <pic:cNvPr id="202929633" name="Picture 202929633"/>
+                    <pic:cNvPicPr/>
+                  </pic:nvPicPr>
+                  <pic:blipFill>
+                    <a:blip r:embed="rId21"/>
+                    <a:stretch>
+                      <a:fillRect/>
+                    </a:stretch>
+                  </pic:blipFill>
+                  <pic:spPr>
+                    <a:xfrm>
+                      <a:off x="0" y="0"/>
+                      <a:ext cx="6189345" cy="1899285"/>
+                    </a:xfrm>
+                    <a:prstGeom prst="rect">
+                      <a:avLst/>
+                    </a:prstGeom>
+                  </pic:spPr>
+                </pic:pic>
+              </a:graphicData>
+            </a:graphic>
+          </wp:inline>
+        </w:drawing>
+      </w:r>
+    </w:p>
+    <w:p>
+      <w:pPr>
+        <w:pStyle w:val="Caption"/>
+        <w:rPr>
+          <w:lang w:val="en-US"/>
+        </w:rPr>
+      </w:pPr>
+      <w:r>
+        <w:rPr>
+          <w:lang w:val="en-US"/>
+        </w:rPr>
+        <w:t xml:space="preserve">Figure </w:t>
+      </w:r>
+      <w:r>
+        <w:fldChar w:fldCharType="begin"/>
+      </w:r>
+      <w:r>
+        <w:rPr>
+          <w:lang w:val="en-US"/>
+        </w:rPr>
+        <w:instrText xml:space="preserve"> SEQ Figure \* ARABIC </w:instrText>
+      </w:r>
+      <w:r>
+        <w:fldChar w:fldCharType="separate"/>
+      </w:r>
+      <w:r>
+        <w:rPr>
+          <w:noProof/>
+          <w:lang w:val="en-US"/>
+        </w:rPr>
         <w:t>8</w:t>
       </w:r>
       <w:r>
@@ -4246,7 +4226,6 @@
         <w:rPr>
           <w:noProof/>
         </w:rPr>
-        <w:lastRenderedPageBreak/>
         <w:drawing>
           <wp:inline distT="0" distB="0" distL="0" distR="0" wp14:anchorId="799A7238" wp14:editId="351CBD77">
             <wp:extent cx="6189345" cy="1905635"/>
@@ -4263,7 +4242,7 @@
                     <pic:cNvPicPr/>
                   </pic:nvPicPr>
                   <pic:blipFill>
-                    <a:blip r:embed="rId21"/>
+                    <a:blip r:embed="rId22"/>
                     <a:stretch>
                       <a:fillRect/>
                     </a:stretch>
@@ -4372,6 +4351,7 @@
           <w:noProof/>
           <w:lang w:val="en-US"/>
         </w:rPr>
+        <w:lastRenderedPageBreak/>
         <w:drawing>
           <wp:inline distT="0" distB="0" distL="0" distR="0" wp14:anchorId="0D156E4B" wp14:editId="006CB1CA">
             <wp:extent cx="6189345" cy="1899285"/>
@@ -4385,106 +4365,6 @@
                 <pic:pic xmlns:pic="http://schemas.openxmlformats.org/drawingml/2006/picture">
                   <pic:nvPicPr>
                     <pic:cNvPr id="1562323562" name="Picture 1562323562"/>
-                    <pic:cNvPicPr/>
-                  </pic:nvPicPr>
-                  <pic:blipFill>
-                    <a:blip r:embed="rId22"/>
-                    <a:stretch>
-                      <a:fillRect/>
-                    </a:stretch>
-                  </pic:blipFill>
-                  <pic:spPr>
-                    <a:xfrm>
-                      <a:off x="0" y="0"/>
-                      <a:ext cx="6189345" cy="1899285"/>
-                    </a:xfrm>
-                    <a:prstGeom prst="rect">
-                      <a:avLst/>
-                    </a:prstGeom>
-                  </pic:spPr>
-                </pic:pic>
-              </a:graphicData>
-            </a:graphic>
-          </wp:inline>
-        </w:drawing>
-      </w:r>
-    </w:p>
-    <w:p>
-      <w:pPr>
-        <w:pStyle w:val="Caption"/>
-        <w:rPr>
-          <w:lang w:val="en-US"/>
-        </w:rPr>
-      </w:pPr>
-      <w:r>
-        <w:rPr>
-          <w:lang w:val="en-US"/>
-        </w:rPr>
-        <w:t xml:space="preserve">Figure </w:t>
-      </w:r>
-      <w:r>
-        <w:fldChar w:fldCharType="begin"/>
-      </w:r>
-      <w:r>
-        <w:rPr>
-          <w:lang w:val="en-US"/>
-        </w:rPr>
-        <w:instrText xml:space="preserve"> SEQ Figure \* ARABIC </w:instrText>
-      </w:r>
-      <w:r>
-        <w:fldChar w:fldCharType="separate"/>
-      </w:r>
-      <w:r>
-        <w:rPr>
-          <w:noProof/>
-          <w:lang w:val="en-US"/>
-        </w:rPr>
-        <w:t>10</w:t>
-      </w:r>
-      <w:r>
-        <w:fldChar w:fldCharType="end"/>
-      </w:r>
-      <w:r>
-        <w:rPr>
-          <w:lang w:val="en-US"/>
-        </w:rPr>
-        <w:t>. The measured frequency response of a LM358 inverting amplifier with unity gain from</w:t>
-      </w:r>
-      <w:r>
-        <w:rPr>
-          <w:lang w:val="en-US"/>
-        </w:rPr>
-        <w:t xml:space="preserve"> 100Hz to 24.83MHz.</w:t>
-      </w:r>
-    </w:p>
-    <w:p>
-      <w:pPr>
-        <w:rPr>
-          <w:lang w:val="en-US"/>
-        </w:rPr>
-      </w:pPr>
-    </w:p>
-    <w:p>
-      <w:pPr>
-        <w:keepNext/>
-      </w:pPr>
-      <w:r>
-        <w:rPr>
-          <w:noProof/>
-        </w:rPr>
-        <w:drawing>
-          <wp:inline distT="0" distB="0" distL="0" distR="0" wp14:anchorId="2A9D4018" wp14:editId="6DB0A598">
-            <wp:extent cx="6189345" cy="1899285"/>
-            <wp:effectExtent l="0" t="0" r="0" b="5715"/>
-            <wp:docPr id="406557912" name="Picture 8"/>
-            <wp:cNvGraphicFramePr>
-              <a:graphicFrameLocks xmlns:a="http://schemas.openxmlformats.org/drawingml/2006/main" noChangeAspect="1"/>
-            </wp:cNvGraphicFramePr>
-            <a:graphic xmlns:a="http://schemas.openxmlformats.org/drawingml/2006/main">
-              <a:graphicData uri="http://schemas.openxmlformats.org/drawingml/2006/picture">
-                <pic:pic xmlns:pic="http://schemas.openxmlformats.org/drawingml/2006/picture">
-                  <pic:nvPicPr>
-                    <pic:cNvPr id="406557912" name="Picture 406557912"/>
                     <pic:cNvPicPr/>
                   </pic:nvPicPr>
                   <pic:blipFill>
@@ -4539,7 +4419,7 @@
           <w:noProof/>
           <w:lang w:val="en-US"/>
         </w:rPr>
-        <w:t>11</w:t>
+        <w:t>10</w:t>
       </w:r>
       <w:r>
         <w:fldChar w:fldCharType="end"/>
@@ -4548,50 +4428,13 @@
         <w:rPr>
           <w:lang w:val="en-US"/>
         </w:rPr>
-        <w:t xml:space="preserve">. The simulated frequency response of </w:t>
-      </w:r>
-      <w:r>
-        <w:rPr>
-          <w:lang w:val="en-US"/>
-        </w:rPr>
-        <w:t xml:space="preserve">a </w:t>
-      </w:r>
-      <w:r>
-        <w:rPr>
-          <w:lang w:val="en-US"/>
-        </w:rPr>
-        <w:t xml:space="preserve">LM358 </w:t>
-      </w:r>
-      <w:r>
-        <w:rPr>
-          <w:lang w:val="en-US"/>
-        </w:rPr>
-        <w:t>non-</w:t>
-      </w:r>
-      <w:r>
-        <w:rPr>
-          <w:lang w:val="en-US"/>
-        </w:rPr>
-        <w:t xml:space="preserve">inverting amplifier with a gain </w:t>
-      </w:r>
-      <w:r>
-        <w:rPr>
-          <w:lang w:val="en-US"/>
-        </w:rPr>
-        <w:t>(A</w:t>
-      </w:r>
-      <w:r>
-        <w:rPr>
-          <w:vertAlign w:val="subscript"/>
-          <w:lang w:val="en-US"/>
-        </w:rPr>
-        <w:t>v</w:t>
-      </w:r>
-      <w:r>
-        <w:rPr>
-          <w:lang w:val="en-US"/>
-        </w:rPr>
-        <w:t>) = 100 (40dB) from 10Hz to 10MHz.</w:t>
+        <w:t>. The measured frequency response of a LM358 inverting amplifier with unity gain from</w:t>
+      </w:r>
+      <w:r>
+        <w:rPr>
+          <w:lang w:val="en-US"/>
+        </w:rPr>
+        <w:t xml:space="preserve"> 100Hz to 24.83MHz.</w:t>
       </w:r>
     </w:p>
     <w:p>
@@ -4608,14 +4451,12 @@
       <w:r>
         <w:rPr>
           <w:noProof/>
-          <w:lang w:val="en-US"/>
-        </w:rPr>
-        <w:lastRenderedPageBreak/>
+        </w:rPr>
         <w:drawing>
-          <wp:inline distT="0" distB="0" distL="0" distR="0" wp14:anchorId="783AA0A3" wp14:editId="64CBB4E2">
+          <wp:inline distT="0" distB="0" distL="0" distR="0" wp14:anchorId="2A9D4018" wp14:editId="6DB0A598">
             <wp:extent cx="6189345" cy="1899285"/>
             <wp:effectExtent l="0" t="0" r="0" b="5715"/>
-            <wp:docPr id="1485130847" name="Picture 12"/>
+            <wp:docPr id="406557912" name="Picture 8"/>
             <wp:cNvGraphicFramePr>
               <a:graphicFrameLocks xmlns:a="http://schemas.openxmlformats.org/drawingml/2006/main" noChangeAspect="1"/>
             </wp:cNvGraphicFramePr>
@@ -4623,7 +4464,7 @@
               <a:graphicData uri="http://schemas.openxmlformats.org/drawingml/2006/picture">
                 <pic:pic xmlns:pic="http://schemas.openxmlformats.org/drawingml/2006/picture">
                   <pic:nvPicPr>
-                    <pic:cNvPr id="1485130847" name="Picture 1485130847"/>
+                    <pic:cNvPr id="406557912" name="Picture 406557912"/>
                     <pic:cNvPicPr/>
                   </pic:nvPicPr>
                   <pic:blipFill>
@@ -4678,6 +4519,144 @@
           <w:noProof/>
           <w:lang w:val="en-US"/>
         </w:rPr>
+        <w:t>11</w:t>
+      </w:r>
+      <w:r>
+        <w:fldChar w:fldCharType="end"/>
+      </w:r>
+      <w:r>
+        <w:rPr>
+          <w:lang w:val="en-US"/>
+        </w:rPr>
+        <w:t xml:space="preserve">. The simulated frequency response of </w:t>
+      </w:r>
+      <w:r>
+        <w:rPr>
+          <w:lang w:val="en-US"/>
+        </w:rPr>
+        <w:t xml:space="preserve">a </w:t>
+      </w:r>
+      <w:r>
+        <w:rPr>
+          <w:lang w:val="en-US"/>
+        </w:rPr>
+        <w:t xml:space="preserve">LM358 </w:t>
+      </w:r>
+      <w:r>
+        <w:rPr>
+          <w:lang w:val="en-US"/>
+        </w:rPr>
+        <w:t>non-</w:t>
+      </w:r>
+      <w:r>
+        <w:rPr>
+          <w:lang w:val="en-US"/>
+        </w:rPr>
+        <w:t xml:space="preserve">inverting amplifier with a gain </w:t>
+      </w:r>
+      <w:r>
+        <w:rPr>
+          <w:lang w:val="en-US"/>
+        </w:rPr>
+        <w:t>(A</w:t>
+      </w:r>
+      <w:r>
+        <w:rPr>
+          <w:vertAlign w:val="subscript"/>
+          <w:lang w:val="en-US"/>
+        </w:rPr>
+        <w:t>v</w:t>
+      </w:r>
+      <w:r>
+        <w:rPr>
+          <w:lang w:val="en-US"/>
+        </w:rPr>
+        <w:t>) = 100 (40dB) from 10Hz to 10MHz.</w:t>
+      </w:r>
+    </w:p>
+    <w:p>
+      <w:pPr>
+        <w:rPr>
+          <w:lang w:val="en-US"/>
+        </w:rPr>
+      </w:pPr>
+    </w:p>
+    <w:p>
+      <w:pPr>
+        <w:keepNext/>
+      </w:pPr>
+      <w:r>
+        <w:rPr>
+          <w:noProof/>
+          <w:lang w:val="en-US"/>
+        </w:rPr>
+        <w:drawing>
+          <wp:inline distT="0" distB="0" distL="0" distR="0" wp14:anchorId="783AA0A3" wp14:editId="64CBB4E2">
+            <wp:extent cx="6189345" cy="1899285"/>
+            <wp:effectExtent l="0" t="0" r="0" b="5715"/>
+            <wp:docPr id="1485130847" name="Picture 12"/>
+            <wp:cNvGraphicFramePr>
+              <a:graphicFrameLocks xmlns:a="http://schemas.openxmlformats.org/drawingml/2006/main" noChangeAspect="1"/>
+            </wp:cNvGraphicFramePr>
+            <a:graphic xmlns:a="http://schemas.openxmlformats.org/drawingml/2006/main">
+              <a:graphicData uri="http://schemas.openxmlformats.org/drawingml/2006/picture">
+                <pic:pic xmlns:pic="http://schemas.openxmlformats.org/drawingml/2006/picture">
+                  <pic:nvPicPr>
+                    <pic:cNvPr id="1485130847" name="Picture 1485130847"/>
+                    <pic:cNvPicPr/>
+                  </pic:nvPicPr>
+                  <pic:blipFill>
+                    <a:blip r:embed="rId25"/>
+                    <a:stretch>
+                      <a:fillRect/>
+                    </a:stretch>
+                  </pic:blipFill>
+                  <pic:spPr>
+                    <a:xfrm>
+                      <a:off x="0" y="0"/>
+                      <a:ext cx="6189345" cy="1899285"/>
+                    </a:xfrm>
+                    <a:prstGeom prst="rect">
+                      <a:avLst/>
+                    </a:prstGeom>
+                  </pic:spPr>
+                </pic:pic>
+              </a:graphicData>
+            </a:graphic>
+          </wp:inline>
+        </w:drawing>
+      </w:r>
+    </w:p>
+    <w:p>
+      <w:pPr>
+        <w:pStyle w:val="Caption"/>
+        <w:rPr>
+          <w:lang w:val="en-US"/>
+        </w:rPr>
+      </w:pPr>
+      <w:r>
+        <w:rPr>
+          <w:lang w:val="en-US"/>
+        </w:rPr>
+        <w:t xml:space="preserve">Figure </w:t>
+      </w:r>
+      <w:r>
+        <w:fldChar w:fldCharType="begin"/>
+      </w:r>
+      <w:r>
+        <w:rPr>
+          <w:lang w:val="en-US"/>
+        </w:rPr>
+        <w:instrText xml:space="preserve"> SEQ Figure \* ARABIC </w:instrText>
+      </w:r>
+      <w:r>
+        <w:fldChar w:fldCharType="separate"/>
+      </w:r>
+      <w:r>
+        <w:rPr>
+          <w:noProof/>
+          <w:lang w:val="en-US"/>
+        </w:rPr>
         <w:t>12</w:t>
       </w:r>
       <w:r>
@@ -4769,6 +4748,7 @@
           <w:noProof/>
           <w:lang w:val="en-US"/>
         </w:rPr>
+        <w:lastRenderedPageBreak/>
         <w:drawing>
           <wp:inline distT="0" distB="0" distL="0" distR="0" wp14:anchorId="2CCD9FFF" wp14:editId="677FC324">
             <wp:extent cx="6189345" cy="1905635"/>
@@ -4782,144 +4762,6 @@
                 <pic:pic xmlns:pic="http://schemas.openxmlformats.org/drawingml/2006/picture">
                   <pic:nvPicPr>
                     <pic:cNvPr id="667052883" name="Picture 667052883"/>
-                    <pic:cNvPicPr/>
-                  </pic:nvPicPr>
-                  <pic:blipFill>
-                    <a:blip r:embed="rId25"/>
-                    <a:stretch>
-                      <a:fillRect/>
-                    </a:stretch>
-                  </pic:blipFill>
-                  <pic:spPr>
-                    <a:xfrm>
-                      <a:off x="0" y="0"/>
-                      <a:ext cx="6189345" cy="1905635"/>
-                    </a:xfrm>
-                    <a:prstGeom prst="rect">
-                      <a:avLst/>
-                    </a:prstGeom>
-                  </pic:spPr>
-                </pic:pic>
-              </a:graphicData>
-            </a:graphic>
-          </wp:inline>
-        </w:drawing>
-      </w:r>
-    </w:p>
-    <w:p>
-      <w:pPr>
-        <w:pStyle w:val="Caption"/>
-        <w:rPr>
-          <w:lang w:val="en-US"/>
-        </w:rPr>
-      </w:pPr>
-      <w:r>
-        <w:rPr>
-          <w:lang w:val="en-US"/>
-        </w:rPr>
-        <w:t xml:space="preserve">Figure </w:t>
-      </w:r>
-      <w:r>
-        <w:fldChar w:fldCharType="begin"/>
-      </w:r>
-      <w:r>
-        <w:rPr>
-          <w:lang w:val="en-US"/>
-        </w:rPr>
-        <w:instrText xml:space="preserve"> SEQ Figure \* ARABIC </w:instrText>
-      </w:r>
-      <w:r>
-        <w:fldChar w:fldCharType="separate"/>
-      </w:r>
-      <w:r>
-        <w:rPr>
-          <w:noProof/>
-          <w:lang w:val="en-US"/>
-        </w:rPr>
-        <w:t>13</w:t>
-      </w:r>
-      <w:r>
-        <w:fldChar w:fldCharType="end"/>
-      </w:r>
-      <w:r>
-        <w:rPr>
-          <w:lang w:val="en-US"/>
-        </w:rPr>
-        <w:t xml:space="preserve">. The simulated frequency response of </w:t>
-      </w:r>
-      <w:r>
-        <w:rPr>
-          <w:lang w:val="en-US"/>
-        </w:rPr>
-        <w:t xml:space="preserve">a </w:t>
-      </w:r>
-      <w:r>
-        <w:rPr>
-          <w:lang w:val="en-US"/>
-        </w:rPr>
-        <w:t xml:space="preserve">LM358 inverting amplifier </w:t>
-      </w:r>
-      <w:r>
-        <w:rPr>
-          <w:lang w:val="en-US"/>
-        </w:rPr>
-        <w:t xml:space="preserve">with a gain </w:t>
-      </w:r>
-      <w:r>
-        <w:rPr>
-          <w:lang w:val="en-US"/>
-        </w:rPr>
-        <w:t>(A</w:t>
-      </w:r>
-      <w:r>
-        <w:rPr>
-          <w:vertAlign w:val="subscript"/>
-          <w:lang w:val="en-US"/>
-        </w:rPr>
-        <w:t>v</w:t>
-      </w:r>
-      <w:r>
-        <w:rPr>
-          <w:lang w:val="en-US"/>
-        </w:rPr>
-        <w:t xml:space="preserve">) = 100 (40dB) </w:t>
-      </w:r>
-      <w:r>
-        <w:rPr>
-          <w:lang w:val="en-US"/>
-        </w:rPr>
-        <w:t>from 10Hz to 10MHz.</w:t>
-      </w:r>
-    </w:p>
-    <w:p>
-      <w:pPr>
-        <w:rPr>
-          <w:lang w:val="en-US"/>
-        </w:rPr>
-      </w:pPr>
-    </w:p>
-    <w:p>
-      <w:pPr>
-        <w:keepNext/>
-      </w:pPr>
-      <w:r>
-        <w:rPr>
-          <w:noProof/>
-          <w:lang w:val="en-US"/>
-        </w:rPr>
-        <w:drawing>
-          <wp:inline distT="0" distB="0" distL="0" distR="0" wp14:anchorId="5EFACDC9" wp14:editId="3F4FF81F">
-            <wp:extent cx="6189345" cy="1905635"/>
-            <wp:effectExtent l="0" t="0" r="0" b="0"/>
-            <wp:docPr id="951481025" name="Picture 13"/>
-            <wp:cNvGraphicFramePr>
-              <a:graphicFrameLocks xmlns:a="http://schemas.openxmlformats.org/drawingml/2006/main" noChangeAspect="1"/>
-            </wp:cNvGraphicFramePr>
-            <a:graphic xmlns:a="http://schemas.openxmlformats.org/drawingml/2006/main">
-              <a:graphicData uri="http://schemas.openxmlformats.org/drawingml/2006/picture">
-                <pic:pic xmlns:pic="http://schemas.openxmlformats.org/drawingml/2006/picture">
-                  <pic:nvPicPr>
-                    <pic:cNvPr id="951481025" name="Picture 951481025"/>
                     <pic:cNvPicPr/>
                   </pic:nvPicPr>
                   <pic:blipFill>
@@ -4974,6 +4816,144 @@
           <w:noProof/>
           <w:lang w:val="en-US"/>
         </w:rPr>
+        <w:t>13</w:t>
+      </w:r>
+      <w:r>
+        <w:fldChar w:fldCharType="end"/>
+      </w:r>
+      <w:r>
+        <w:rPr>
+          <w:lang w:val="en-US"/>
+        </w:rPr>
+        <w:t xml:space="preserve">. The simulated frequency response of </w:t>
+      </w:r>
+      <w:r>
+        <w:rPr>
+          <w:lang w:val="en-US"/>
+        </w:rPr>
+        <w:t xml:space="preserve">a </w:t>
+      </w:r>
+      <w:r>
+        <w:rPr>
+          <w:lang w:val="en-US"/>
+        </w:rPr>
+        <w:t xml:space="preserve">LM358 inverting amplifier </w:t>
+      </w:r>
+      <w:r>
+        <w:rPr>
+          <w:lang w:val="en-US"/>
+        </w:rPr>
+        <w:t xml:space="preserve">with a gain </w:t>
+      </w:r>
+      <w:r>
+        <w:rPr>
+          <w:lang w:val="en-US"/>
+        </w:rPr>
+        <w:t>(A</w:t>
+      </w:r>
+      <w:r>
+        <w:rPr>
+          <w:vertAlign w:val="subscript"/>
+          <w:lang w:val="en-US"/>
+        </w:rPr>
+        <w:t>v</w:t>
+      </w:r>
+      <w:r>
+        <w:rPr>
+          <w:lang w:val="en-US"/>
+        </w:rPr>
+        <w:t xml:space="preserve">) = 100 (40dB) </w:t>
+      </w:r>
+      <w:r>
+        <w:rPr>
+          <w:lang w:val="en-US"/>
+        </w:rPr>
+        <w:t>from 10Hz to 10MHz.</w:t>
+      </w:r>
+    </w:p>
+    <w:p>
+      <w:pPr>
+        <w:rPr>
+          <w:lang w:val="en-US"/>
+        </w:rPr>
+      </w:pPr>
+    </w:p>
+    <w:p>
+      <w:pPr>
+        <w:keepNext/>
+      </w:pPr>
+      <w:r>
+        <w:rPr>
+          <w:noProof/>
+          <w:lang w:val="en-US"/>
+        </w:rPr>
+        <w:drawing>
+          <wp:inline distT="0" distB="0" distL="0" distR="0" wp14:anchorId="5EFACDC9" wp14:editId="3F4FF81F">
+            <wp:extent cx="6189345" cy="1905635"/>
+            <wp:effectExtent l="0" t="0" r="0" b="0"/>
+            <wp:docPr id="951481025" name="Picture 13"/>
+            <wp:cNvGraphicFramePr>
+              <a:graphicFrameLocks xmlns:a="http://schemas.openxmlformats.org/drawingml/2006/main" noChangeAspect="1"/>
+            </wp:cNvGraphicFramePr>
+            <a:graphic xmlns:a="http://schemas.openxmlformats.org/drawingml/2006/main">
+              <a:graphicData uri="http://schemas.openxmlformats.org/drawingml/2006/picture">
+                <pic:pic xmlns:pic="http://schemas.openxmlformats.org/drawingml/2006/picture">
+                  <pic:nvPicPr>
+                    <pic:cNvPr id="951481025" name="Picture 951481025"/>
+                    <pic:cNvPicPr/>
+                  </pic:nvPicPr>
+                  <pic:blipFill>
+                    <a:blip r:embed="rId27"/>
+                    <a:stretch>
+                      <a:fillRect/>
+                    </a:stretch>
+                  </pic:blipFill>
+                  <pic:spPr>
+                    <a:xfrm>
+                      <a:off x="0" y="0"/>
+                      <a:ext cx="6189345" cy="1905635"/>
+                    </a:xfrm>
+                    <a:prstGeom prst="rect">
+                      <a:avLst/>
+                    </a:prstGeom>
+                  </pic:spPr>
+                </pic:pic>
+              </a:graphicData>
+            </a:graphic>
+          </wp:inline>
+        </w:drawing>
+      </w:r>
+    </w:p>
+    <w:p>
+      <w:pPr>
+        <w:pStyle w:val="Caption"/>
+        <w:rPr>
+          <w:lang w:val="en-US"/>
+        </w:rPr>
+      </w:pPr>
+      <w:r>
+        <w:rPr>
+          <w:lang w:val="en-US"/>
+        </w:rPr>
+        <w:t xml:space="preserve">Figure </w:t>
+      </w:r>
+      <w:r>
+        <w:fldChar w:fldCharType="begin"/>
+      </w:r>
+      <w:r>
+        <w:rPr>
+          <w:lang w:val="en-US"/>
+        </w:rPr>
+        <w:instrText xml:space="preserve"> SEQ Figure \* ARABIC </w:instrText>
+      </w:r>
+      <w:r>
+        <w:fldChar w:fldCharType="separate"/>
+      </w:r>
+      <w:r>
+        <w:rPr>
+          <w:noProof/>
+          <w:lang w:val="en-US"/>
+        </w:rPr>
         <w:t>14</w:t>
       </w:r>
       <w:r>
@@ -5086,178 +5066,184 @@
         <w:rPr>
           <w:lang w:val="en-US"/>
         </w:rPr>
+        <w:t>The results section presents t</w:t>
+      </w:r>
+      <w:r>
+        <w:rPr>
+          <w:lang w:val="en-US"/>
+        </w:rPr>
+        <w:t xml:space="preserve">he results of the study to the reader. </w:t>
+      </w:r>
+      <w:r>
+        <w:rPr>
+          <w:lang w:val="en-US"/>
+        </w:rPr>
+        <w:t>Typically,</w:t>
+      </w:r>
+      <w:r>
+        <w:rPr>
+          <w:lang w:val="en-US"/>
+        </w:rPr>
+        <w:t xml:space="preserve"> in case of laboratory assignments, the results are the results of a measurement, which are used to present and explain the phenomenon under study. </w:t>
+      </w:r>
+      <w:r>
+        <w:rPr>
+          <w:lang w:val="en-US"/>
+        </w:rPr>
+        <w:t>All possible oscilloscope figures should not under any circumstances b</w:t>
+      </w:r>
+      <w:r>
+        <w:rPr>
+          <w:lang w:val="en-US"/>
+        </w:rPr>
+        <w:t xml:space="preserve">e dumped into the report. </w:t>
+      </w:r>
+      <w:r>
+        <w:rPr>
+          <w:lang w:val="en-US"/>
+        </w:rPr>
+        <w:t>Usually there is no need to present the complete s</w:t>
+      </w:r>
+      <w:r>
+        <w:rPr>
+          <w:lang w:val="en-US"/>
+        </w:rPr>
+        <w:t>heet of measurement readings – only the most crucial measurement results are needed.</w:t>
+      </w:r>
+    </w:p>
+    <w:p>
+      <w:pPr>
+        <w:rPr>
+          <w:lang w:val="en-US"/>
+        </w:rPr>
+      </w:pPr>
+      <w:r>
+        <w:rPr>
+          <w:lang w:val="en-US"/>
+        </w:rPr>
+        <w:t xml:space="preserve">So that the </w:t>
+      </w:r>
+      <w:r>
+        <w:rPr>
+          <w:lang w:val="en-US"/>
+        </w:rPr>
+        <w:t>observations m</w:t>
+      </w:r>
+      <w:r>
+        <w:rPr>
+          <w:lang w:val="en-US"/>
+        </w:rPr>
+        <w:t xml:space="preserve">ade in the study are useful to others also, the result analysis must be presented as thoroughly as possible. </w:t>
+      </w:r>
+      <w:r>
+        <w:rPr>
+          <w:lang w:val="en-US"/>
+        </w:rPr>
+        <w:t>The observations of the study and the result analysis i</w:t>
+      </w:r>
+      <w:r>
+        <w:rPr>
+          <w:lang w:val="en-US"/>
+        </w:rPr>
+        <w:t xml:space="preserve">s presented unambiguously and compactly. A figure or table can be used for help in the presentation. </w:t>
+      </w:r>
+      <w:r>
+        <w:rPr>
+          <w:lang w:val="en-US"/>
+        </w:rPr>
+        <w:t>The observations made, the analysis made on them and p</w:t>
+      </w:r>
+      <w:r>
+        <w:rPr>
+          <w:lang w:val="en-US"/>
+        </w:rPr>
+        <w:t xml:space="preserve">resented figures etc. are used to reason the conclusions of the study. </w:t>
+      </w:r>
+      <w:r>
+        <w:rPr>
+          <w:lang w:val="en-US"/>
+        </w:rPr>
+        <w:t>The interpretation of result figures or numbers must not b</w:t>
+      </w:r>
+      <w:r>
+        <w:rPr>
+          <w:lang w:val="en-US"/>
+        </w:rPr>
+        <w:t>e left for the reader, the text must tell what the figures and numbers show, for example.</w:t>
+      </w:r>
+    </w:p>
+    <w:p>
+      <w:pPr>
+        <w:rPr>
+          <w:lang w:val="en-US"/>
+        </w:rPr>
+      </w:pPr>
+      <w:r>
+        <w:rPr>
+          <w:lang w:val="en-US"/>
+        </w:rPr>
+        <w:t>It is not usually obvious h</w:t>
+      </w:r>
+      <w:r>
+        <w:rPr>
+          <w:lang w:val="en-US"/>
+        </w:rPr>
+        <w:t xml:space="preserve">ow the results </w:t>
+      </w:r>
+      <w:r>
+        <w:rPr>
+          <w:lang w:val="en-US"/>
+        </w:rPr>
+        <w:t>should be</w:t>
+      </w:r>
+      <w:r>
+        <w:rPr>
+          <w:lang w:val="en-US"/>
+        </w:rPr>
+        <w:t xml:space="preserve"> pre</w:t>
+      </w:r>
+      <w:r>
+        <w:rPr>
+          <w:lang w:val="en-US"/>
+        </w:rPr>
+        <w:t xml:space="preserve">sented. </w:t>
+      </w:r>
+      <w:r>
+        <w:rPr>
+          <w:lang w:val="en-US"/>
+        </w:rPr>
+        <w:t xml:space="preserve">The writer </w:t>
+      </w:r>
+      <w:r>
+        <w:rPr>
+          <w:lang w:val="en-US"/>
+        </w:rPr>
+        <w:t>must</w:t>
+      </w:r>
+      <w:r>
+        <w:rPr>
+          <w:lang w:val="en-US"/>
+        </w:rPr>
+        <w:t xml:space="preserve"> c</w:t>
+      </w:r>
+      <w:r>
+        <w:rPr>
+          <w:lang w:val="en-US"/>
+        </w:rPr>
+        <w:t xml:space="preserve">onsider what is the best way to present and justify the conclusions derived from the observations. </w:t>
+      </w:r>
+      <w:r>
+        <w:rPr>
+          <w:lang w:val="en-US"/>
+        </w:rPr>
+        <w:t xml:space="preserve">Some results are easiest to </w:t>
+      </w:r>
+      <w:r>
+        <w:rPr>
+          <w:lang w:val="en-US"/>
+        </w:rPr>
         <w:lastRenderedPageBreak/>
-        <w:t>The results section presents t</w:t>
-      </w:r>
-      <w:r>
-        <w:rPr>
-          <w:lang w:val="en-US"/>
-        </w:rPr>
-        <w:t xml:space="preserve">he results of the study to the reader. </w:t>
-      </w:r>
-      <w:r>
-        <w:rPr>
-          <w:lang w:val="en-US"/>
-        </w:rPr>
-        <w:t>Typically,</w:t>
-      </w:r>
-      <w:r>
-        <w:rPr>
-          <w:lang w:val="en-US"/>
-        </w:rPr>
-        <w:t xml:space="preserve"> in case of laboratory assignments, the results are the results of a measurement, which are used to present and explain the phenomenon under study. </w:t>
-      </w:r>
-      <w:r>
-        <w:rPr>
-          <w:lang w:val="en-US"/>
-        </w:rPr>
-        <w:t>All possible oscilloscope figures should not under any circumstances b</w:t>
-      </w:r>
-      <w:r>
-        <w:rPr>
-          <w:lang w:val="en-US"/>
-        </w:rPr>
-        <w:t xml:space="preserve">e dumped into the report. </w:t>
-      </w:r>
-      <w:r>
-        <w:rPr>
-          <w:lang w:val="en-US"/>
-        </w:rPr>
-        <w:t>Usually there is no need to present the complete s</w:t>
-      </w:r>
-      <w:r>
-        <w:rPr>
-          <w:lang w:val="en-US"/>
-        </w:rPr>
-        <w:t>heet of measurement readings – only the most crucial measurement results are needed.</w:t>
-      </w:r>
-    </w:p>
-    <w:p>
-      <w:pPr>
-        <w:rPr>
-          <w:lang w:val="en-US"/>
-        </w:rPr>
-      </w:pPr>
-      <w:r>
-        <w:rPr>
-          <w:lang w:val="en-US"/>
-        </w:rPr>
-        <w:t xml:space="preserve">So that the </w:t>
-      </w:r>
-      <w:r>
-        <w:rPr>
-          <w:lang w:val="en-US"/>
-        </w:rPr>
-        <w:t>observations m</w:t>
-      </w:r>
-      <w:r>
-        <w:rPr>
-          <w:lang w:val="en-US"/>
-        </w:rPr>
-        <w:t xml:space="preserve">ade in the study are useful to others also, the result analysis must be presented as thoroughly as possible. </w:t>
-      </w:r>
-      <w:r>
-        <w:rPr>
-          <w:lang w:val="en-US"/>
-        </w:rPr>
-        <w:t>The observations of the study and the result analysis i</w:t>
-      </w:r>
-      <w:r>
-        <w:rPr>
-          <w:lang w:val="en-US"/>
-        </w:rPr>
-        <w:t xml:space="preserve">s presented unambiguously and compactly. A figure or table can be used for help in the presentation. </w:t>
-      </w:r>
-      <w:r>
-        <w:rPr>
-          <w:lang w:val="en-US"/>
-        </w:rPr>
-        <w:t>The observations made, the analysis made on them and p</w:t>
-      </w:r>
-      <w:r>
-        <w:rPr>
-          <w:lang w:val="en-US"/>
-        </w:rPr>
-        <w:t xml:space="preserve">resented figures etc. are used to reason the conclusions of the study. </w:t>
-      </w:r>
-      <w:r>
-        <w:rPr>
-          <w:lang w:val="en-US"/>
-        </w:rPr>
-        <w:t>The interpretation of result figures or numbers must not b</w:t>
-      </w:r>
-      <w:r>
-        <w:rPr>
-          <w:lang w:val="en-US"/>
-        </w:rPr>
-        <w:t>e left for the reader, the text must tell what the figures and numbers show, for example.</w:t>
-      </w:r>
-    </w:p>
-    <w:p>
-      <w:pPr>
-        <w:rPr>
-          <w:lang w:val="en-US"/>
-        </w:rPr>
-      </w:pPr>
-      <w:r>
-        <w:rPr>
-          <w:lang w:val="en-US"/>
-        </w:rPr>
-        <w:t>It is not usually obvious h</w:t>
-      </w:r>
-      <w:r>
-        <w:rPr>
-          <w:lang w:val="en-US"/>
-        </w:rPr>
-        <w:t xml:space="preserve">ow the results </w:t>
-      </w:r>
-      <w:r>
-        <w:rPr>
-          <w:lang w:val="en-US"/>
-        </w:rPr>
-        <w:t>should be</w:t>
-      </w:r>
-      <w:r>
-        <w:rPr>
-          <w:lang w:val="en-US"/>
-        </w:rPr>
-        <w:t xml:space="preserve"> pre</w:t>
-      </w:r>
-      <w:r>
-        <w:rPr>
-          <w:lang w:val="en-US"/>
-        </w:rPr>
-        <w:t xml:space="preserve">sented. </w:t>
-      </w:r>
-      <w:r>
-        <w:rPr>
-          <w:lang w:val="en-US"/>
-        </w:rPr>
-        <w:t xml:space="preserve">The writer </w:t>
-      </w:r>
-      <w:r>
-        <w:rPr>
-          <w:lang w:val="en-US"/>
-        </w:rPr>
-        <w:t>must</w:t>
-      </w:r>
-      <w:r>
-        <w:rPr>
-          <w:lang w:val="en-US"/>
-        </w:rPr>
-        <w:t xml:space="preserve"> c</w:t>
-      </w:r>
-      <w:r>
-        <w:rPr>
-          <w:lang w:val="en-US"/>
-        </w:rPr>
-        <w:t xml:space="preserve">onsider what is the best way to present and justify the conclusions derived from the observations. </w:t>
-      </w:r>
-      <w:r>
-        <w:rPr>
-          <w:lang w:val="en-US"/>
-        </w:rPr>
-        <w:t xml:space="preserve">Some results are easiest to present in figure (example: figure </w:t>
+        <w:t xml:space="preserve">present in figure (example: figure </w:t>
       </w:r>
       <w:r>
         <w:rPr>
@@ -7294,7 +7280,7 @@
                           </pic:cNvPicPr>
                         </pic:nvPicPr>
                         <pic:blipFill>
-                          <a:blip r:embed="rId27"/>
+                          <a:blip r:embed="rId28"/>
                           <a:stretch>
                             <a:fillRect/>
                           </a:stretch>
@@ -7323,7 +7309,7 @@
                           </pic:cNvPicPr>
                         </pic:nvPicPr>
                         <pic:blipFill>
-                          <a:blip r:embed="rId28"/>
+                          <a:blip r:embed="rId29"/>
                           <a:stretch>
                             <a:fillRect/>
                           </a:stretch>
@@ -7352,7 +7338,7 @@
                           </pic:cNvPicPr>
                         </pic:nvPicPr>
                         <pic:blipFill>
-                          <a:blip r:embed="rId29"/>
+                          <a:blip r:embed="rId30"/>
                           <a:stretch>
                             <a:fillRect/>
                           </a:stretch>
@@ -7381,7 +7367,7 @@
                           </pic:cNvPicPr>
                         </pic:nvPicPr>
                         <pic:blipFill>
-                          <a:blip r:embed="rId30"/>
+                          <a:blip r:embed="rId31"/>
                           <a:stretch>
                             <a:fillRect/>
                           </a:stretch>
@@ -7410,7 +7396,7 @@
                           </pic:cNvPicPr>
                         </pic:nvPicPr>
                         <pic:blipFill>
-                          <a:blip r:embed="rId31"/>
+                          <a:blip r:embed="rId32"/>
                           <a:stretch>
                             <a:fillRect/>
                           </a:stretch>
@@ -7460,19 +7446,19 @@
                   <o:lock v:ext="edit" aspectratio="t"/>
                 </v:shapetype>
                 <v:shape id="Picture 2" o:spid="_x0000_s1027" type="#_x0000_t75" style="position:absolute;width:22384;height:19252;visibility:visible;mso-wrap-style:square" o:gfxdata="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">
-                  <v:imagedata r:id="rId32" o:title=""/>
+                  <v:imagedata r:id="rId33" o:title=""/>
                 </v:shape>
                 <v:shape id="Picture 3" o:spid="_x0000_s1028" type="#_x0000_t75" style="position:absolute;left:23399;width:22385;height:19252;visibility:visible;mso-wrap-style:square" o:gfxdata="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">
-                  <v:imagedata r:id="rId33" o:title=""/>
+                  <v:imagedata r:id="rId34" o:title=""/>
                 </v:shape>
                 <v:shape id="Picture 4" o:spid="_x0000_s1029" type="#_x0000_t75" style="position:absolute;top:18071;width:22384;height:18417;visibility:visible;mso-wrap-style:square" o:gfxdata="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">
-                  <v:imagedata r:id="rId34" o:title=""/>
+                  <v:imagedata r:id="rId35" o:title=""/>
                 </v:shape>
                 <v:shape id="Picture 5" o:spid="_x0000_s1030" type="#_x0000_t75" style="position:absolute;left:22384;top:17653;width:23400;height:19253;visibility:visible;mso-wrap-style:square" o:gfxdata="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">
-                  <v:imagedata r:id="rId35" o:title=""/>
+                  <v:imagedata r:id="rId36" o:title=""/>
                 </v:shape>
                 <v:shape id="Picture 6" o:spid="_x0000_s1031" type="#_x0000_t75" style="position:absolute;left:11688;top:36756;width:22396;height:3494;visibility:visible;mso-wrap-style:square" o:gfxdata="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">
-                  <v:imagedata r:id="rId36" o:title=""/>
+                  <v:imagedata r:id="rId37" o:title=""/>
                 </v:shape>
                 <w10:wrap type="topAndBottom" anchory="page"/>
               </v:group>
@@ -8191,7 +8177,7 @@
         </w:rPr>
         <w:t xml:space="preserve"> Available </w:t>
       </w:r>
-      <w:hyperlink r:id="rId37" w:history="1">
+      <w:hyperlink r:id="rId38" w:history="1">
         <w:r>
           <w:rPr>
             <w:rStyle w:val="Hyperlink"/>
@@ -8257,7 +8243,7 @@
         </w:rPr>
         <w:t xml:space="preserve">. Dallas, TX: Texas Instruments. Available at: </w:t>
       </w:r>
-      <w:hyperlink r:id="rId38" w:history="1">
+      <w:hyperlink r:id="rId39" w:history="1">
         <w:r>
           <w:rPr>
             <w:rStyle w:val="Hyperlink"/>
@@ -8329,7 +8315,7 @@
         </w:rPr>
         <w:t xml:space="preserve">. The references are sorted in alphabetical order. Instructions for referencing: </w:t>
       </w:r>
-      <w:hyperlink r:id="rId39" w:history="1">
+      <w:hyperlink r:id="rId40" w:history="1">
         <w:r>
           <w:rPr>
             <w:rStyle w:val="Hyperlink"/>
@@ -8551,7 +8537,7 @@
         </w:rPr>
         <w:br/>
       </w:r>
-      <w:hyperlink r:id="rId40" w:history="1">
+      <w:hyperlink r:id="rId41" w:history="1">
         <w:r>
           <w:rPr>
             <w:rStyle w:val="Hyperlink"/>
@@ -8798,7 +8784,7 @@
         </w:rPr>
         <w:t xml:space="preserve"> </w:t>
       </w:r>
-      <w:hyperlink r:id="rId41" w:history="1">
+      <w:hyperlink r:id="rId42" w:history="1">
         <w:r>
           <w:rPr>
             <w:rStyle w:val="Hyperlink"/>
@@ -9034,10 +9020,10 @@
       </w:pPr>
     </w:p>
     <w:sectPr>
-      <w:headerReference w:type="default" r:id="rId42"/>
-      <w:footerReference w:type="default" r:id="rId43"/>
-      <w:headerReference w:type="first" r:id="rId44"/>
-      <w:footerReference w:type="first" r:id="rId45"/>
+      <w:headerReference w:type="default" r:id="rId43"/>
+      <w:footerReference w:type="default" r:id="rId44"/>
+      <w:headerReference w:type="first" r:id="rId45"/>
+      <w:footerReference w:type="first" r:id="rId46"/>
       <w:type w:val="continuous"/>
       <w:pgSz w:w="11907" w:h="16840" w:code="9"/>
       <w:pgMar w:top="1440" w:right="1080" w:bottom="1440" w:left="1080" w:header="708" w:footer="708" w:gutter="0"/>
@@ -13670,6 +13656,24 @@
       <w:i/>
       <w:iCs/>
     </w:rPr>
+  </w:style>
+  <w:style w:type="paragraph" w:customStyle="1" w:styleId="paragraph">
+    <w:name w:val="paragraph"/>
+    <w:basedOn w:val="Normal"/>
+    <w:rsid w:val="00396CEA"/>
+    <w:pPr>
+      <w:spacing w:before="100" w:beforeAutospacing="1" w:after="100" w:afterAutospacing="1" w:line="240" w:lineRule="auto"/>
+      <w:jc w:val="left"/>
+    </w:pPr>
+    <w:rPr>
+      <w:szCs w:val="24"/>
+      <w:lang w:val="en-FI" w:eastAsia="en-GB"/>
+    </w:rPr>
+  </w:style>
+  <w:style w:type="character" w:customStyle="1" w:styleId="eop">
+    <w:name w:val="eop"/>
+    <w:basedOn w:val="DefaultParagraphFont"/>
+    <w:rsid w:val="00396CEA"/>
   </w:style>
 </w:styles>
 </file>

</xml_diff>

<commit_message>
EVEN MORE MORE MORE MORE!
</commit_message>
<xml_diff>
--- a/report_lab3.docx
+++ b/report_lab3.docx
@@ -2759,11 +2759,10 @@
         <w:rPr>
           <w:lang w:val="en-US"/>
         </w:rPr>
-        <w:lastRenderedPageBreak/>
         <w:drawing>
-          <wp:inline distT="0" distB="0" distL="0" distR="0" wp14:anchorId="472D738E" wp14:editId="3D35C507">
-            <wp:extent cx="5662246" cy="4113508"/>
-            <wp:effectExtent l="0" t="0" r="2540" b="1905"/>
+          <wp:inline distT="0" distB="0" distL="0" distR="0" wp14:anchorId="472D738E" wp14:editId="4DC5BB85">
+            <wp:extent cx="4017818" cy="2918865"/>
+            <wp:effectExtent l="0" t="0" r="0" b="2540"/>
             <wp:docPr id="1511906454" name="Picture 1"/>
             <wp:cNvGraphicFramePr>
               <a:graphicFrameLocks xmlns:a="http://schemas.openxmlformats.org/drawingml/2006/main" noChangeAspect="1"/>
@@ -2784,7 +2783,7 @@
                   <pic:spPr>
                     <a:xfrm>
                       <a:off x="0" y="0"/>
-                      <a:ext cx="5682375" cy="4128131"/>
+                      <a:ext cx="4147026" cy="3012732"/>
                     </a:xfrm>
                     <a:prstGeom prst="rect">
                       <a:avLst/>
@@ -3219,15 +3218,7 @@
           <w:b/>
           <w:lang w:val="en-US"/>
         </w:rPr>
-        <w:t xml:space="preserve">In a </w:t>
-      </w:r>
-      <w:r>
-        <w:rPr>
-          <w:b/>
-          <w:lang w:val="en-US"/>
-        </w:rPr>
-        <w:lastRenderedPageBreak/>
-        <w:t>longer research report paper the methods description is longer if needed.</w:t>
+        <w:t>In a longer research report paper the methods description is longer if needed.</w:t>
       </w:r>
       <w:r>
         <w:rPr>
@@ -3973,6 +3964,7 @@
         <w:rPr>
           <w:noProof/>
         </w:rPr>
+        <w:lastRenderedPageBreak/>
         <w:drawing>
           <wp:inline distT="0" distB="0" distL="0" distR="0" wp14:anchorId="04ADC335" wp14:editId="3777AD4C">
             <wp:extent cx="4381641" cy="2690397"/>
@@ -4282,125 +4274,119 @@
         <w:rPr>
           <w:lang w:val="en-US"/>
         </w:rPr>
-        <w:t xml:space="preserve">ethods section, </w:t>
-      </w:r>
-      <w:r>
-        <w:rPr>
-          <w:lang w:val="en-US"/>
+        <w:t xml:space="preserve">ethods section, or if the review is long, it can also be added as an appendix to the end of the report. </w:t>
+      </w:r>
+      <w:r>
+        <w:rPr>
+          <w:lang w:val="en-US"/>
+        </w:rPr>
+        <w:t>Other long equation derivations should also be added as a</w:t>
+      </w:r>
+      <w:r>
+        <w:rPr>
+          <w:lang w:val="en-US"/>
+        </w:rPr>
+        <w:t>n appendix.</w:t>
+      </w:r>
+    </w:p>
+    <w:p>
+      <w:pPr>
+        <w:pStyle w:val="Heading1"/>
+      </w:pPr>
+      <w:r>
+        <w:t>Results</w:t>
+      </w:r>
+    </w:p>
+    <w:p>
+      <w:pPr>
+        <w:pStyle w:val="Heading2"/>
+        <w:rPr>
+          <w:lang w:val="en-US"/>
+        </w:rPr>
+      </w:pPr>
+      <w:r>
+        <w:rPr>
+          <w:lang w:val="en-US"/>
+        </w:rPr>
+        <w:t>Frequency response</w:t>
+      </w:r>
+    </w:p>
+    <w:p>
+      <w:pPr>
+        <w:rPr>
+          <w:lang w:val="en-US"/>
+        </w:rPr>
+      </w:pPr>
+    </w:p>
+    <w:p>
+      <w:pPr>
+        <w:rPr>
+          <w:lang w:val="en-US"/>
+        </w:rPr>
+      </w:pPr>
+      <w:r>
+        <w:rPr>
+          <w:lang w:val="en-US"/>
+        </w:rPr>
+        <w:t xml:space="preserve">The small-signal frequency responses of the four LM358 operational amplifier configurations were characterized across a broad frequency spectrum from 10 Hz up to 24.83 </w:t>
+      </w:r>
+      <w:proofErr w:type="spellStart"/>
+      <w:r>
+        <w:rPr>
+          <w:lang w:val="en-US"/>
+        </w:rPr>
+        <w:t>MHz.</w:t>
+      </w:r>
+      <w:proofErr w:type="spellEnd"/>
+      <w:r>
+        <w:rPr>
+          <w:lang w:val="en-US"/>
+        </w:rPr>
+        <w:t xml:space="preserve"> Below, each circuit configuration is systematically evaluated by comparing its SPICE </w:t>
+      </w:r>
+      <w:proofErr w:type="spellStart"/>
+      <w:r>
+        <w:rPr>
+          <w:lang w:val="en-US"/>
+        </w:rPr>
+        <w:t>macromodel</w:t>
+      </w:r>
+      <w:proofErr w:type="spellEnd"/>
+      <w:r>
+        <w:rPr>
+          <w:lang w:val="en-US"/>
+        </w:rPr>
+        <w:t xml:space="preserve"> simulation with the</w:t>
+      </w:r>
+      <w:r>
+        <w:rPr>
+          <w:lang w:val="en-US"/>
+        </w:rPr>
+        <w:t xml:space="preserve"> </w:t>
+      </w:r>
+      <w:r>
+        <w:rPr>
+          <w:lang w:val="en-US"/>
+        </w:rPr>
+        <w:t>laboratory measurements.</w:t>
+      </w:r>
+    </w:p>
+    <w:p>
+      <w:pPr>
+        <w:rPr>
+          <w:lang w:val="en-US"/>
+        </w:rPr>
+      </w:pPr>
+    </w:p>
+    <w:p>
+      <w:pPr>
+        <w:keepNext/>
+      </w:pPr>
+      <w:r>
+        <w:rPr>
+          <w:noProof/>
         </w:rPr>
         <w:lastRenderedPageBreak/>
-        <w:t xml:space="preserve">or if the review is long, it can also be added as an appendix to the end of the report. </w:t>
-      </w:r>
-      <w:r>
-        <w:rPr>
-          <w:lang w:val="en-US"/>
-        </w:rPr>
-        <w:t>Other long equation derivations should also be added as a</w:t>
-      </w:r>
-      <w:r>
-        <w:rPr>
-          <w:lang w:val="en-US"/>
-        </w:rPr>
-        <w:t>n appendix.</w:t>
-      </w:r>
-    </w:p>
-    <w:p>
-      <w:pPr>
-        <w:pStyle w:val="Heading1"/>
-      </w:pPr>
-      <w:r>
-        <w:t>Results</w:t>
-      </w:r>
-    </w:p>
-    <w:p>
-      <w:pPr>
-        <w:pStyle w:val="Heading2"/>
-        <w:rPr>
-          <w:lang w:val="en-US"/>
-        </w:rPr>
-      </w:pPr>
-      <w:r>
-        <w:rPr>
-          <w:lang w:val="en-US"/>
-        </w:rPr>
-        <w:t>Frequency response</w:t>
-      </w:r>
-    </w:p>
-    <w:p>
-      <w:pPr>
-        <w:rPr>
-          <w:lang w:val="en-US"/>
-        </w:rPr>
-      </w:pPr>
-    </w:p>
-    <w:p>
-      <w:pPr>
-        <w:rPr>
-          <w:lang w:val="en-US"/>
-        </w:rPr>
-      </w:pPr>
-      <w:r>
-        <w:rPr>
-          <w:lang w:val="en-US"/>
-        </w:rPr>
-        <w:t xml:space="preserve">The small-signal frequency responses of the four LM358 operational amplifier configurations were characterized across a broad frequency spectrum from 10 Hz up to 24.83 </w:t>
-      </w:r>
-      <w:proofErr w:type="spellStart"/>
-      <w:r>
-        <w:rPr>
-          <w:lang w:val="en-US"/>
-        </w:rPr>
-        <w:t>MHz.</w:t>
-      </w:r>
-      <w:proofErr w:type="spellEnd"/>
-      <w:r>
-        <w:rPr>
-          <w:lang w:val="en-US"/>
-        </w:rPr>
-        <w:t xml:space="preserve"> Below, each circuit configuration is systematically evaluated by comparing its SPICE </w:t>
-      </w:r>
-      <w:proofErr w:type="spellStart"/>
-      <w:r>
-        <w:rPr>
-          <w:lang w:val="en-US"/>
-        </w:rPr>
-        <w:t>macromodel</w:t>
-      </w:r>
-      <w:proofErr w:type="spellEnd"/>
-      <w:r>
-        <w:rPr>
-          <w:lang w:val="en-US"/>
-        </w:rPr>
-        <w:t xml:space="preserve"> simulation with the</w:t>
-      </w:r>
-      <w:r>
-        <w:rPr>
-          <w:lang w:val="en-US"/>
-        </w:rPr>
-        <w:t xml:space="preserve"> </w:t>
-      </w:r>
-      <w:r>
-        <w:rPr>
-          <w:lang w:val="en-US"/>
-        </w:rPr>
-        <w:t>laboratory measurements.</w:t>
-      </w:r>
-    </w:p>
-    <w:p>
-      <w:pPr>
-        <w:rPr>
-          <w:lang w:val="en-US"/>
-        </w:rPr>
-      </w:pPr>
-    </w:p>
-    <w:p>
-      <w:pPr>
-        <w:keepNext/>
-      </w:pPr>
-      <w:r>
-        <w:rPr>
-          <w:noProof/>
-        </w:rPr>
         <w:drawing>
           <wp:inline distT="0" distB="0" distL="0" distR="0" wp14:anchorId="453A8EE3" wp14:editId="72887FC4">
             <wp:extent cx="6189345" cy="1899285"/>
@@ -4744,7 +4730,6 @@
         <w:rPr>
           <w:noProof/>
         </w:rPr>
-        <w:lastRenderedPageBreak/>
         <w:drawing>
           <wp:inline distT="0" distB="0" distL="0" distR="0" wp14:anchorId="799A7238" wp14:editId="351CBD77">
             <wp:extent cx="6189345" cy="1905635"/>
@@ -4870,6 +4855,7 @@
           <w:noProof/>
           <w:lang w:val="en-US"/>
         </w:rPr>
+        <w:lastRenderedPageBreak/>
         <w:drawing>
           <wp:inline distT="0" distB="0" distL="0" distR="0" wp14:anchorId="0D156E4B" wp14:editId="006CB1CA">
             <wp:extent cx="6189345" cy="1899285"/>
@@ -5108,7 +5094,6 @@
           <w:noProof/>
           <w:lang w:val="en-US"/>
         </w:rPr>
-        <w:lastRenderedPageBreak/>
         <w:drawing>
           <wp:inline distT="0" distB="0" distL="0" distR="0" wp14:anchorId="783AA0A3" wp14:editId="64CBB4E2">
             <wp:extent cx="6189345" cy="1899285"/>
@@ -5267,6 +5252,7 @@
           <w:noProof/>
           <w:lang w:val="en-US"/>
         </w:rPr>
+        <w:lastRenderedPageBreak/>
         <w:drawing>
           <wp:inline distT="0" distB="0" distL="0" distR="0" wp14:anchorId="2CCD9FFF" wp14:editId="677FC324">
             <wp:extent cx="6189345" cy="1905635"/>
@@ -6279,7 +6265,6 @@
         <w:rPr>
           <w:lang w:val="en-US"/>
         </w:rPr>
-        <w:lastRenderedPageBreak/>
         <w:t>Input Impedance</w:t>
       </w:r>
     </w:p>
@@ -6414,6 +6399,7 @@
         <w:rPr>
           <w:noProof/>
         </w:rPr>
+        <w:lastRenderedPageBreak/>
         <w:drawing>
           <wp:inline distT="0" distB="0" distL="0" distR="0" wp14:anchorId="7C282BF3" wp14:editId="0C72240A">
             <wp:extent cx="6189345" cy="1970405"/>
@@ -7098,11 +7084,13 @@
         <w:t>).</w:t>
       </w:r>
     </w:p>
+    <w:p/>
     <w:p>
       <w:r>
         <w:rPr>
           <w:noProof/>
         </w:rPr>
+        <w:lastRenderedPageBreak/>
         <w:drawing>
           <wp:inline distT="0" distB="0" distL="0" distR="0" wp14:anchorId="2BFC1939" wp14:editId="0BF68FAC">
             <wp:extent cx="6189345" cy="1959610"/>
@@ -8810,6 +8798,7 @@
     <w:p>
       <w:pPr>
         <w:pStyle w:val="Caption"/>
+        <w:ind w:left="0" w:firstLine="0"/>
         <w:rPr>
           <w:lang w:eastAsia="fi-FI"/>
         </w:rPr>
@@ -8838,84 +8827,24 @@
       <w:r>
         <w:t>.</w:t>
       </w:r>
-    </w:p>
-    <w:p>
-      <w:pPr>
-        <w:rPr>
-          <w:lang w:eastAsia="fi-FI"/>
-        </w:rPr>
-      </w:pPr>
-    </w:p>
-    <w:p>
-      <w:r>
-        <w:t>V</w:t>
-      </w:r>
-      <w:r>
-        <w:rPr>
-          <w:vertAlign w:val="subscript"/>
-        </w:rPr>
-        <w:t>O</w:t>
-      </w:r>
-      <w:r>
-        <w:rPr>
-          <w:vertAlign w:val="subscript"/>
-        </w:rPr>
-        <w:t>H</w:t>
-      </w:r>
-      <w:r>
-        <w:t xml:space="preserve"> = </w:t>
-      </w:r>
-      <w:r>
-        <w:t>8.8223</w:t>
-      </w:r>
-      <w:r>
-        <w:t>V</w:t>
-      </w:r>
       <w:r>
         <w:t xml:space="preserve"> </w:t>
       </w:r>
       <w:r>
-        <w:rPr>
-          <w:lang w:val="en-US"/>
-        </w:rPr>
-        <w:t>V</w:t>
-      </w:r>
-      <w:r>
-        <w:rPr>
-          <w:vertAlign w:val="subscript"/>
-          <w:lang w:val="en-US"/>
-        </w:rPr>
-        <w:t>O</w:t>
-      </w:r>
-      <w:r>
-        <w:rPr>
-          <w:vertAlign w:val="subscript"/>
-          <w:lang w:val="en-US"/>
-        </w:rPr>
-        <w:t xml:space="preserve">L </w:t>
-      </w:r>
-      <w:r>
-        <w:rPr>
-          <w:lang w:val="en-US"/>
-        </w:rPr>
-        <w:t>=</w:t>
-      </w:r>
-      <w:r>
-        <w:t xml:space="preserve"> </w:t>
-      </w:r>
-      <w:r>
-        <w:t>-9.914</w:t>
-      </w:r>
-      <w:r>
-        <w:t xml:space="preserve">0V </w:t>
-      </w:r>
-    </w:p>
-    <w:p>
-      <w:pPr>
-        <w:rPr>
-          <w:lang w:eastAsia="fi-FI"/>
-        </w:rPr>
-      </w:pPr>
+        <w:t xml:space="preserve">Output voltage swing of the non-inverting amplifier with a </w:t>
+      </w:r>
+      <w:r>
+        <w:t>gain of 100</w:t>
+      </w:r>
+      <w:r>
+        <w:t xml:space="preserve"> (40dB</w:t>
+      </w:r>
+      <w:r>
+        <w:t>)</w:t>
+      </w:r>
+      <w:r>
+        <w:t xml:space="preserve"> and no load connected, showing the output clipping at both extremes.</w:t>
+      </w:r>
     </w:p>
     <w:p>
       <w:pPr>
@@ -8973,10 +8902,153 @@
     <w:p>
       <w:pPr>
         <w:pStyle w:val="Caption"/>
+        <w:ind w:left="0" w:firstLine="0"/>
+      </w:pPr>
+      <w:r>
+        <w:t xml:space="preserve">Figure </w:t>
+      </w:r>
+      <w:r>
+        <w:fldChar w:fldCharType="begin"/>
+      </w:r>
+      <w:r>
+        <w:instrText xml:space="preserve"> SEQ Figure \* ARABIC </w:instrText>
+      </w:r>
+      <w:r>
+        <w:fldChar w:fldCharType="separate"/>
+      </w:r>
+      <w:r>
+        <w:rPr>
+          <w:noProof/>
+        </w:rPr>
+        <w:t>25</w:t>
+      </w:r>
+      <w:r>
+        <w:fldChar w:fldCharType="end"/>
+      </w:r>
+      <w:r>
+        <w:t>.</w:t>
+      </w:r>
+      <w:r>
+        <w:t xml:space="preserve"> </w:t>
+      </w:r>
+      <w:r>
+        <w:t xml:space="preserve">Output voltage swing of the non-inverting amplifier </w:t>
+      </w:r>
+      <w:r>
+        <w:t xml:space="preserve">with a </w:t>
+      </w:r>
+      <w:r>
+        <w:t>gain of 100</w:t>
+      </w:r>
+      <w:r>
+        <w:t xml:space="preserve"> (40dB)</w:t>
+      </w:r>
+      <w:r>
+        <w:t xml:space="preserve"> and a 100Ω load resistor connected to the output, showing the output clipping at both extremes.</w:t>
+      </w:r>
+    </w:p>
+    <w:p>
+      <w:pPr>
         <w:rPr>
           <w:lang w:val="en-US" w:eastAsia="fi-FI"/>
         </w:rPr>
       </w:pPr>
+    </w:p>
+    <w:p>
+      <w:r>
+        <w:t>The results follow a similar pattern to the simulations. With no load, the output reaches almost to the negative supply rail (V</w:t>
+      </w:r>
+      <w:r>
+        <w:rPr>
+          <w:vertAlign w:val="subscript"/>
+        </w:rPr>
+        <w:t>OL</w:t>
+      </w:r>
+      <w:r>
+        <w:t xml:space="preserve"> = −9.914V), while the positive swing stops about 1.2V short of the positive rail (V</w:t>
+      </w:r>
+      <w:r>
+        <w:rPr>
+          <w:vertAlign w:val="subscript"/>
+        </w:rPr>
+        <w:t>OH</w:t>
+      </w:r>
+      <w:r>
+        <w:t xml:space="preserve"> = 8.822V), as expected for the LM358. When a small load such as the 100Ω resistor is connected, the output current increases considerably and the swing drops sharply, to V</w:t>
+      </w:r>
+      <w:r>
+        <w:rPr>
+          <w:vertAlign w:val="subscript"/>
+        </w:rPr>
+        <w:t>OH</w:t>
+      </w:r>
+      <w:r>
+        <w:t xml:space="preserve"> = 3.613V </w:t>
+      </w:r>
+      <w:r>
+        <w:lastRenderedPageBreak/>
+        <w:t>and V</w:t>
+      </w:r>
+      <w:r>
+        <w:rPr>
+          <w:vertAlign w:val="subscript"/>
+        </w:rPr>
+        <w:t>OL</w:t>
+      </w:r>
+      <w:r>
+        <w:t xml:space="preserve"> = −2.598V. The clipped parts of the waveform in Figure 25 are therefore set by the output current limit of the op-amp rather than by the supply voltage.</w:t>
+      </w:r>
+    </w:p>
+    <w:p/>
+    <w:p>
+      <w:pPr>
+        <w:keepNext/>
+      </w:pPr>
+      <w:r>
+        <w:rPr>
+          <w:noProof/>
+        </w:rPr>
+        <w:drawing>
+          <wp:inline distT="0" distB="0" distL="0" distR="0" wp14:anchorId="251CF27A" wp14:editId="1CED4459">
+            <wp:extent cx="6189345" cy="2679065"/>
+            <wp:effectExtent l="0" t="0" r="0" b="635"/>
+            <wp:docPr id="294053538" name="Picture 21"/>
+            <wp:cNvGraphicFramePr>
+              <a:graphicFrameLocks xmlns:a="http://schemas.openxmlformats.org/drawingml/2006/main" noChangeAspect="1"/>
+            </wp:cNvGraphicFramePr>
+            <a:graphic xmlns:a="http://schemas.openxmlformats.org/drawingml/2006/main">
+              <a:graphicData uri="http://schemas.openxmlformats.org/drawingml/2006/picture">
+                <pic:pic xmlns:pic="http://schemas.openxmlformats.org/drawingml/2006/picture">
+                  <pic:nvPicPr>
+                    <pic:cNvPr id="294053538" name="Picture 294053538"/>
+                    <pic:cNvPicPr/>
+                  </pic:nvPicPr>
+                  <pic:blipFill>
+                    <a:blip r:embed="rId38"/>
+                    <a:stretch>
+                      <a:fillRect/>
+                    </a:stretch>
+                  </pic:blipFill>
+                  <pic:spPr>
+                    <a:xfrm>
+                      <a:off x="0" y="0"/>
+                      <a:ext cx="6189345" cy="2679065"/>
+                    </a:xfrm>
+                    <a:prstGeom prst="rect">
+                      <a:avLst/>
+                    </a:prstGeom>
+                  </pic:spPr>
+                </pic:pic>
+              </a:graphicData>
+            </a:graphic>
+          </wp:inline>
+        </w:drawing>
+      </w:r>
+    </w:p>
+    <w:p>
+      <w:pPr>
+        <w:pStyle w:val="Caption"/>
+      </w:pPr>
       <w:r>
         <w:t xml:space="preserve">Figure </w:t>
       </w:r>
@@ -8993,7 +9065,7 @@
         <w:rPr>
           <w:noProof/>
         </w:rPr>
-        <w:t>25</w:t>
+        <w:t>26</w:t>
       </w:r>
       <w:r>
         <w:fldChar w:fldCharType="end"/>
@@ -9002,80 +9074,334 @@
         <w:t>.</w:t>
       </w:r>
     </w:p>
-    <w:p>
-      <w:pPr>
-        <w:rPr>
-          <w:lang w:val="en-US"/>
-        </w:rPr>
-      </w:pPr>
-    </w:p>
-    <w:p>
-      <w:r>
-        <w:rPr>
-          <w:lang w:val="en-US"/>
-        </w:rPr>
+    <w:p/>
+    <w:p/>
+    <w:p>
+      <w:pPr>
+        <w:keepNext/>
+      </w:pPr>
+      <w:r>
+        <w:rPr>
+          <w:noProof/>
+        </w:rPr>
+        <w:drawing>
+          <wp:inline distT="0" distB="0" distL="0" distR="0" wp14:anchorId="76073650" wp14:editId="60AC35AD">
+            <wp:extent cx="6189345" cy="2679065"/>
+            <wp:effectExtent l="0" t="0" r="0" b="635"/>
+            <wp:docPr id="1309739737" name="Picture 22"/>
+            <wp:cNvGraphicFramePr>
+              <a:graphicFrameLocks xmlns:a="http://schemas.openxmlformats.org/drawingml/2006/main" noChangeAspect="1"/>
+            </wp:cNvGraphicFramePr>
+            <a:graphic xmlns:a="http://schemas.openxmlformats.org/drawingml/2006/main">
+              <a:graphicData uri="http://schemas.openxmlformats.org/drawingml/2006/picture">
+                <pic:pic xmlns:pic="http://schemas.openxmlformats.org/drawingml/2006/picture">
+                  <pic:nvPicPr>
+                    <pic:cNvPr id="1309739737" name="Picture 1309739737"/>
+                    <pic:cNvPicPr/>
+                  </pic:nvPicPr>
+                  <pic:blipFill>
+                    <a:blip r:embed="rId39"/>
+                    <a:stretch>
+                      <a:fillRect/>
+                    </a:stretch>
+                  </pic:blipFill>
+                  <pic:spPr>
+                    <a:xfrm>
+                      <a:off x="0" y="0"/>
+                      <a:ext cx="6189345" cy="2679065"/>
+                    </a:xfrm>
+                    <a:prstGeom prst="rect">
+                      <a:avLst/>
+                    </a:prstGeom>
+                  </pic:spPr>
+                </pic:pic>
+              </a:graphicData>
+            </a:graphic>
+          </wp:inline>
+        </w:drawing>
+      </w:r>
+    </w:p>
+    <w:p>
+      <w:pPr>
+        <w:pStyle w:val="Caption"/>
+      </w:pPr>
+      <w:r>
+        <w:t xml:space="preserve">Figure </w:t>
+      </w:r>
+      <w:r>
+        <w:fldChar w:fldCharType="begin"/>
+      </w:r>
+      <w:r>
+        <w:instrText xml:space="preserve"> SEQ Figure \* ARABIC </w:instrText>
+      </w:r>
+      <w:r>
+        <w:fldChar w:fldCharType="separate"/>
+      </w:r>
+      <w:r>
+        <w:rPr>
+          <w:noProof/>
+        </w:rPr>
+        <w:t>27</w:t>
+      </w:r>
+      <w:r>
+        <w:fldChar w:fldCharType="end"/>
+      </w:r>
+      <w:r>
+        <w:t>.</w:t>
+      </w:r>
+    </w:p>
+    <w:p/>
+    <w:p>
+      <w:r>
+        <w:t>Check this</w:t>
+      </w:r>
+      <w:r>
+        <w:t>,</w:t>
+      </w:r>
+      <w:r>
+        <w:t xml:space="preserve"> were the power rails different than +-10.</w:t>
+      </w:r>
+      <w:r>
+        <w:t xml:space="preserve"> Can you check if I am getting something wrong</w:t>
+      </w:r>
+    </w:p>
+    <w:p>
+      <w:r>
         <w:t>V</w:t>
       </w:r>
       <w:r>
         <w:rPr>
           <w:vertAlign w:val="subscript"/>
-          <w:lang w:val="en-US"/>
+        </w:rPr>
+        <w:t>OL</w:t>
+      </w:r>
+      <w:r>
+        <w:t xml:space="preserve"> = </w:t>
+      </w:r>
+      <w:r>
+        <w:t>-10.1884</w:t>
+      </w:r>
+      <w:r>
+        <w:t>V V</w:t>
+      </w:r>
+      <w:r>
+        <w:rPr>
+          <w:vertAlign w:val="subscript"/>
         </w:rPr>
         <w:t>OH</w:t>
       </w:r>
       <w:r>
-        <w:rPr>
-          <w:lang w:val="en-US"/>
-        </w:rPr>
         <w:t xml:space="preserve"> = </w:t>
       </w:r>
       <w:r>
-        <w:t>3.6129</w:t>
-      </w:r>
-      <w:r>
-        <w:t>V V</w:t>
-      </w:r>
-      <w:r>
-        <w:rPr>
-          <w:vertAlign w:val="subscript"/>
-        </w:rPr>
-        <w:t>OL</w:t>
-      </w:r>
-      <w:r>
-        <w:t xml:space="preserve"> = </w:t>
-      </w:r>
-      <w:r>
-        <w:t>-2.5982</w:t>
+        <w:t>8.6402</w:t>
       </w:r>
       <w:r>
         <w:t>V</w:t>
       </w:r>
     </w:p>
     <w:p>
-      <w:pPr>
-        <w:rPr>
-          <w:lang w:val="en-US"/>
-        </w:rPr>
-      </w:pPr>
-    </w:p>
-    <w:p>
-      <w:pPr>
-        <w:rPr>
-          <w:lang w:val="en-US"/>
-        </w:rPr>
-      </w:pPr>
-    </w:p>
-    <w:p>
-      <w:pPr>
-        <w:rPr>
-          <w:lang w:val="en-US"/>
-        </w:rPr>
-      </w:pPr>
-      <w:r>
-        <w:rPr>
-          <w:lang w:val="en-US"/>
+      <w:r>
+        <w:t>The VOL is less htan the negative ppower rail</w:t>
+      </w:r>
+    </w:p>
+    <w:p>
+      <w:pPr>
+        <w:pStyle w:val="Heading2"/>
+      </w:pPr>
+      <w:r>
+        <w:t>Crossover distortion</w:t>
+      </w:r>
+    </w:p>
+    <w:p/>
+    <w:p>
+      <w:pPr>
+        <w:keepNext/>
+      </w:pPr>
+      <w:r>
+        <w:rPr>
+          <w:noProof/>
         </w:rPr>
         <w:lastRenderedPageBreak/>
+        <w:drawing>
+          <wp:inline distT="0" distB="0" distL="0" distR="0" wp14:anchorId="440F53BE" wp14:editId="6D3ECDC8">
+            <wp:extent cx="6189345" cy="3984625"/>
+            <wp:effectExtent l="0" t="0" r="0" b="3175"/>
+            <wp:docPr id="906249422" name="Picture 23"/>
+            <wp:cNvGraphicFramePr>
+              <a:graphicFrameLocks xmlns:a="http://schemas.openxmlformats.org/drawingml/2006/main" noChangeAspect="1"/>
+            </wp:cNvGraphicFramePr>
+            <a:graphic xmlns:a="http://schemas.openxmlformats.org/drawingml/2006/main">
+              <a:graphicData uri="http://schemas.openxmlformats.org/drawingml/2006/picture">
+                <pic:pic xmlns:pic="http://schemas.openxmlformats.org/drawingml/2006/picture">
+                  <pic:nvPicPr>
+                    <pic:cNvPr id="906249422" name="Picture 906249422"/>
+                    <pic:cNvPicPr/>
+                  </pic:nvPicPr>
+                  <pic:blipFill>
+                    <a:blip r:embed="rId40">
+                      <a:extLst>
+                        <a:ext uri="{28A0092B-C50C-407E-A947-70E740481C1C}">
+                          <a14:useLocalDpi xmlns:a14="http://schemas.microsoft.com/office/drawing/2010/main" val="0"/>
+                        </a:ext>
+                      </a:extLst>
+                    </a:blip>
+                    <a:stretch>
+                      <a:fillRect/>
+                    </a:stretch>
+                  </pic:blipFill>
+                  <pic:spPr>
+                    <a:xfrm>
+                      <a:off x="0" y="0"/>
+                      <a:ext cx="6189345" cy="3984625"/>
+                    </a:xfrm>
+                    <a:prstGeom prst="rect">
+                      <a:avLst/>
+                    </a:prstGeom>
+                  </pic:spPr>
+                </pic:pic>
+              </a:graphicData>
+            </a:graphic>
+          </wp:inline>
+        </w:drawing>
+      </w:r>
+    </w:p>
+    <w:p>
+      <w:pPr>
+        <w:pStyle w:val="Caption"/>
+      </w:pPr>
+      <w:r>
+        <w:t xml:space="preserve">Figure </w:t>
+      </w:r>
+      <w:r>
+        <w:fldChar w:fldCharType="begin"/>
+      </w:r>
+      <w:r>
+        <w:instrText xml:space="preserve"> SEQ Figure \* ARABIC </w:instrText>
+      </w:r>
+      <w:r>
+        <w:fldChar w:fldCharType="separate"/>
+      </w:r>
+      <w:r>
+        <w:rPr>
+          <w:noProof/>
+        </w:rPr>
+        <w:t>28</w:t>
+      </w:r>
+      <w:r>
+        <w:fldChar w:fldCharType="end"/>
+      </w:r>
+      <w:r>
+        <w:t>.</w:t>
+      </w:r>
+    </w:p>
+    <w:p/>
+    <w:p>
+      <w:pPr>
+        <w:keepNext/>
+      </w:pPr>
+      <w:r>
+        <w:rPr>
+          <w:noProof/>
+        </w:rPr>
+        <w:drawing>
+          <wp:inline distT="0" distB="0" distL="0" distR="0" wp14:anchorId="4F499D70" wp14:editId="58369D7E">
+            <wp:extent cx="6189345" cy="3984625"/>
+            <wp:effectExtent l="0" t="0" r="0" b="3175"/>
+            <wp:docPr id="1045293125" name="Picture 24"/>
+            <wp:cNvGraphicFramePr>
+              <a:graphicFrameLocks xmlns:a="http://schemas.openxmlformats.org/drawingml/2006/main" noChangeAspect="1"/>
+            </wp:cNvGraphicFramePr>
+            <a:graphic xmlns:a="http://schemas.openxmlformats.org/drawingml/2006/main">
+              <a:graphicData uri="http://schemas.openxmlformats.org/drawingml/2006/picture">
+                <pic:pic xmlns:pic="http://schemas.openxmlformats.org/drawingml/2006/picture">
+                  <pic:nvPicPr>
+                    <pic:cNvPr id="1045293125" name="Picture 1045293125"/>
+                    <pic:cNvPicPr/>
+                  </pic:nvPicPr>
+                  <pic:blipFill>
+                    <a:blip r:embed="rId41">
+                      <a:extLst>
+                        <a:ext uri="{28A0092B-C50C-407E-A947-70E740481C1C}">
+                          <a14:useLocalDpi xmlns:a14="http://schemas.microsoft.com/office/drawing/2010/main" val="0"/>
+                        </a:ext>
+                      </a:extLst>
+                    </a:blip>
+                    <a:stretch>
+                      <a:fillRect/>
+                    </a:stretch>
+                  </pic:blipFill>
+                  <pic:spPr>
+                    <a:xfrm>
+                      <a:off x="0" y="0"/>
+                      <a:ext cx="6189345" cy="3984625"/>
+                    </a:xfrm>
+                    <a:prstGeom prst="rect">
+                      <a:avLst/>
+                    </a:prstGeom>
+                  </pic:spPr>
+                </pic:pic>
+              </a:graphicData>
+            </a:graphic>
+          </wp:inline>
+        </w:drawing>
+      </w:r>
+    </w:p>
+    <w:p>
+      <w:pPr>
+        <w:pStyle w:val="Caption"/>
+      </w:pPr>
+      <w:r>
+        <w:t xml:space="preserve">Figure </w:t>
+      </w:r>
+      <w:r>
+        <w:fldChar w:fldCharType="begin"/>
+      </w:r>
+      <w:r>
+        <w:instrText xml:space="preserve"> SEQ Figure \* ARABIC </w:instrText>
+      </w:r>
+      <w:r>
+        <w:fldChar w:fldCharType="separate"/>
+      </w:r>
+      <w:r>
+        <w:rPr>
+          <w:noProof/>
+        </w:rPr>
+        <w:t>29</w:t>
+      </w:r>
+      <w:r>
+        <w:fldChar w:fldCharType="end"/>
+      </w:r>
+      <w:r>
+        <w:t>.</w:t>
+      </w:r>
+    </w:p>
+    <w:p/>
+    <w:p/>
+    <w:p>
+      <w:pPr>
+        <w:rPr>
+          <w:lang w:val="en-US"/>
+        </w:rPr>
+      </w:pPr>
+    </w:p>
+    <w:p>
+      <w:pPr>
+        <w:rPr>
+          <w:lang w:val="en-US"/>
+        </w:rPr>
+      </w:pPr>
+    </w:p>
+    <w:p>
+      <w:pPr>
+        <w:rPr>
+          <w:lang w:val="en-US"/>
+        </w:rPr>
+      </w:pPr>
+      <w:r>
+        <w:rPr>
+          <w:lang w:val="en-US"/>
+        </w:rPr>
         <w:t>The results section presents t</w:t>
       </w:r>
       <w:r>
@@ -11236,7 +11562,7 @@
                           </pic:cNvPicPr>
                         </pic:nvPicPr>
                         <pic:blipFill>
-                          <a:blip r:embed="rId38"/>
+                          <a:blip r:embed="rId42"/>
                           <a:stretch>
                             <a:fillRect/>
                           </a:stretch>
@@ -11265,7 +11591,7 @@
                           </pic:cNvPicPr>
                         </pic:nvPicPr>
                         <pic:blipFill>
-                          <a:blip r:embed="rId39"/>
+                          <a:blip r:embed="rId43"/>
                           <a:stretch>
                             <a:fillRect/>
                           </a:stretch>
@@ -11294,7 +11620,7 @@
                           </pic:cNvPicPr>
                         </pic:nvPicPr>
                         <pic:blipFill>
-                          <a:blip r:embed="rId40"/>
+                          <a:blip r:embed="rId44"/>
                           <a:stretch>
                             <a:fillRect/>
                           </a:stretch>
@@ -11323,7 +11649,7 @@
                           </pic:cNvPicPr>
                         </pic:nvPicPr>
                         <pic:blipFill>
-                          <a:blip r:embed="rId41"/>
+                          <a:blip r:embed="rId45"/>
                           <a:stretch>
                             <a:fillRect/>
                           </a:stretch>
@@ -11352,7 +11678,7 @@
                           </pic:cNvPicPr>
                         </pic:nvPicPr>
                         <pic:blipFill>
-                          <a:blip r:embed="rId42"/>
+                          <a:blip r:embed="rId46"/>
                           <a:stretch>
                             <a:fillRect/>
                           </a:stretch>
@@ -11402,19 +11728,19 @@
                   <o:lock v:ext="edit" aspectratio="t"/>
                 </v:shapetype>
                 <v:shape id="Picture 2" o:spid="_x0000_s1027" type="#_x0000_t75" style="position:absolute;width:22384;height:19252;visibility:visible;mso-wrap-style:square" o:gfxdata="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">
-                  <v:imagedata r:id="rId43" o:title=""/>
+                  <v:imagedata r:id="rId47" o:title=""/>
                 </v:shape>
                 <v:shape id="Picture 3" o:spid="_x0000_s1028" type="#_x0000_t75" style="position:absolute;left:23399;width:22385;height:19252;visibility:visible;mso-wrap-style:square" o:gfxdata="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">
-                  <v:imagedata r:id="rId44" o:title=""/>
+                  <v:imagedata r:id="rId48" o:title=""/>
                 </v:shape>
                 <v:shape id="Picture 4" o:spid="_x0000_s1029" type="#_x0000_t75" style="position:absolute;top:18071;width:22384;height:18417;visibility:visible;mso-wrap-style:square" o:gfxdata="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">
-                  <v:imagedata r:id="rId45" o:title=""/>
+                  <v:imagedata r:id="rId49" o:title=""/>
                 </v:shape>
                 <v:shape id="Picture 5" o:spid="_x0000_s1030" type="#_x0000_t75" style="position:absolute;left:22384;top:17653;width:23400;height:19253;visibility:visible;mso-wrap-style:square" o:gfxdata="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">
-                  <v:imagedata r:id="rId46" o:title=""/>
+                  <v:imagedata r:id="rId50" o:title=""/>
                 </v:shape>
                 <v:shape id="Picture 6" o:spid="_x0000_s1031" type="#_x0000_t75" style="position:absolute;left:11688;top:36756;width:22396;height:3494;visibility:visible;mso-wrap-style:square" o:gfxdata="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">
-                  <v:imagedata r:id="rId47" o:title=""/>
+                  <v:imagedata r:id="rId51" o:title=""/>
                 </v:shape>
                 <w10:wrap type="topAndBottom" anchory="page"/>
               </v:group>
@@ -12139,7 +12465,7 @@
         </w:rPr>
         <w:t xml:space="preserve"> Available </w:t>
       </w:r>
-      <w:hyperlink r:id="rId48" w:history="1">
+      <w:hyperlink r:id="rId52" w:history="1">
         <w:r>
           <w:rPr>
             <w:rStyle w:val="Hyperlink"/>
@@ -12233,7 +12559,7 @@
         </w:rPr>
         <w:t xml:space="preserve">. Dallas, TX: Texas Instruments. Available at: </w:t>
       </w:r>
-      <w:hyperlink r:id="rId49" w:history="1">
+      <w:hyperlink r:id="rId53" w:history="1">
         <w:r>
           <w:rPr>
             <w:rStyle w:val="Hyperlink"/>
@@ -12321,7 +12647,7 @@
       <w:r>
         <w:t xml:space="preserve">Available at: </w:t>
       </w:r>
-      <w:hyperlink r:id="rId50" w:history="1">
+      <w:hyperlink r:id="rId54" w:history="1">
         <w:r>
           <w:rPr>
             <w:rStyle w:val="Hyperlink"/>
@@ -12431,7 +12757,7 @@
       <w:r>
         <w:t xml:space="preserve">Available at: </w:t>
       </w:r>
-      <w:hyperlink r:id="rId51" w:tgtFrame="_blank" w:history="1">
+      <w:hyperlink r:id="rId55" w:tgtFrame="_blank" w:history="1">
         <w:r>
           <w:rPr>
             <w:rStyle w:val="Hyperlink"/>
@@ -12665,10 +12991,10 @@
       </w:pPr>
     </w:p>
     <w:sectPr>
-      <w:headerReference w:type="default" r:id="rId52"/>
-      <w:footerReference w:type="default" r:id="rId53"/>
-      <w:headerReference w:type="first" r:id="rId54"/>
-      <w:footerReference w:type="first" r:id="rId55"/>
+      <w:headerReference w:type="default" r:id="rId56"/>
+      <w:footerReference w:type="default" r:id="rId57"/>
+      <w:headerReference w:type="first" r:id="rId58"/>
+      <w:footerReference w:type="first" r:id="rId59"/>
       <w:type w:val="continuous"/>
       <w:pgSz w:w="11907" w:h="16840" w:code="9"/>
       <w:pgMar w:top="1440" w:right="1080" w:bottom="1440" w:left="1080" w:header="708" w:footer="708" w:gutter="0"/>

</xml_diff>

<commit_message>
EVEN MORE MORE MORE MORE MORE!
</commit_message>
<xml_diff>
--- a/report_lab3.docx
+++ b/report_lab3.docx
@@ -1584,141 +1584,144 @@
       </w:pPr>
       <m:oMathPara>
         <m:oMath>
+          <m:sSub>
+            <m:sSubPr>
+              <m:ctrlPr>
+                <w:rPr>
+                  <w:rFonts w:ascii="Cambria Math" w:hAnsi="Cambria Math"/>
+                </w:rPr>
+              </m:ctrlPr>
+            </m:sSubPr>
+            <m:e>
+              <m:r>
+                <w:rPr>
+                  <w:rFonts w:ascii="Cambria Math" w:hAnsi="Cambria Math"/>
+                </w:rPr>
+                <m:t>Z</m:t>
+              </m:r>
+            </m:e>
+            <m:sub>
+              <m:r>
+                <w:rPr>
+                  <w:rFonts w:ascii="Cambria Math" w:hAnsi="Cambria Math"/>
+                </w:rPr>
+                <m:t>in</m:t>
+              </m:r>
+            </m:sub>
+          </m:sSub>
           <m:r>
             <w:rPr>
               <w:rFonts w:ascii="Cambria Math" w:hAnsi="Cambria Math"/>
-              <w:lang w:val="en-US"/>
-            </w:rPr>
-            <m:t>Z</m:t>
-          </m:r>
-          <m:r>
-            <w:rPr>
-              <w:rFonts w:ascii="Cambria Math" w:hAnsi="Cambria Math"/>
-              <w:lang w:val="en-US"/>
-            </w:rPr>
-            <m:t>_</m:t>
-          </m:r>
-          <m:r>
-            <w:rPr>
-              <w:rFonts w:ascii="Cambria Math" w:hAnsi="Cambria Math"/>
-              <w:lang w:val="en-US"/>
-            </w:rPr>
-            <m:t>in</m:t>
-          </m:r>
-          <m:r>
-            <w:rPr>
-              <w:rFonts w:ascii="Cambria Math" w:hAnsi="Cambria Math"/>
-              <w:lang w:val="en-US"/>
             </w:rPr>
             <m:t>=</m:t>
           </m:r>
-          <m:r>
-            <w:rPr>
-              <w:rFonts w:ascii="Cambria Math" w:hAnsi="Cambria Math"/>
-              <w:lang w:val="en-US"/>
-            </w:rPr>
-            <m:t>R</m:t>
-          </m:r>
-          <m:r>
-            <w:rPr>
-              <w:rFonts w:ascii="Cambria Math" w:hAnsi="Cambria Math"/>
-              <w:lang w:val="en-US"/>
-            </w:rPr>
-            <m:t>_</m:t>
-          </m:r>
-          <m:r>
-            <w:rPr>
-              <w:rFonts w:ascii="Cambria Math" w:hAnsi="Cambria Math"/>
-              <w:lang w:val="en-US"/>
-            </w:rPr>
-            <m:t>series</m:t>
-          </m:r>
-          <m:r>
-            <w:rPr>
-              <w:rFonts w:ascii="Cambria Math" w:hAnsi="Cambria Math"/>
-              <w:lang w:val="en-US"/>
-            </w:rPr>
-            <m:t xml:space="preserve"> (</m:t>
-          </m:r>
-          <m:r>
-            <w:rPr>
-              <w:rFonts w:ascii="Cambria Math" w:hAnsi="Cambria Math"/>
-              <w:lang w:val="en-US"/>
-            </w:rPr>
-            <m:t>V</m:t>
-          </m:r>
-          <m:r>
-            <w:rPr>
-              <w:rFonts w:ascii="Cambria Math" w:hAnsi="Cambria Math"/>
-              <w:lang w:val="en-US"/>
-            </w:rPr>
-            <m:t>_</m:t>
-          </m:r>
-          <m:r>
-            <w:rPr>
-              <w:rFonts w:ascii="Cambria Math" w:hAnsi="Cambria Math"/>
-              <w:lang w:val="en-US"/>
-            </w:rPr>
-            <m:t>in</m:t>
-          </m:r>
-          <m:r>
-            <w:rPr>
-              <w:rFonts w:ascii="Cambria Math" w:hAnsi="Cambria Math"/>
-              <w:lang w:val="en-US"/>
-            </w:rPr>
-            <m:t>/</m:t>
-          </m:r>
-          <m:r>
-            <w:rPr>
-              <w:rFonts w:ascii="Cambria Math" w:hAnsi="Cambria Math"/>
-              <w:lang w:val="en-US"/>
-            </w:rPr>
-            <m:t>V</m:t>
-          </m:r>
-          <m:r>
-            <w:rPr>
-              <w:rFonts w:ascii="Cambria Math" w:hAnsi="Cambria Math"/>
-              <w:lang w:val="en-US"/>
-            </w:rPr>
-            <m:t>_</m:t>
-          </m:r>
-          <m:r>
-            <w:rPr>
-              <w:rFonts w:ascii="Cambria Math" w:hAnsi="Cambria Math"/>
-              <w:lang w:val="en-US"/>
-            </w:rPr>
-            <m:t>R</m:t>
-          </m:r>
-          <m:r>
-            <w:rPr>
-              <w:rFonts w:ascii="Cambria Math" w:hAnsi="Cambria Math"/>
-              <w:lang w:val="en-US"/>
-            </w:rPr>
-            <m:t xml:space="preserve"> </m:t>
-          </m:r>
-          <m:r>
-            <w:rPr>
-              <w:rFonts w:ascii="Cambria Math" w:hAnsi="Cambria Math"/>
-              <w:lang w:val="en-US"/>
-            </w:rPr>
-            <m:t>-1</m:t>
-          </m:r>
-          <m:r>
-            <w:rPr>
-              <w:rFonts w:ascii="Cambria Math" w:hAnsi="Cambria Math"/>
-              <w:lang w:val="en-US"/>
-            </w:rPr>
-            <m:t>)</m:t>
-          </m:r>
+          <m:sSub>
+            <m:sSubPr>
+              <m:ctrlPr>
+                <w:rPr>
+                  <w:rFonts w:ascii="Cambria Math" w:hAnsi="Cambria Math"/>
+                </w:rPr>
+              </m:ctrlPr>
+            </m:sSubPr>
+            <m:e>
+              <m:r>
+                <w:rPr>
+                  <w:rFonts w:ascii="Cambria Math" w:hAnsi="Cambria Math"/>
+                </w:rPr>
+                <m:t>R</m:t>
+              </m:r>
+            </m:e>
+            <m:sub>
+              <m:r>
+                <w:rPr>
+                  <w:rFonts w:ascii="Cambria Math" w:hAnsi="Cambria Math"/>
+                </w:rPr>
+                <m:t>s</m:t>
+              </m:r>
+            </m:sub>
+          </m:sSub>
+          <m:d>
+            <m:dPr>
+              <m:ctrlPr>
+                <w:rPr>
+                  <w:rFonts w:ascii="Cambria Math" w:hAnsi="Cambria Math"/>
+                </w:rPr>
+              </m:ctrlPr>
+            </m:dPr>
+            <m:e>
+              <m:f>
+                <m:fPr>
+                  <m:ctrlPr>
+                    <w:rPr>
+                      <w:rFonts w:ascii="Cambria Math" w:hAnsi="Cambria Math"/>
+                    </w:rPr>
+                  </m:ctrlPr>
+                </m:fPr>
+                <m:num>
+                  <m:sSub>
+                    <m:sSubPr>
+                      <m:ctrlPr>
+                        <w:rPr>
+                          <w:rFonts w:ascii="Cambria Math" w:hAnsi="Cambria Math"/>
+                        </w:rPr>
+                      </m:ctrlPr>
+                    </m:sSubPr>
+                    <m:e>
+                      <m:r>
+                        <w:rPr>
+                          <w:rFonts w:ascii="Cambria Math" w:hAnsi="Cambria Math"/>
+                        </w:rPr>
+                        <m:t>V</m:t>
+                      </m:r>
+                    </m:e>
+                    <m:sub>
+                      <m:r>
+                        <w:rPr>
+                          <w:rFonts w:ascii="Cambria Math" w:hAnsi="Cambria Math"/>
+                        </w:rPr>
+                        <m:t>in</m:t>
+                      </m:r>
+                    </m:sub>
+                  </m:sSub>
+                </m:num>
+                <m:den>
+                  <m:sSub>
+                    <m:sSubPr>
+                      <m:ctrlPr>
+                        <w:rPr>
+                          <w:rFonts w:ascii="Cambria Math" w:hAnsi="Cambria Math"/>
+                        </w:rPr>
+                      </m:ctrlPr>
+                    </m:sSubPr>
+                    <m:e>
+                      <m:r>
+                        <w:rPr>
+                          <w:rFonts w:ascii="Cambria Math" w:hAnsi="Cambria Math"/>
+                        </w:rPr>
+                        <m:t>V</m:t>
+                      </m:r>
+                    </m:e>
+                    <m:sub>
+                      <m:r>
+                        <w:rPr>
+                          <w:rFonts w:ascii="Cambria Math" w:hAnsi="Cambria Math"/>
+                        </w:rPr>
+                        <m:t>R</m:t>
+                      </m:r>
+                    </m:sub>
+                  </m:sSub>
+                </m:den>
+              </m:f>
+              <m:r>
+                <w:rPr>
+                  <w:rFonts w:ascii="Cambria Math" w:hAnsi="Cambria Math"/>
+                </w:rPr>
+                <m:t>-1</m:t>
+              </m:r>
+            </m:e>
+          </m:d>
         </m:oMath>
       </m:oMathPara>
-    </w:p>
-    <w:p>
-      <w:pPr>
-        <w:rPr>
-          <w:lang w:val="en-US"/>
-        </w:rPr>
-      </w:pPr>
     </w:p>
     <w:p>
       <w:pPr>
@@ -3164,6 +3167,8 @@
       </w:r>
     </w:p>
     <w:p/>
+    <w:p/>
+    <w:p/>
     <w:p>
       <w:pPr>
         <w:rPr>
@@ -4328,55 +4333,26 @@
         <w:rPr>
           <w:lang w:val="en-US"/>
         </w:rPr>
-        <w:t xml:space="preserve">The small-signal frequency responses of the four LM358 operational amplifier configurations were characterized across a broad frequency spectrum from 10 Hz up to 24.83 </w:t>
-      </w:r>
-      <w:proofErr w:type="spellStart"/>
-      <w:r>
-        <w:rPr>
-          <w:lang w:val="en-US"/>
-        </w:rPr>
-        <w:t>MHz.</w:t>
-      </w:r>
-      <w:proofErr w:type="spellEnd"/>
-      <w:r>
-        <w:rPr>
-          <w:lang w:val="en-US"/>
-        </w:rPr>
-        <w:t xml:space="preserve"> Below, each circuit configuration is systematically evaluated by comparing its SPICE </w:t>
-      </w:r>
-      <w:proofErr w:type="spellStart"/>
-      <w:r>
-        <w:rPr>
-          <w:lang w:val="en-US"/>
-        </w:rPr>
-        <w:t>macromodel</w:t>
-      </w:r>
-      <w:proofErr w:type="spellEnd"/>
-      <w:r>
-        <w:rPr>
-          <w:lang w:val="en-US"/>
-        </w:rPr>
-        <w:t xml:space="preserve"> simulation with the</w:t>
-      </w:r>
-      <w:r>
-        <w:rPr>
-          <w:lang w:val="en-US"/>
-        </w:rPr>
+        <w:t xml:space="preserve">The small-signal frequency responses of the four LM358 operational amplifier configurations were characterized across a broad frequency spectrum from 10Hz up to 24.83MHz. </w:t>
+      </w:r>
+      <w:r>
+        <w:t>Each circuit</w:t>
+      </w:r>
+      <w:r>
         <w:t xml:space="preserve"> </w:t>
       </w:r>
       <w:r>
-        <w:rPr>
-          <w:lang w:val="en-US"/>
-        </w:rPr>
-        <w:t>laboratory measurements.</w:t>
-      </w:r>
-    </w:p>
-    <w:p>
-      <w:pPr>
-        <w:rPr>
-          <w:lang w:val="en-US"/>
-        </w:rPr>
-      </w:pPr>
+        <w:t>configuration is subsequently evaluated by benchmarking its SPICE macromodel simulation against</w:t>
+      </w:r>
+      <w:r>
+        <w:t xml:space="preserve"> </w:t>
+      </w:r>
+      <w:r>
+        <w:t>laboratory data</w:t>
+      </w:r>
+      <w:r>
+        <w:t>.</w:t>
+      </w:r>
     </w:p>
     <w:p>
       <w:pPr>
@@ -4476,7 +4452,7 @@
         <w:rPr>
           <w:lang w:val="en-US"/>
         </w:rPr>
-        <w:t xml:space="preserve">Simulated small-signal frequency response of the LM358 voltage follower (Av = 1, 0 dB) in </w:t>
+        <w:t xml:space="preserve">Simulated small-signal frequency response of the LM358 voltage follower (Av = 1, 0dB) in </w:t>
       </w:r>
       <w:proofErr w:type="spellStart"/>
       <w:r>
@@ -4490,21 +4466,7 @@
         <w:rPr>
           <w:lang w:val="en-US"/>
         </w:rPr>
-        <w:t xml:space="preserve"> from 10 Hz to 10 </w:t>
-      </w:r>
-      <w:proofErr w:type="spellStart"/>
-      <w:r>
-        <w:rPr>
-          <w:lang w:val="en-US"/>
-        </w:rPr>
-        <w:t>MHz.</w:t>
-      </w:r>
-      <w:proofErr w:type="spellEnd"/>
-      <w:r>
-        <w:rPr>
-          <w:lang w:val="en-US"/>
-        </w:rPr>
-        <w:t xml:space="preserve"> The simulation exhibits a flat 0 dB passband with mild gain peaking near 800 kHz arising from phase margin degradation</w:t>
+        <w:t xml:space="preserve"> from 10Hz to 10MHz. The simulation exhibits a flat 0 dB passband with mild gain peaking near 800kHz arising from phase margin degradation</w:t>
       </w:r>
       <w:r>
         <w:rPr>
@@ -4516,7 +4478,7 @@
         <w:rPr>
           <w:lang w:val="en-US"/>
         </w:rPr>
-        <w:t>reaching a -3 dB cutoff frequency at 1.</w:t>
+        <w:t>reaching a -3dB cutoff frequency at 1.</w:t>
       </w:r>
       <w:r>
         <w:rPr>
@@ -4528,41 +4490,31 @@
         <w:rPr>
           <w:lang w:val="en-US"/>
         </w:rPr>
-        <w:t xml:space="preserve">5 </w:t>
-      </w:r>
-      <w:proofErr w:type="spellStart"/>
-      <w:r>
-        <w:rPr>
-          <w:lang w:val="en-US"/>
-        </w:rPr>
-        <w:t>MHz.</w:t>
-      </w:r>
-      <w:proofErr w:type="spellEnd"/>
-      <w:r>
-        <w:rPr>
-          <w:lang w:val="en-US"/>
-        </w:rPr>
-        <w:t xml:space="preserve"> Phase remains near 0° at low </w:t>
-      </w:r>
-      <w:proofErr w:type="gramStart"/>
-      <w:r>
-        <w:rPr>
-          <w:lang w:val="en-US"/>
-        </w:rPr>
-        <w:t xml:space="preserve">frequencies, </w:t>
-      </w:r>
-      <w:r>
-        <w:rPr>
-          <w:lang w:val="en-US"/>
-        </w:rPr>
-        <w:t>and</w:t>
-      </w:r>
-      <w:proofErr w:type="gramEnd"/>
-      <w:r>
-        <w:rPr>
-          <w:lang w:val="en-US"/>
-        </w:rPr>
-        <w:t xml:space="preserve"> start </w:t>
+        <w:t xml:space="preserve">5MHz. Phase remains near 0° at low </w:t>
+      </w:r>
+      <w:r>
+        <w:rPr>
+          <w:lang w:val="en-US"/>
+        </w:rPr>
+        <w:t>frequencies and</w:t>
+      </w:r>
+      <w:r>
+        <w:rPr>
+          <w:lang w:val="en-US"/>
+        </w:rPr>
+        <w:t xml:space="preserve"> </w:t>
+      </w:r>
+      <w:r>
+        <w:rPr>
+          <w:lang w:val="en-US"/>
+        </w:rPr>
+        <w:t>starts</w:t>
+      </w:r>
+      <w:r>
+        <w:rPr>
+          <w:lang w:val="en-US"/>
+        </w:rPr>
+        <w:t xml:space="preserve"> </w:t>
       </w:r>
       <w:r>
         <w:rPr>
@@ -4580,7 +4532,7 @@
         <w:rPr>
           <w:lang w:val="en-US"/>
         </w:rPr>
-        <w:t>at 700 kHz</w:t>
+        <w:t>at 700kHz</w:t>
       </w:r>
       <w:r>
         <w:rPr>
@@ -4694,7 +4646,7 @@
         <w:rPr>
           <w:lang w:val="en-US"/>
         </w:rPr>
-        <w:t>(Av = 1, 0 dB)</w:t>
+        <w:t>(Av = 1, 0dB)</w:t>
       </w:r>
       <w:r>
         <w:rPr>
@@ -4706,7 +4658,19 @@
         <w:rPr>
           <w:lang w:val="en-US"/>
         </w:rPr>
-        <w:t>from 100 Hz to 24.83 MHz obtained in the laboratory. The low-frequency passband confirms unity gain (0.0 dB) up to 50 kHz, with the experimental -3 dB cutoff occurring at approximately 70 kHz. A standard -20 dB/decade roll-off is maintained up to 2 MHz (-32 dB</w:t>
+        <w:t xml:space="preserve">from 100Hz to 24.83MHz obtained in the laboratory. The low-frequency passband confirms unity gain (0dB) up to 50kHz, with the experimental -3dB cutoff occurring at approximately </w:t>
+      </w:r>
+      <w:r>
+        <w:rPr>
+          <w:lang w:val="en-US"/>
+        </w:rPr>
+        <w:t>84.14</w:t>
+      </w:r>
+      <w:r>
+        <w:rPr>
+          <w:lang w:val="en-US"/>
+        </w:rPr>
+        <w:t>kHz. A standard -20dB/decade roll-off is maintained up to 2 MHz (-32 dB</w:t>
       </w:r>
       <w:r>
         <w:rPr>
@@ -4770,6 +4734,7 @@
     <w:p>
       <w:pPr>
         <w:pStyle w:val="Caption"/>
+        <w:ind w:left="0" w:firstLine="0"/>
         <w:rPr>
           <w:lang w:val="en-US"/>
         </w:rPr>
@@ -4806,37 +4771,28 @@
         <w:rPr>
           <w:lang w:val="en-US"/>
         </w:rPr>
-        <w:t xml:space="preserve">. The simulated frequency response of </w:t>
-      </w:r>
-      <w:r>
-        <w:rPr>
-          <w:lang w:val="en-US"/>
-        </w:rPr>
-        <w:t xml:space="preserve">a </w:t>
-      </w:r>
-      <w:r>
-        <w:rPr>
-          <w:lang w:val="en-US"/>
-        </w:rPr>
-        <w:t xml:space="preserve">LM358 inverting operational amplifier </w:t>
-      </w:r>
-      <w:r>
-        <w:rPr>
-          <w:lang w:val="en-US"/>
-        </w:rPr>
-        <w:t xml:space="preserve">with unity </w:t>
-      </w:r>
-      <w:r>
-        <w:rPr>
-          <w:lang w:val="en-US"/>
-        </w:rPr>
-        <w:t>gain</w:t>
-      </w:r>
-      <w:r>
-        <w:rPr>
-          <w:lang w:val="en-US"/>
-        </w:rPr>
-        <w:t xml:space="preserve"> from 10Hz to 10MHz.</w:t>
+        <w:t xml:space="preserve">. </w:t>
+      </w:r>
+      <w:r>
+        <w:t xml:space="preserve">Simulated small-signal frequency response of the LM358 inverting operational amplifier with unity gain (Av = -1, 0dB) in LTSpice from 10 Hz to 10 MHz. The passband gain is 0dB with an initial phase shift of 180°. </w:t>
+      </w:r>
+      <w:r>
+        <w:t>T</w:t>
+      </w:r>
+      <w:r>
+        <w:t xml:space="preserve">he -3dB bandwidth is approximately </w:t>
+      </w:r>
+      <w:r>
+        <w:rPr>
+          <w:lang w:val="en-US"/>
+        </w:rPr>
+        <w:t>675</w:t>
+      </w:r>
+      <w:r>
+        <w:t>kHz. High-frequency attenuation settles near -16.5dB</w:t>
+      </w:r>
+      <w:r>
+        <w:t>.</w:t>
       </w:r>
     </w:p>
     <w:p>
@@ -4896,6 +4852,7 @@
     <w:p>
       <w:pPr>
         <w:pStyle w:val="Caption"/>
+        <w:ind w:left="0" w:firstLine="0"/>
         <w:rPr>
           <w:lang w:val="en-US"/>
         </w:rPr>
@@ -4932,13 +4889,55 @@
         <w:rPr>
           <w:lang w:val="en-US"/>
         </w:rPr>
-        <w:t>. The measured frequency response of a LM358 inverting amplifier with unity gain from</w:t>
-      </w:r>
-      <w:r>
-        <w:rPr>
-          <w:lang w:val="en-US"/>
-        </w:rPr>
-        <w:t xml:space="preserve"> 100Hz to 24.83MHz.</w:t>
+        <w:t xml:space="preserve">. </w:t>
+      </w:r>
+      <w:r>
+        <w:t>Measured small-signal frequency response of the LM358 inverting amplifier with unity gain (Av = -1, 0dB)</w:t>
+      </w:r>
+      <w:r>
+        <w:t xml:space="preserve"> </w:t>
+      </w:r>
+      <w:r>
+        <w:t>from 100Hz to 24.83MHz. The passband exhibits 0</w:t>
+      </w:r>
+      <w:r>
+        <w:t xml:space="preserve"> </w:t>
+      </w:r>
+      <w:r>
+        <w:t xml:space="preserve">dB gain up to 20kHz, with the -3dB </w:t>
+      </w:r>
+      <w:r>
+        <w:rPr>
+          <w:lang w:val="en-US"/>
+        </w:rPr>
+        <w:t>cutoff</w:t>
+      </w:r>
+      <w:r>
+        <w:t xml:space="preserve"> observed at </w:t>
+      </w:r>
+      <w:r>
+        <w:t>28.18</w:t>
+      </w:r>
+      <w:r>
+        <w:t>kHz. A localized gain dip to -4.5dB occurs at 40kHz followed by a rebound to -2dB at 70kHz and progressive roll-off</w:t>
+      </w:r>
+      <w:r>
+        <w:t xml:space="preserve">. </w:t>
+      </w:r>
+      <w:r>
+        <w:t xml:space="preserve">Phase starts at 180° (with </w:t>
+      </w:r>
+      <w:r>
+        <w:t>instrument artifacting</w:t>
+      </w:r>
+      <w:r>
+        <w:t xml:space="preserve"> at low frequencies) and trends toward 0°</w:t>
+      </w:r>
+      <w:r>
+        <w:rPr>
+          <w:lang w:val="en-US"/>
+        </w:rPr>
+        <w:t>.</w:t>
       </w:r>
     </w:p>
     <w:p>
@@ -4996,6 +4995,7 @@
     <w:p>
       <w:pPr>
         <w:pStyle w:val="Caption"/>
+        <w:ind w:left="0" w:firstLine="0"/>
         <w:rPr>
           <w:lang w:val="en-US"/>
         </w:rPr>
@@ -5032,50 +5032,82 @@
         <w:rPr>
           <w:lang w:val="en-US"/>
         </w:rPr>
-        <w:t xml:space="preserve">. The simulated frequency response of </w:t>
-      </w:r>
-      <w:r>
-        <w:rPr>
-          <w:lang w:val="en-US"/>
-        </w:rPr>
-        <w:t xml:space="preserve">a </w:t>
-      </w:r>
-      <w:r>
-        <w:rPr>
-          <w:lang w:val="en-US"/>
-        </w:rPr>
-        <w:t xml:space="preserve">LM358 </w:t>
-      </w:r>
-      <w:r>
-        <w:rPr>
-          <w:lang w:val="en-US"/>
-        </w:rPr>
-        <w:t>non-</w:t>
-      </w:r>
-      <w:r>
-        <w:rPr>
-          <w:lang w:val="en-US"/>
-        </w:rPr>
-        <w:t xml:space="preserve">inverting amplifier with a gain </w:t>
-      </w:r>
-      <w:r>
-        <w:rPr>
-          <w:lang w:val="en-US"/>
-        </w:rPr>
-        <w:t>(A</w:t>
-      </w:r>
-      <w:r>
-        <w:rPr>
-          <w:vertAlign w:val="subscript"/>
-          <w:lang w:val="en-US"/>
-        </w:rPr>
-        <w:t>v</w:t>
-      </w:r>
-      <w:r>
-        <w:rPr>
-          <w:lang w:val="en-US"/>
-        </w:rPr>
-        <w:t>) = 100 (40dB) from 10Hz to 10MHz.</w:t>
+        <w:t xml:space="preserve">. </w:t>
+      </w:r>
+      <w:r>
+        <w:t>Simulated small-signal frequency response of the LM358 non-inverting amplifier with nominal gain Av = 101</w:t>
+      </w:r>
+      <w:r>
+        <w:t xml:space="preserve"> </w:t>
+      </w:r>
+      <w:r>
+        <w:t xml:space="preserve">(40.08dB) in LTSpice from 10Hz to 10MHz. The -3dB </w:t>
+      </w:r>
+      <w:r>
+        <w:t>cutoff</w:t>
+      </w:r>
+      <w:r>
+        <w:t xml:space="preserve"> frequency is located at</w:t>
+      </w:r>
+      <w:r>
+        <w:t xml:space="preserve"> 7.86kHz</w:t>
+      </w:r>
+      <w:r>
+        <w:t>, beyond which the magnitude rolls off at a classic -20dB/decade slope</w:t>
+      </w:r>
+      <w:r>
+        <w:t xml:space="preserve"> till an additional pole becomes active at about </w:t>
+      </w:r>
+      <w:r>
+        <w:t>1MH</w:t>
+      </w:r>
+      <w:r>
+        <w:t>z</w:t>
+      </w:r>
+      <w:r>
+        <w:t xml:space="preserve">. </w:t>
+      </w:r>
+      <w:r>
+        <w:rPr>
+          <w:lang w:val="en-US"/>
+        </w:rPr>
+        <w:t>Phase remains near 0° at low frequencies and</w:t>
+      </w:r>
+      <w:r>
+        <w:rPr>
+          <w:lang w:val="en-US"/>
+        </w:rPr>
+        <w:t xml:space="preserve"> starts </w:t>
+      </w:r>
+      <w:r>
+        <w:rPr>
+          <w:lang w:val="en-US"/>
+        </w:rPr>
+        <w:t>dropping</w:t>
+      </w:r>
+      <w:r>
+        <w:rPr>
+          <w:lang w:val="en-US"/>
+        </w:rPr>
+        <w:t xml:space="preserve"> </w:t>
+      </w:r>
+      <w:r>
+        <w:rPr>
+          <w:lang w:val="en-US"/>
+        </w:rPr>
+        <w:t>at</w:t>
+      </w:r>
+      <w:r>
+        <w:t xml:space="preserve"> 10kHz</w:t>
+      </w:r>
+      <w:r>
+        <w:t xml:space="preserve"> with a second drop before the second pole becomes active</w:t>
+      </w:r>
+      <w:r>
+        <w:rPr>
+          <w:lang w:val="en-US"/>
+        </w:rPr>
+        <w:t>.</w:t>
       </w:r>
     </w:p>
     <w:p>
@@ -5134,6 +5166,7 @@
     <w:p>
       <w:pPr>
         <w:pStyle w:val="Caption"/>
+        <w:ind w:left="0" w:firstLine="0"/>
         <w:rPr>
           <w:lang w:val="en-US"/>
         </w:rPr>
@@ -5170,70 +5203,49 @@
         <w:rPr>
           <w:lang w:val="en-US"/>
         </w:rPr>
-        <w:t xml:space="preserve">. The measured </w:t>
-      </w:r>
-      <w:proofErr w:type="spellStart"/>
-      <w:r>
-        <w:rPr>
-          <w:lang w:val="en-US"/>
-        </w:rPr>
-        <w:t>frequencty</w:t>
-      </w:r>
-      <w:proofErr w:type="spellEnd"/>
-      <w:r>
-        <w:rPr>
-          <w:lang w:val="en-US"/>
-        </w:rPr>
-        <w:t xml:space="preserve"> response of a LM358 non-inverting amplifier</w:t>
-      </w:r>
-      <w:r>
-        <w:rPr>
-          <w:lang w:val="en-US"/>
-        </w:rPr>
+        <w:t xml:space="preserve">. </w:t>
+      </w:r>
+      <w:r>
+        <w:t>Measured small-signal frequency response of the LM358 non-inverting amplifier with nominal gain Av = 101 (40.08dB) from 100Hz to 24.83MHz. The measured low-frequency gain is 40.</w:t>
+      </w:r>
+      <w:r>
+        <w:t>08</w:t>
+      </w:r>
+      <w:r>
+        <w:t>dB with exceptional passband flatness up to 4kHz. Th</w:t>
+      </w:r>
+      <w:r>
+        <w:t>e</w:t>
+      </w:r>
+      <w:r>
+        <w:t xml:space="preserve"> -3dB c</w:t>
+      </w:r>
+      <w:r>
+        <w:t>utoff</w:t>
+      </w:r>
+      <w:r>
+        <w:t xml:space="preserve"> frequency occurs at </w:t>
+      </w:r>
+      <w:r>
+        <w:t>7.6</w:t>
+      </w:r>
+      <w:r>
+        <w:t>kHz</w:t>
+      </w:r>
+      <w:r>
         <w:t xml:space="preserve"> </w:t>
       </w:r>
       <w:r>
-        <w:rPr>
-          <w:lang w:val="en-US"/>
-        </w:rPr>
-        <w:t xml:space="preserve">with a gain </w:t>
-      </w:r>
-      <w:r>
-        <w:rPr>
-          <w:lang w:val="en-US"/>
-        </w:rPr>
-        <w:t>(A</w:t>
-      </w:r>
-      <w:r>
-        <w:rPr>
-          <w:vertAlign w:val="subscript"/>
-          <w:lang w:val="en-US"/>
-        </w:rPr>
-        <w:t>v</w:t>
-      </w:r>
-      <w:r>
-        <w:rPr>
-          <w:lang w:val="en-US"/>
-        </w:rPr>
-        <w:t>) = 100 (40dB)</w:t>
-      </w:r>
-      <w:r>
-        <w:rPr>
-          <w:lang w:val="en-US"/>
-        </w:rPr>
-        <w:t xml:space="preserve"> </w:t>
-      </w:r>
-      <w:r>
-        <w:rPr>
-          <w:lang w:val="en-US"/>
-        </w:rPr>
-        <w:t>from</w:t>
-      </w:r>
-      <w:r>
-        <w:rPr>
-          <w:lang w:val="en-US"/>
-        </w:rPr>
-        <w:t xml:space="preserve"> 100Hz to 24.83MHz.</w:t>
+        <w:t>beyond which the magnitude rolls off at a classic -20dB/decade slope till</w:t>
+      </w:r>
+      <w:r>
+        <w:t xml:space="preserve"> 2.5MHz</w:t>
+      </w:r>
+      <w:r>
+        <w:rPr>
+          <w:lang w:val="en-US"/>
+        </w:rPr>
+        <w:t>.</w:t>
       </w:r>
     </w:p>
     <w:p>
@@ -5293,6 +5305,7 @@
     <w:p>
       <w:pPr>
         <w:pStyle w:val="Caption"/>
+        <w:ind w:left="0" w:firstLine="0"/>
         <w:rPr>
           <w:lang w:val="en-US"/>
         </w:rPr>
@@ -5329,50 +5342,70 @@
         <w:rPr>
           <w:lang w:val="en-US"/>
         </w:rPr>
-        <w:t xml:space="preserve">. The simulated frequency response of </w:t>
-      </w:r>
-      <w:r>
-        <w:rPr>
-          <w:lang w:val="en-US"/>
-        </w:rPr>
-        <w:t xml:space="preserve">a </w:t>
-      </w:r>
-      <w:r>
-        <w:rPr>
-          <w:lang w:val="en-US"/>
-        </w:rPr>
-        <w:t xml:space="preserve">LM358 inverting amplifier </w:t>
-      </w:r>
-      <w:r>
-        <w:rPr>
-          <w:lang w:val="en-US"/>
-        </w:rPr>
-        <w:t xml:space="preserve">with a gain </w:t>
-      </w:r>
-      <w:r>
-        <w:rPr>
-          <w:lang w:val="en-US"/>
-        </w:rPr>
-        <w:t>(A</w:t>
-      </w:r>
-      <w:r>
-        <w:rPr>
-          <w:vertAlign w:val="subscript"/>
-          <w:lang w:val="en-US"/>
-        </w:rPr>
-        <w:t>v</w:t>
-      </w:r>
-      <w:r>
-        <w:rPr>
-          <w:lang w:val="en-US"/>
-        </w:rPr>
-        <w:t xml:space="preserve">) = 100 (40dB) </w:t>
-      </w:r>
-      <w:r>
-        <w:rPr>
-          <w:lang w:val="en-US"/>
-        </w:rPr>
-        <w:t>from 10Hz to 10MHz.</w:t>
+        <w:t xml:space="preserve">. </w:t>
+      </w:r>
+      <w:r>
+        <w:t>Simulated small-signal frequency response of the LM358 inverting amplifier with nominal gain Av = -10</w:t>
+      </w:r>
+      <w:r>
+        <w:t>0</w:t>
+      </w:r>
+      <w:r>
+        <w:t xml:space="preserve"> </w:t>
+      </w:r>
+      <w:r>
+        <w:t>(40dB) in LTSpice from 10Hz to 10MHz. The -3dB c</w:t>
+      </w:r>
+      <w:r>
+        <w:t>utoff</w:t>
+      </w:r>
+      <w:r>
+        <w:t xml:space="preserve"> frequency is located at </w:t>
+      </w:r>
+      <w:r>
+        <w:t>7.78</w:t>
+      </w:r>
+      <w:r>
+        <w:t>kHz</w:t>
+      </w:r>
+      <w:r>
+        <w:t xml:space="preserve">, </w:t>
+      </w:r>
+      <w:r>
+        <w:t>followed by a -20</w:t>
+      </w:r>
+      <w:r>
+        <w:t xml:space="preserve"> </w:t>
+      </w:r>
+      <w:r>
+        <w:t xml:space="preserve">dB/decade </w:t>
+      </w:r>
+      <w:r>
+        <w:t xml:space="preserve">slopoe </w:t>
+      </w:r>
+      <w:r>
+        <w:t>till an additional pole becomes active at about 1MHz</w:t>
+      </w:r>
+      <w:r>
+        <w:rPr>
+          <w:lang w:val="en-US"/>
+        </w:rPr>
+        <w:t>.</w:t>
+      </w:r>
+      <w:r>
+        <w:rPr>
+          <w:lang w:val="en-US"/>
+        </w:rPr>
+        <w:t xml:space="preserve"> </w:t>
+      </w:r>
+      <w:r>
+        <w:t>Phase starts at 180° and trends toward 0°</w:t>
+      </w:r>
+      <w:r>
+        <w:rPr>
+          <w:lang w:val="en-US"/>
+        </w:rPr>
+        <w:t>.</w:t>
       </w:r>
     </w:p>
     <w:p>
@@ -5431,6 +5464,7 @@
     <w:p>
       <w:pPr>
         <w:pStyle w:val="Caption"/>
+        <w:ind w:left="0" w:firstLine="0"/>
         <w:rPr>
           <w:lang w:val="en-US"/>
         </w:rPr>
@@ -5467,71 +5501,102 @@
         <w:rPr>
           <w:lang w:val="en-US"/>
         </w:rPr>
-        <w:t xml:space="preserve">. The measured frequency response of a LM358 </w:t>
-      </w:r>
-      <w:r>
-        <w:rPr>
-          <w:lang w:val="en-US"/>
-        </w:rPr>
-        <w:t>i</w:t>
-      </w:r>
-      <w:r>
-        <w:rPr>
-          <w:lang w:val="en-US"/>
-        </w:rPr>
-        <w:t xml:space="preserve">nverting amplifier </w:t>
-      </w:r>
-      <w:r>
-        <w:rPr>
-          <w:lang w:val="en-US"/>
-        </w:rPr>
-        <w:t xml:space="preserve">with a gain </w:t>
-      </w:r>
-      <w:r>
-        <w:rPr>
-          <w:lang w:val="en-US"/>
-        </w:rPr>
-        <w:t>(A</w:t>
-      </w:r>
-      <w:r>
-        <w:rPr>
-          <w:vertAlign w:val="subscript"/>
-          <w:lang w:val="en-US"/>
-        </w:rPr>
-        <w:t>v</w:t>
-      </w:r>
-      <w:r>
-        <w:rPr>
-          <w:lang w:val="en-US"/>
-        </w:rPr>
-        <w:t>) = 100 (40dB)</w:t>
-      </w:r>
-      <w:r>
-        <w:rPr>
-          <w:lang w:val="en-US"/>
-        </w:rPr>
+        <w:t xml:space="preserve">. </w:t>
+      </w:r>
+      <w:r>
+        <w:t>Measured small-signal frequency response of the LM358 inverting amplifier with nominal gain Av = -100</w:t>
+      </w:r>
+      <w:r>
         <w:t xml:space="preserve"> </w:t>
       </w:r>
       <w:r>
-        <w:rPr>
-          <w:lang w:val="en-US"/>
-        </w:rPr>
-        <w:t>from</w:t>
-      </w:r>
-      <w:r>
-        <w:rPr>
-          <w:lang w:val="en-US"/>
-        </w:rPr>
-        <w:t xml:space="preserve"> 100Hz to 24.83MHz.</w:t>
-      </w:r>
-    </w:p>
-    <w:p>
-      <w:pPr>
-        <w:rPr>
-          <w:lang w:val="en-US"/>
-        </w:rPr>
-      </w:pPr>
-    </w:p>
+        <w:t xml:space="preserve">(40dB) from 100Hz to 24.83MHz. The low-frequency passband demonstrates 40.0 dB gain up to 4kHz, with the -3dB cutoff established at </w:t>
+      </w:r>
+      <w:r>
+        <w:t>7.67</w:t>
+      </w:r>
+      <w:r>
+        <w:t>kHz</w:t>
+      </w:r>
+      <w:r>
+        <w:t xml:space="preserve">. </w:t>
+      </w:r>
+      <w:r>
+        <w:t>The response rolls off linearly at -20 dB/decade down to a notch resonance at 6.</w:t>
+      </w:r>
+      <w:r>
+        <w:t>5</w:t>
+      </w:r>
+      <w:r>
+        <w:t>MHz</w:t>
+      </w:r>
+      <w:r>
+        <w:rPr>
+          <w:lang w:val="en-US"/>
+        </w:rPr>
+        <w:t>.</w:t>
+      </w:r>
+    </w:p>
+    <w:p>
+      <w:pPr>
+        <w:rPr>
+          <w:lang w:val="en-US"/>
+        </w:rPr>
+      </w:pPr>
+    </w:p>
+    <w:p>
+      <w:r>
+        <w:t>A common pattern in all of the frequency response plots above is phase degradation. The growing phase lag adds delay in the feedback path, which eventually causes the gain to collapse. Two further observations are worth noting. First, in certain configurations (Figures 13, 15 and 16) a second pole appears at high frequencies, steepening the roll-off from −20 dB/decade to −40 dB/decade. Second, Figure 16 shows a resonance near 6.5 MHz, where the phase suddenly shifts upward by roughly 90 degrees, indicating that the circuit briefly behaves inductively before the response continues to roll off.</w:t>
+      </w:r>
+    </w:p>
+    <w:p>
+      <w:pPr>
+        <w:rPr>
+          <w:lang w:val="en-US"/>
+        </w:rPr>
+      </w:pPr>
+    </w:p>
+    <w:p>
+      <w:pPr>
+        <w:pStyle w:val="Caption"/>
+        <w:keepNext/>
+        <w:ind w:left="0" w:firstLine="0"/>
+      </w:pPr>
+      <w:r>
+        <w:t xml:space="preserve">Table </w:t>
+      </w:r>
+      <w:r>
+        <w:fldChar w:fldCharType="begin"/>
+      </w:r>
+      <w:r>
+        <w:instrText xml:space="preserve"> SEQ Table \* ARABIC </w:instrText>
+      </w:r>
+      <w:r>
+        <w:fldChar w:fldCharType="separate"/>
+      </w:r>
+      <w:r>
+        <w:rPr>
+          <w:noProof/>
+        </w:rPr>
+        <w:t>1</w:t>
+      </w:r>
+      <w:r>
+        <w:fldChar w:fldCharType="end"/>
+      </w:r>
+      <w:r>
+        <w:t xml:space="preserve">. </w:t>
+      </w:r>
+      <w:r>
+        <w:t xml:space="preserve">Comparison of the simulated and measured gain-bandwidth product (GBW) for the voltage follower and the inverting and non-inverting amplifier configurations. The GBW was calculated by multiplying the magnitude of the closed-loop gain by the measured −3 dB </w:t>
+      </w:r>
+      <w:r>
+        <w:t>frequency</w:t>
+      </w:r>
+      <w:r>
+        <w:t xml:space="preserve"> of each circuit.</w:t>
+      </w:r>
+    </w:p>
+    <w:p/>
     <w:tbl>
       <w:tblPr>
         <w:tblW w:w="0" w:type="auto"/>
@@ -5551,26 +5616,26 @@
         <w:tblLook w:val="04A0" w:firstRow="1" w:lastRow="0" w:firstColumn="1" w:lastColumn="0" w:noHBand="0" w:noVBand="1"/>
       </w:tblPr>
       <w:tblGrid>
-        <w:gridCol w:w="1800"/>
-        <w:gridCol w:w="1800"/>
-        <w:gridCol w:w="1800"/>
-        <w:gridCol w:w="1800"/>
+        <w:gridCol w:w="3697"/>
+        <w:gridCol w:w="1257"/>
+        <w:gridCol w:w="1275"/>
+        <w:gridCol w:w="1247"/>
+        <w:gridCol w:w="1447"/>
       </w:tblGrid>
       <w:tr>
         <w:trPr>
-          <w:trHeight w:val="300"/>
+          <w:trHeight w:val="216"/>
           <w:jc w:val="center"/>
         </w:trPr>
         <w:tc>
           <w:tcPr>
-            <w:tcW w:w="1800" w:type="dxa"/>
+            <w:tcW w:w="3697" w:type="dxa"/>
             <w:tcBorders>
               <w:top w:val="single" w:sz="6" w:space="0" w:color="auto"/>
               <w:left w:val="single" w:sz="6" w:space="0" w:color="auto"/>
               <w:bottom w:val="single" w:sz="6" w:space="0" w:color="auto"/>
               <w:right w:val="single" w:sz="6" w:space="0" w:color="auto"/>
             </w:tcBorders>
-            <w:vAlign w:val="center"/>
             <w:hideMark/>
           </w:tcPr>
           <w:p>
@@ -5578,26 +5643,21 @@
               <w:pStyle w:val="paragraph"/>
               <w:spacing w:before="0" w:beforeAutospacing="0" w:after="0" w:afterAutospacing="0"/>
               <w:textAlignment w:val="baseline"/>
+              <w:rPr>
+                <w:rFonts w:ascii="Aptos" w:hAnsi="Aptos"/>
+              </w:rPr>
             </w:pPr>
-            <w:r>
-              <w:rPr>
-                <w:rStyle w:val="eop"/>
-                <w:rFonts w:ascii="Aptos" w:hAnsi="Aptos"/>
-              </w:rPr>
-              <w:t> </w:t>
-            </w:r>
           </w:p>
         </w:tc>
         <w:tc>
           <w:tcPr>
-            <w:tcW w:w="1800" w:type="dxa"/>
+            <w:tcW w:w="1257" w:type="dxa"/>
             <w:tcBorders>
               <w:top w:val="single" w:sz="6" w:space="0" w:color="auto"/>
               <w:left w:val="single" w:sz="6" w:space="0" w:color="auto"/>
               <w:bottom w:val="single" w:sz="6" w:space="0" w:color="auto"/>
               <w:right w:val="single" w:sz="6" w:space="0" w:color="auto"/>
             </w:tcBorders>
-            <w:vAlign w:val="center"/>
             <w:hideMark/>
           </w:tcPr>
           <w:p>
@@ -5605,26 +5665,75 @@
               <w:pStyle w:val="paragraph"/>
               <w:spacing w:before="0" w:beforeAutospacing="0" w:after="0" w:afterAutospacing="0"/>
               <w:textAlignment w:val="baseline"/>
+              <w:rPr>
+                <w:rFonts w:ascii="Aptos" w:hAnsi="Aptos"/>
+              </w:rPr>
             </w:pPr>
             <w:r>
               <w:rPr>
-                <w:rStyle w:val="eop"/>
+                <w:rStyle w:val="normaltextrun"/>
                 <w:rFonts w:ascii="Aptos" w:hAnsi="Aptos"/>
-              </w:rPr>
-              <w:t> </w:t>
+                <w:lang w:val="en-US"/>
+              </w:rPr>
+              <w:t>Sim</w:t>
+            </w:r>
+            <w:r>
+              <w:rPr>
+                <w:rStyle w:val="normaltextrun"/>
+                <w:rFonts w:ascii="Aptos" w:hAnsi="Aptos"/>
+                <w:lang w:val="en-US"/>
+              </w:rPr>
+              <w:t>ulated</w:t>
             </w:r>
           </w:p>
         </w:tc>
         <w:tc>
           <w:tcPr>
-            <w:tcW w:w="1800" w:type="dxa"/>
+            <w:tcW w:w="1275" w:type="dxa"/>
             <w:tcBorders>
               <w:top w:val="single" w:sz="6" w:space="0" w:color="auto"/>
               <w:left w:val="single" w:sz="6" w:space="0" w:color="auto"/>
               <w:bottom w:val="single" w:sz="6" w:space="0" w:color="auto"/>
               <w:right w:val="single" w:sz="6" w:space="0" w:color="auto"/>
             </w:tcBorders>
-            <w:vAlign w:val="center"/>
+          </w:tcPr>
+          <w:p>
+            <w:pPr>
+              <w:pStyle w:val="paragraph"/>
+              <w:spacing w:before="0" w:beforeAutospacing="0" w:after="0" w:afterAutospacing="0"/>
+              <w:textAlignment w:val="baseline"/>
+              <w:rPr>
+                <w:rStyle w:val="normaltextrun"/>
+                <w:rFonts w:ascii="Aptos" w:hAnsi="Aptos"/>
+                <w:lang w:val="en-US"/>
+              </w:rPr>
+            </w:pPr>
+            <w:r>
+              <w:rPr>
+                <w:rStyle w:val="normaltextrun"/>
+                <w:rFonts w:ascii="Aptos" w:hAnsi="Aptos"/>
+                <w:lang w:val="en-US"/>
+              </w:rPr>
+              <w:t>G</w:t>
+            </w:r>
+            <w:r>
+              <w:rPr>
+                <w:rStyle w:val="normaltextrun"/>
+                <w:rFonts w:ascii="Aptos" w:hAnsi="Aptos"/>
+              </w:rPr>
+              <w:t>BW (sim)</w:t>
+            </w:r>
+          </w:p>
+        </w:tc>
+        <w:tc>
+          <w:tcPr>
+            <w:tcW w:w="1247" w:type="dxa"/>
+            <w:tcBorders>
+              <w:top w:val="single" w:sz="6" w:space="0" w:color="auto"/>
+              <w:left w:val="single" w:sz="6" w:space="0" w:color="auto"/>
+              <w:bottom w:val="single" w:sz="6" w:space="0" w:color="auto"/>
+              <w:right w:val="single" w:sz="6" w:space="0" w:color="auto"/>
+            </w:tcBorders>
             <w:hideMark/>
           </w:tcPr>
           <w:p>
@@ -5632,6 +5741,9 @@
               <w:pStyle w:val="paragraph"/>
               <w:spacing w:before="0" w:beforeAutospacing="0" w:after="0" w:afterAutospacing="0"/>
               <w:textAlignment w:val="baseline"/>
+              <w:rPr>
+                <w:rFonts w:ascii="Aptos" w:hAnsi="Aptos"/>
+              </w:rPr>
             </w:pPr>
             <w:r>
               <w:rPr>
@@ -5639,27 +5751,63 @@
                 <w:rFonts w:ascii="Aptos" w:hAnsi="Aptos"/>
                 <w:lang w:val="en-US"/>
               </w:rPr>
-              <w:t>Sim result</w:t>
-            </w:r>
-            <w:r>
-              <w:rPr>
-                <w:rStyle w:val="eop"/>
-                <w:rFonts w:ascii="Aptos" w:hAnsi="Aptos"/>
-              </w:rPr>
-              <w:t> </w:t>
+              <w:t>Measured</w:t>
             </w:r>
           </w:p>
         </w:tc>
         <w:tc>
           <w:tcPr>
-            <w:tcW w:w="1800" w:type="dxa"/>
+            <w:tcW w:w="1447" w:type="dxa"/>
             <w:tcBorders>
               <w:top w:val="single" w:sz="6" w:space="0" w:color="auto"/>
               <w:left w:val="single" w:sz="6" w:space="0" w:color="auto"/>
               <w:bottom w:val="single" w:sz="6" w:space="0" w:color="auto"/>
               <w:right w:val="single" w:sz="6" w:space="0" w:color="auto"/>
             </w:tcBorders>
-            <w:vAlign w:val="center"/>
+          </w:tcPr>
+          <w:p>
+            <w:pPr>
+              <w:pStyle w:val="paragraph"/>
+              <w:spacing w:before="0" w:beforeAutospacing="0" w:after="0" w:afterAutospacing="0"/>
+              <w:textAlignment w:val="baseline"/>
+              <w:rPr>
+                <w:rStyle w:val="normaltextrun"/>
+                <w:rFonts w:ascii="Aptos" w:hAnsi="Aptos"/>
+                <w:lang w:val="en-US"/>
+              </w:rPr>
+            </w:pPr>
+            <w:r>
+              <w:rPr>
+                <w:rStyle w:val="normaltextrun"/>
+                <w:rFonts w:ascii="Aptos" w:hAnsi="Aptos"/>
+                <w:lang w:val="en-US"/>
+              </w:rPr>
+              <w:t>G</w:t>
+            </w:r>
+            <w:r>
+              <w:rPr>
+                <w:rStyle w:val="normaltextrun"/>
+                <w:rFonts w:ascii="Aptos" w:hAnsi="Aptos"/>
+              </w:rPr>
+              <w:t>BW (meas)</w:t>
+            </w:r>
+          </w:p>
+        </w:tc>
+      </w:tr>
+      <w:tr>
+        <w:trPr>
+          <w:trHeight w:val="359"/>
+          <w:jc w:val="center"/>
+        </w:trPr>
+        <w:tc>
+          <w:tcPr>
+            <w:tcW w:w="3697" w:type="dxa"/>
+            <w:tcBorders>
+              <w:top w:val="single" w:sz="6" w:space="0" w:color="auto"/>
+              <w:left w:val="single" w:sz="6" w:space="0" w:color="auto"/>
+              <w:bottom w:val="single" w:sz="6" w:space="0" w:color="auto"/>
+              <w:right w:val="single" w:sz="6" w:space="0" w:color="auto"/>
+            </w:tcBorders>
             <w:hideMark/>
           </w:tcPr>
           <w:p>
@@ -5667,40 +5815,27 @@
               <w:pStyle w:val="paragraph"/>
               <w:spacing w:before="0" w:beforeAutospacing="0" w:after="0" w:afterAutospacing="0"/>
               <w:textAlignment w:val="baseline"/>
+              <w:rPr>
+                <w:rFonts w:ascii="Aptos" w:hAnsi="Aptos"/>
+              </w:rPr>
             </w:pPr>
             <w:r>
               <w:rPr>
-                <w:rStyle w:val="normaltextrun"/>
                 <w:rFonts w:ascii="Aptos" w:hAnsi="Aptos"/>
-                <w:lang w:val="en-US"/>
-              </w:rPr>
-              <w:t>Measured</w:t>
-            </w:r>
-            <w:r>
-              <w:rPr>
-                <w:rStyle w:val="eop"/>
-                <w:rFonts w:ascii="Aptos" w:hAnsi="Aptos"/>
-              </w:rPr>
-              <w:t> </w:t>
+              </w:rPr>
+              <w:t>Voltage follower</w:t>
             </w:r>
           </w:p>
         </w:tc>
-      </w:tr>
-      <w:tr>
-        <w:trPr>
-          <w:trHeight w:val="300"/>
-          <w:jc w:val="center"/>
-        </w:trPr>
         <w:tc>
           <w:tcPr>
-            <w:tcW w:w="1800" w:type="dxa"/>
+            <w:tcW w:w="1257" w:type="dxa"/>
             <w:tcBorders>
               <w:top w:val="single" w:sz="6" w:space="0" w:color="auto"/>
               <w:left w:val="single" w:sz="6" w:space="0" w:color="auto"/>
               <w:bottom w:val="single" w:sz="6" w:space="0" w:color="auto"/>
               <w:right w:val="single" w:sz="6" w:space="0" w:color="auto"/>
             </w:tcBorders>
-            <w:vAlign w:val="center"/>
             <w:hideMark/>
           </w:tcPr>
           <w:p>
@@ -5708,6 +5843,10 @@
               <w:pStyle w:val="paragraph"/>
               <w:spacing w:before="0" w:beforeAutospacing="0" w:after="0" w:afterAutospacing="0"/>
               <w:textAlignment w:val="baseline"/>
+              <w:rPr>
+                <w:rStyle w:val="normaltextrun"/>
+                <w:rFonts w:ascii="Aptos" w:hAnsi="Aptos"/>
+              </w:rPr>
             </w:pPr>
             <w:r>
               <w:rPr>
@@ -5715,27 +5854,59 @@
                 <w:rFonts w:ascii="Aptos" w:hAnsi="Aptos"/>
                 <w:lang w:val="en-US"/>
               </w:rPr>
-              <w:t>1. GBW (f3db)</w:t>
+              <w:t>1.15MHz</w:t>
             </w:r>
-            <w:r>
-              <w:rPr>
-                <w:rStyle w:val="eop"/>
+          </w:p>
+          <w:p>
+            <w:pPr>
+              <w:pStyle w:val="paragraph"/>
+              <w:spacing w:before="0" w:beforeAutospacing="0" w:after="0" w:afterAutospacing="0"/>
+              <w:textAlignment w:val="baseline"/>
+              <w:rPr>
                 <w:rFonts w:ascii="Aptos" w:hAnsi="Aptos"/>
               </w:rPr>
-              <w:t> </w:t>
-            </w:r>
+            </w:pPr>
           </w:p>
         </w:tc>
         <w:tc>
           <w:tcPr>
-            <w:tcW w:w="1800" w:type="dxa"/>
+            <w:tcW w:w="1275" w:type="dxa"/>
             <w:tcBorders>
               <w:top w:val="single" w:sz="6" w:space="0" w:color="auto"/>
               <w:left w:val="single" w:sz="6" w:space="0" w:color="auto"/>
               <w:bottom w:val="single" w:sz="6" w:space="0" w:color="auto"/>
               <w:right w:val="single" w:sz="6" w:space="0" w:color="auto"/>
             </w:tcBorders>
-            <w:vAlign w:val="center"/>
+          </w:tcPr>
+          <w:p>
+            <w:pPr>
+              <w:pStyle w:val="paragraph"/>
+              <w:spacing w:before="0" w:beforeAutospacing="0" w:after="0" w:afterAutospacing="0"/>
+              <w:textAlignment w:val="baseline"/>
+              <w:rPr>
+                <w:rStyle w:val="normaltextrun"/>
+                <w:rFonts w:ascii="Aptos" w:hAnsi="Aptos"/>
+              </w:rPr>
+            </w:pPr>
+            <w:r>
+              <w:rPr>
+                <w:rStyle w:val="normaltextrun"/>
+                <w:rFonts w:ascii="Aptos" w:hAnsi="Aptos"/>
+                <w:lang w:val="en-US"/>
+              </w:rPr>
+              <w:t>1.15MHz</w:t>
+            </w:r>
+          </w:p>
+        </w:tc>
+        <w:tc>
+          <w:tcPr>
+            <w:tcW w:w="1247" w:type="dxa"/>
+            <w:tcBorders>
+              <w:top w:val="single" w:sz="6" w:space="0" w:color="auto"/>
+              <w:left w:val="single" w:sz="6" w:space="0" w:color="auto"/>
+              <w:bottom w:val="single" w:sz="6" w:space="0" w:color="auto"/>
+              <w:right w:val="single" w:sz="6" w:space="0" w:color="auto"/>
+            </w:tcBorders>
             <w:hideMark/>
           </w:tcPr>
           <w:p>
@@ -5743,6 +5914,9 @@
               <w:pStyle w:val="paragraph"/>
               <w:spacing w:before="0" w:beforeAutospacing="0" w:after="0" w:afterAutospacing="0"/>
               <w:textAlignment w:val="baseline"/>
+              <w:rPr>
+                <w:rFonts w:ascii="Aptos" w:hAnsi="Aptos"/>
+              </w:rPr>
             </w:pPr>
             <w:r>
               <w:rPr>
@@ -5750,27 +5924,56 @@
                 <w:rFonts w:ascii="Aptos" w:hAnsi="Aptos"/>
                 <w:lang w:val="en-US"/>
               </w:rPr>
-              <w:t>A1</w:t>
-            </w:r>
-            <w:r>
-              <w:rPr>
-                <w:rStyle w:val="eop"/>
-                <w:rFonts w:ascii="Aptos" w:hAnsi="Aptos"/>
-              </w:rPr>
-              <w:t> </w:t>
+              <w:t>84.140kHz</w:t>
             </w:r>
           </w:p>
         </w:tc>
         <w:tc>
           <w:tcPr>
-            <w:tcW w:w="1800" w:type="dxa"/>
+            <w:tcW w:w="1447" w:type="dxa"/>
             <w:tcBorders>
               <w:top w:val="single" w:sz="6" w:space="0" w:color="auto"/>
               <w:left w:val="single" w:sz="6" w:space="0" w:color="auto"/>
               <w:bottom w:val="single" w:sz="6" w:space="0" w:color="auto"/>
               <w:right w:val="single" w:sz="6" w:space="0" w:color="auto"/>
             </w:tcBorders>
-            <w:vAlign w:val="center"/>
+          </w:tcPr>
+          <w:p>
+            <w:pPr>
+              <w:pStyle w:val="paragraph"/>
+              <w:spacing w:before="0" w:beforeAutospacing="0" w:after="0" w:afterAutospacing="0"/>
+              <w:textAlignment w:val="baseline"/>
+              <w:rPr>
+                <w:rStyle w:val="normaltextrun"/>
+                <w:rFonts w:ascii="Aptos" w:hAnsi="Aptos"/>
+                <w:lang w:val="en-US"/>
+              </w:rPr>
+            </w:pPr>
+            <w:r>
+              <w:rPr>
+                <w:rStyle w:val="normaltextrun"/>
+                <w:rFonts w:ascii="Aptos" w:hAnsi="Aptos"/>
+                <w:lang w:val="en-US"/>
+              </w:rPr>
+              <w:t>84.140kHz</w:t>
+            </w:r>
+          </w:p>
+        </w:tc>
+      </w:tr>
+      <w:tr>
+        <w:trPr>
+          <w:trHeight w:val="359"/>
+          <w:jc w:val="center"/>
+        </w:trPr>
+        <w:tc>
+          <w:tcPr>
+            <w:tcW w:w="3697" w:type="dxa"/>
+            <w:tcBorders>
+              <w:top w:val="single" w:sz="6" w:space="0" w:color="auto"/>
+              <w:left w:val="single" w:sz="6" w:space="0" w:color="auto"/>
+              <w:bottom w:val="single" w:sz="6" w:space="0" w:color="auto"/>
+              <w:right w:val="single" w:sz="6" w:space="0" w:color="auto"/>
+            </w:tcBorders>
             <w:hideMark/>
           </w:tcPr>
           <w:p>
@@ -5778,34 +5981,33 @@
               <w:pStyle w:val="paragraph"/>
               <w:spacing w:before="0" w:beforeAutospacing="0" w:after="0" w:afterAutospacing="0"/>
               <w:textAlignment w:val="baseline"/>
+              <w:rPr>
+                <w:rFonts w:ascii="Aptos" w:hAnsi="Aptos"/>
+              </w:rPr>
             </w:pPr>
             <w:r>
               <w:rPr>
-                <w:rStyle w:val="normaltextrun"/>
                 <w:rFonts w:ascii="Aptos" w:hAnsi="Aptos"/>
-                <w:lang w:val="en-US"/>
-              </w:rPr>
-              <w:t>1.15MHz</w:t>
+              </w:rPr>
+              <w:t xml:space="preserve">Inverting amplifier </w:t>
             </w:r>
             <w:r>
               <w:rPr>
-                <w:rStyle w:val="eop"/>
                 <w:rFonts w:ascii="Aptos" w:hAnsi="Aptos"/>
               </w:rPr>
-              <w:t> </w:t>
+              <w:t>(Av = -1, 0dB)</w:t>
             </w:r>
           </w:p>
         </w:tc>
         <w:tc>
           <w:tcPr>
-            <w:tcW w:w="1800" w:type="dxa"/>
+            <w:tcW w:w="1257" w:type="dxa"/>
             <w:tcBorders>
               <w:top w:val="single" w:sz="6" w:space="0" w:color="auto"/>
               <w:left w:val="single" w:sz="6" w:space="0" w:color="auto"/>
               <w:bottom w:val="single" w:sz="6" w:space="0" w:color="auto"/>
               <w:right w:val="single" w:sz="6" w:space="0" w:color="auto"/>
             </w:tcBorders>
-            <w:vAlign w:val="center"/>
             <w:hideMark/>
           </w:tcPr>
           <w:p>
@@ -5813,6 +6015,9 @@
               <w:pStyle w:val="paragraph"/>
               <w:spacing w:before="0" w:beforeAutospacing="0" w:after="0" w:afterAutospacing="0"/>
               <w:textAlignment w:val="baseline"/>
+              <w:rPr>
+                <w:rFonts w:ascii="Aptos" w:hAnsi="Aptos"/>
+              </w:rPr>
             </w:pPr>
             <w:r>
               <w:rPr>
@@ -5820,33 +6025,50 @@
                 <w:rFonts w:ascii="Aptos" w:hAnsi="Aptos"/>
                 <w:lang w:val="en-US"/>
               </w:rPr>
-              <w:t>84.140kHz</w:t>
-            </w:r>
-            <w:r>
-              <w:rPr>
-                <w:rStyle w:val="eop"/>
-                <w:rFonts w:ascii="Aptos" w:hAnsi="Aptos"/>
-              </w:rPr>
-              <w:t> </w:t>
+              <w:t>675kHz</w:t>
             </w:r>
           </w:p>
         </w:tc>
-      </w:tr>
-      <w:tr>
-        <w:trPr>
-          <w:trHeight w:val="300"/>
-          <w:jc w:val="center"/>
-        </w:trPr>
         <w:tc>
           <w:tcPr>
-            <w:tcW w:w="1800" w:type="dxa"/>
+            <w:tcW w:w="1275" w:type="dxa"/>
             <w:tcBorders>
               <w:top w:val="single" w:sz="6" w:space="0" w:color="auto"/>
               <w:left w:val="single" w:sz="6" w:space="0" w:color="auto"/>
               <w:bottom w:val="single" w:sz="6" w:space="0" w:color="auto"/>
               <w:right w:val="single" w:sz="6" w:space="0" w:color="auto"/>
             </w:tcBorders>
-            <w:vAlign w:val="center"/>
+          </w:tcPr>
+          <w:p>
+            <w:pPr>
+              <w:pStyle w:val="paragraph"/>
+              <w:spacing w:before="0" w:beforeAutospacing="0" w:after="0" w:afterAutospacing="0"/>
+              <w:textAlignment w:val="baseline"/>
+              <w:rPr>
+                <w:rStyle w:val="normaltextrun"/>
+                <w:rFonts w:ascii="Aptos" w:hAnsi="Aptos"/>
+                <w:lang w:val="en-US"/>
+              </w:rPr>
+            </w:pPr>
+            <w:r>
+              <w:rPr>
+                <w:rStyle w:val="normaltextrun"/>
+                <w:rFonts w:ascii="Aptos" w:hAnsi="Aptos"/>
+                <w:lang w:val="en-US"/>
+              </w:rPr>
+              <w:t>675kHz</w:t>
+            </w:r>
+          </w:p>
+        </w:tc>
+        <w:tc>
+          <w:tcPr>
+            <w:tcW w:w="1247" w:type="dxa"/>
+            <w:tcBorders>
+              <w:top w:val="single" w:sz="6" w:space="0" w:color="auto"/>
+              <w:left w:val="single" w:sz="6" w:space="0" w:color="auto"/>
+              <w:bottom w:val="single" w:sz="6" w:space="0" w:color="auto"/>
+              <w:right w:val="single" w:sz="6" w:space="0" w:color="auto"/>
+            </w:tcBorders>
             <w:hideMark/>
           </w:tcPr>
           <w:p>
@@ -5854,26 +6076,66 @@
               <w:pStyle w:val="paragraph"/>
               <w:spacing w:before="0" w:beforeAutospacing="0" w:after="0" w:afterAutospacing="0"/>
               <w:textAlignment w:val="baseline"/>
+              <w:rPr>
+                <w:rFonts w:ascii="Aptos" w:hAnsi="Aptos"/>
+              </w:rPr>
             </w:pPr>
             <w:r>
               <w:rPr>
-                <w:rStyle w:val="eop"/>
+                <w:rStyle w:val="normaltextrun"/>
                 <w:rFonts w:ascii="Aptos" w:hAnsi="Aptos"/>
-              </w:rPr>
-              <w:t> </w:t>
+                <w:lang w:val="en-US"/>
+              </w:rPr>
+              <w:t>28.18kHz</w:t>
             </w:r>
           </w:p>
         </w:tc>
         <w:tc>
           <w:tcPr>
-            <w:tcW w:w="1800" w:type="dxa"/>
+            <w:tcW w:w="1447" w:type="dxa"/>
             <w:tcBorders>
               <w:top w:val="single" w:sz="6" w:space="0" w:color="auto"/>
               <w:left w:val="single" w:sz="6" w:space="0" w:color="auto"/>
               <w:bottom w:val="single" w:sz="6" w:space="0" w:color="auto"/>
               <w:right w:val="single" w:sz="6" w:space="0" w:color="auto"/>
             </w:tcBorders>
-            <w:vAlign w:val="center"/>
+          </w:tcPr>
+          <w:p>
+            <w:pPr>
+              <w:pStyle w:val="paragraph"/>
+              <w:spacing w:before="0" w:beforeAutospacing="0" w:after="0" w:afterAutospacing="0"/>
+              <w:textAlignment w:val="baseline"/>
+              <w:rPr>
+                <w:rStyle w:val="normaltextrun"/>
+                <w:rFonts w:ascii="Aptos" w:hAnsi="Aptos"/>
+                <w:lang w:val="en-US"/>
+              </w:rPr>
+            </w:pPr>
+            <w:r>
+              <w:rPr>
+                <w:rStyle w:val="normaltextrun"/>
+                <w:rFonts w:ascii="Aptos" w:hAnsi="Aptos"/>
+                <w:lang w:val="en-US"/>
+              </w:rPr>
+              <w:t>28.18kHz</w:t>
+            </w:r>
+          </w:p>
+        </w:tc>
+      </w:tr>
+      <w:tr>
+        <w:trPr>
+          <w:trHeight w:val="123"/>
+          <w:jc w:val="center"/>
+        </w:trPr>
+        <w:tc>
+          <w:tcPr>
+            <w:tcW w:w="3697" w:type="dxa"/>
+            <w:tcBorders>
+              <w:top w:val="single" w:sz="6" w:space="0" w:color="auto"/>
+              <w:left w:val="single" w:sz="6" w:space="0" w:color="auto"/>
+              <w:bottom w:val="single" w:sz="6" w:space="0" w:color="auto"/>
+              <w:right w:val="single" w:sz="6" w:space="0" w:color="auto"/>
+            </w:tcBorders>
             <w:hideMark/>
           </w:tcPr>
           <w:p>
@@ -5881,34 +6143,69 @@
               <w:pStyle w:val="paragraph"/>
               <w:spacing w:before="0" w:beforeAutospacing="0" w:after="0" w:afterAutospacing="0"/>
               <w:textAlignment w:val="baseline"/>
+              <w:rPr>
+                <w:rFonts w:ascii="Aptos" w:hAnsi="Aptos"/>
+              </w:rPr>
             </w:pPr>
             <w:r>
               <w:rPr>
-                <w:rStyle w:val="normaltextrun"/>
                 <w:rFonts w:ascii="Aptos" w:hAnsi="Aptos"/>
-                <w:lang w:val="en-US"/>
-              </w:rPr>
-              <w:t>A-1</w:t>
+              </w:rPr>
+              <w:t>Non-i</w:t>
             </w:r>
             <w:r>
               <w:rPr>
-                <w:rStyle w:val="eop"/>
                 <w:rFonts w:ascii="Aptos" w:hAnsi="Aptos"/>
               </w:rPr>
-              <w:t> </w:t>
+              <w:t>nverting amplifier (Av = 1</w:t>
+            </w:r>
+            <w:r>
+              <w:rPr>
+                <w:rFonts w:ascii="Aptos" w:hAnsi="Aptos"/>
+              </w:rPr>
+              <w:t>01</w:t>
+            </w:r>
+            <w:r>
+              <w:rPr>
+                <w:rFonts w:ascii="Aptos" w:hAnsi="Aptos"/>
+              </w:rPr>
+              <w:t xml:space="preserve">, </w:t>
+            </w:r>
+            <w:r>
+              <w:rPr>
+                <w:rFonts w:ascii="Aptos" w:hAnsi="Aptos"/>
+              </w:rPr>
+              <w:t>4</w:t>
+            </w:r>
+            <w:r>
+              <w:rPr>
+                <w:rFonts w:ascii="Aptos" w:hAnsi="Aptos"/>
+              </w:rPr>
+              <w:t>0</w:t>
+            </w:r>
+            <w:r>
+              <w:rPr>
+                <w:rFonts w:ascii="Aptos" w:hAnsi="Aptos"/>
+              </w:rPr>
+              <w:t>.08</w:t>
+            </w:r>
+            <w:r>
+              <w:rPr>
+                <w:rFonts w:ascii="Aptos" w:hAnsi="Aptos"/>
+              </w:rPr>
+              <w:t>dB)</w:t>
             </w:r>
           </w:p>
         </w:tc>
         <w:tc>
           <w:tcPr>
-            <w:tcW w:w="1800" w:type="dxa"/>
+            <w:tcW w:w="1257" w:type="dxa"/>
             <w:tcBorders>
               <w:top w:val="single" w:sz="6" w:space="0" w:color="auto"/>
               <w:left w:val="single" w:sz="6" w:space="0" w:color="auto"/>
               <w:bottom w:val="single" w:sz="6" w:space="0" w:color="auto"/>
               <w:right w:val="single" w:sz="6" w:space="0" w:color="auto"/>
             </w:tcBorders>
-            <w:vAlign w:val="center"/>
             <w:hideMark/>
           </w:tcPr>
           <w:p>
@@ -5916,6 +6213,9 @@
               <w:pStyle w:val="paragraph"/>
               <w:spacing w:before="0" w:beforeAutospacing="0" w:after="0" w:afterAutospacing="0"/>
               <w:textAlignment w:val="baseline"/>
+              <w:rPr>
+                <w:rFonts w:ascii="Aptos" w:hAnsi="Aptos"/>
+              </w:rPr>
             </w:pPr>
             <w:r>
               <w:rPr>
@@ -5923,27 +6223,50 @@
                 <w:rFonts w:ascii="Aptos" w:hAnsi="Aptos"/>
                 <w:lang w:val="en-US"/>
               </w:rPr>
-              <w:t>675kHz</w:t>
-            </w:r>
-            <w:r>
-              <w:rPr>
-                <w:rStyle w:val="eop"/>
-                <w:rFonts w:ascii="Aptos" w:hAnsi="Aptos"/>
-              </w:rPr>
-              <w:t> </w:t>
+              <w:t>7860Hz</w:t>
             </w:r>
           </w:p>
         </w:tc>
         <w:tc>
           <w:tcPr>
-            <w:tcW w:w="1800" w:type="dxa"/>
+            <w:tcW w:w="1275" w:type="dxa"/>
             <w:tcBorders>
               <w:top w:val="single" w:sz="6" w:space="0" w:color="auto"/>
               <w:left w:val="single" w:sz="6" w:space="0" w:color="auto"/>
               <w:bottom w:val="single" w:sz="6" w:space="0" w:color="auto"/>
               <w:right w:val="single" w:sz="6" w:space="0" w:color="auto"/>
             </w:tcBorders>
-            <w:vAlign w:val="center"/>
+          </w:tcPr>
+          <w:p>
+            <w:pPr>
+              <w:pStyle w:val="paragraph"/>
+              <w:spacing w:before="0" w:beforeAutospacing="0" w:after="0" w:afterAutospacing="0"/>
+              <w:textAlignment w:val="baseline"/>
+              <w:rPr>
+                <w:rStyle w:val="normaltextrun"/>
+                <w:rFonts w:ascii="Aptos" w:hAnsi="Aptos"/>
+                <w:lang w:val="en-US"/>
+              </w:rPr>
+            </w:pPr>
+            <w:r>
+              <w:rPr>
+                <w:rStyle w:val="normaltextrun"/>
+                <w:rFonts w:ascii="Aptos" w:hAnsi="Aptos"/>
+                <w:lang w:val="en-US"/>
+              </w:rPr>
+              <w:t>793.86kHz</w:t>
+            </w:r>
+          </w:p>
+        </w:tc>
+        <w:tc>
+          <w:tcPr>
+            <w:tcW w:w="1247" w:type="dxa"/>
+            <w:tcBorders>
+              <w:top w:val="single" w:sz="6" w:space="0" w:color="auto"/>
+              <w:left w:val="single" w:sz="6" w:space="0" w:color="auto"/>
+              <w:bottom w:val="single" w:sz="6" w:space="0" w:color="auto"/>
+              <w:right w:val="single" w:sz="6" w:space="0" w:color="auto"/>
+            </w:tcBorders>
             <w:hideMark/>
           </w:tcPr>
           <w:p>
@@ -5951,6 +6274,9 @@
               <w:pStyle w:val="paragraph"/>
               <w:spacing w:before="0" w:beforeAutospacing="0" w:after="0" w:afterAutospacing="0"/>
               <w:textAlignment w:val="baseline"/>
+              <w:rPr>
+                <w:rFonts w:ascii="Aptos" w:hAnsi="Aptos"/>
+              </w:rPr>
             </w:pPr>
             <w:r>
               <w:rPr>
@@ -5958,33 +6284,56 @@
                 <w:rFonts w:ascii="Aptos" w:hAnsi="Aptos"/>
                 <w:lang w:val="en-US"/>
               </w:rPr>
-              <w:t>28.18kHz</w:t>
+              <w:t>7600Hz</w:t>
             </w:r>
+          </w:p>
+        </w:tc>
+        <w:tc>
+          <w:tcPr>
+            <w:tcW w:w="1447" w:type="dxa"/>
+            <w:tcBorders>
+              <w:top w:val="single" w:sz="6" w:space="0" w:color="auto"/>
+              <w:left w:val="single" w:sz="6" w:space="0" w:color="auto"/>
+              <w:bottom w:val="single" w:sz="6" w:space="0" w:color="auto"/>
+              <w:right w:val="single" w:sz="6" w:space="0" w:color="auto"/>
+            </w:tcBorders>
+          </w:tcPr>
+          <w:p>
+            <w:pPr>
+              <w:pStyle w:val="paragraph"/>
+              <w:spacing w:before="0" w:beforeAutospacing="0" w:after="0" w:afterAutospacing="0"/>
+              <w:textAlignment w:val="baseline"/>
+              <w:rPr>
+                <w:rStyle w:val="normaltextrun"/>
+                <w:rFonts w:ascii="Aptos" w:hAnsi="Aptos"/>
+                <w:lang w:val="en-US"/>
+              </w:rPr>
+            </w:pPr>
             <w:r>
               <w:rPr>
-                <w:rStyle w:val="eop"/>
+                <w:rStyle w:val="normaltextrun"/>
                 <w:rFonts w:ascii="Aptos" w:hAnsi="Aptos"/>
-              </w:rPr>
-              <w:t> </w:t>
+                <w:lang w:val="en-US"/>
+              </w:rPr>
+              <w:t>767.6kHz</w:t>
             </w:r>
           </w:p>
         </w:tc>
       </w:tr>
       <w:tr>
         <w:trPr>
-          <w:trHeight w:val="300"/>
+          <w:trHeight w:val="359"/>
           <w:jc w:val="center"/>
         </w:trPr>
         <w:tc>
           <w:tcPr>
-            <w:tcW w:w="1800" w:type="dxa"/>
+            <w:tcW w:w="3697" w:type="dxa"/>
             <w:tcBorders>
               <w:top w:val="single" w:sz="6" w:space="0" w:color="auto"/>
               <w:left w:val="single" w:sz="6" w:space="0" w:color="auto"/>
               <w:bottom w:val="single" w:sz="6" w:space="0" w:color="auto"/>
               <w:right w:val="single" w:sz="6" w:space="0" w:color="auto"/>
             </w:tcBorders>
-            <w:vAlign w:val="center"/>
             <w:hideMark/>
           </w:tcPr>
           <w:p>
@@ -5992,26 +6341,51 @@
               <w:pStyle w:val="paragraph"/>
               <w:spacing w:before="0" w:beforeAutospacing="0" w:after="0" w:afterAutospacing="0"/>
               <w:textAlignment w:val="baseline"/>
+              <w:rPr>
+                <w:rFonts w:ascii="Aptos" w:hAnsi="Aptos"/>
+              </w:rPr>
             </w:pPr>
             <w:r>
               <w:rPr>
-                <w:rStyle w:val="eop"/>
                 <w:rFonts w:ascii="Aptos" w:hAnsi="Aptos"/>
               </w:rPr>
-              <w:t> </w:t>
+              <w:t>Inverting amplifier (Av = -1</w:t>
+            </w:r>
+            <w:r>
+              <w:rPr>
+                <w:rFonts w:ascii="Aptos" w:hAnsi="Aptos"/>
+              </w:rPr>
+              <w:t>00</w:t>
+            </w:r>
+            <w:r>
+              <w:rPr>
+                <w:rFonts w:ascii="Aptos" w:hAnsi="Aptos"/>
+              </w:rPr>
+              <w:t xml:space="preserve">, </w:t>
+            </w:r>
+            <w:r>
+              <w:rPr>
+                <w:rFonts w:ascii="Aptos" w:hAnsi="Aptos"/>
+              </w:rPr>
+              <w:t>40</w:t>
+            </w:r>
+            <w:r>
+              <w:rPr>
+                <w:rFonts w:ascii="Aptos" w:hAnsi="Aptos"/>
+              </w:rPr>
+              <w:t>dB)</w:t>
             </w:r>
           </w:p>
         </w:tc>
         <w:tc>
           <w:tcPr>
-            <w:tcW w:w="1800" w:type="dxa"/>
+            <w:tcW w:w="1257" w:type="dxa"/>
             <w:tcBorders>
               <w:top w:val="single" w:sz="6" w:space="0" w:color="auto"/>
               <w:left w:val="single" w:sz="6" w:space="0" w:color="auto"/>
               <w:bottom w:val="single" w:sz="6" w:space="0" w:color="auto"/>
               <w:right w:val="single" w:sz="6" w:space="0" w:color="auto"/>
             </w:tcBorders>
-            <w:vAlign w:val="center"/>
             <w:hideMark/>
           </w:tcPr>
           <w:p>
@@ -6019,6 +6393,9 @@
               <w:pStyle w:val="paragraph"/>
               <w:spacing w:before="0" w:beforeAutospacing="0" w:after="0" w:afterAutospacing="0"/>
               <w:textAlignment w:val="baseline"/>
+              <w:rPr>
+                <w:rFonts w:ascii="Aptos" w:hAnsi="Aptos"/>
+              </w:rPr>
             </w:pPr>
             <w:r>
               <w:rPr>
@@ -6026,27 +6403,57 @@
                 <w:rFonts w:ascii="Aptos" w:hAnsi="Aptos"/>
                 <w:lang w:val="en-US"/>
               </w:rPr>
-              <w:t>A100</w:t>
-            </w:r>
-            <w:r>
-              <w:rPr>
-                <w:rStyle w:val="eop"/>
-                <w:rFonts w:ascii="Aptos" w:hAnsi="Aptos"/>
-              </w:rPr>
-              <w:t> </w:t>
+              <w:t>7780Hz</w:t>
             </w:r>
           </w:p>
         </w:tc>
         <w:tc>
           <w:tcPr>
-            <w:tcW w:w="1800" w:type="dxa"/>
+            <w:tcW w:w="1275" w:type="dxa"/>
             <w:tcBorders>
               <w:top w:val="single" w:sz="6" w:space="0" w:color="auto"/>
               <w:left w:val="single" w:sz="6" w:space="0" w:color="auto"/>
               <w:bottom w:val="single" w:sz="6" w:space="0" w:color="auto"/>
               <w:right w:val="single" w:sz="6" w:space="0" w:color="auto"/>
             </w:tcBorders>
-            <w:vAlign w:val="center"/>
+          </w:tcPr>
+          <w:p>
+            <w:pPr>
+              <w:pStyle w:val="paragraph"/>
+              <w:spacing w:before="0" w:beforeAutospacing="0" w:after="0" w:afterAutospacing="0"/>
+              <w:textAlignment w:val="baseline"/>
+              <w:rPr>
+                <w:rStyle w:val="normaltextrun"/>
+                <w:rFonts w:ascii="Aptos" w:hAnsi="Aptos"/>
+                <w:lang w:val="en-US"/>
+              </w:rPr>
+            </w:pPr>
+            <w:r>
+              <w:rPr>
+                <w:rStyle w:val="normaltextrun"/>
+                <w:rFonts w:ascii="Aptos" w:hAnsi="Aptos"/>
+                <w:lang w:val="en-US"/>
+              </w:rPr>
+              <w:t>7</w:t>
+            </w:r>
+            <w:r>
+              <w:rPr>
+                <w:rStyle w:val="normaltextrun"/>
+                <w:rFonts w:ascii="Aptos" w:hAnsi="Aptos"/>
+              </w:rPr>
+              <w:t>78kHz</w:t>
+            </w:r>
+          </w:p>
+        </w:tc>
+        <w:tc>
+          <w:tcPr>
+            <w:tcW w:w="1247" w:type="dxa"/>
+            <w:tcBorders>
+              <w:top w:val="single" w:sz="6" w:space="0" w:color="auto"/>
+              <w:left w:val="single" w:sz="6" w:space="0" w:color="auto"/>
+              <w:bottom w:val="single" w:sz="6" w:space="0" w:color="auto"/>
+              <w:right w:val="single" w:sz="6" w:space="0" w:color="auto"/>
+            </w:tcBorders>
             <w:hideMark/>
           </w:tcPr>
           <w:p>
@@ -6054,6 +6461,9 @@
               <w:pStyle w:val="paragraph"/>
               <w:spacing w:before="0" w:beforeAutospacing="0" w:after="0" w:afterAutospacing="0"/>
               <w:textAlignment w:val="baseline"/>
+              <w:rPr>
+                <w:rFonts w:ascii="Aptos" w:hAnsi="Aptos"/>
+              </w:rPr>
             </w:pPr>
             <w:r>
               <w:rPr>
@@ -6061,102 +6471,30 @@
                 <w:rFonts w:ascii="Aptos" w:hAnsi="Aptos"/>
                 <w:lang w:val="en-US"/>
               </w:rPr>
-              <w:t>7860Hz</w:t>
-            </w:r>
-            <w:r>
-              <w:rPr>
-                <w:rStyle w:val="eop"/>
-                <w:rFonts w:ascii="Aptos" w:hAnsi="Aptos"/>
-              </w:rPr>
-              <w:t> </w:t>
+              <w:t>7670Hz</w:t>
             </w:r>
           </w:p>
         </w:tc>
         <w:tc>
           <w:tcPr>
-            <w:tcW w:w="1800" w:type="dxa"/>
+            <w:tcW w:w="1447" w:type="dxa"/>
             <w:tcBorders>
               <w:top w:val="single" w:sz="6" w:space="0" w:color="auto"/>
               <w:left w:val="single" w:sz="6" w:space="0" w:color="auto"/>
               <w:bottom w:val="single" w:sz="6" w:space="0" w:color="auto"/>
               <w:right w:val="single" w:sz="6" w:space="0" w:color="auto"/>
             </w:tcBorders>
-            <w:vAlign w:val="center"/>
-            <w:hideMark/>
           </w:tcPr>
           <w:p>
             <w:pPr>
               <w:pStyle w:val="paragraph"/>
               <w:spacing w:before="0" w:beforeAutospacing="0" w:after="0" w:afterAutospacing="0"/>
               <w:textAlignment w:val="baseline"/>
-            </w:pPr>
-            <w:r>
               <w:rPr>
                 <w:rStyle w:val="normaltextrun"/>
                 <w:rFonts w:ascii="Aptos" w:hAnsi="Aptos"/>
                 <w:lang w:val="en-US"/>
               </w:rPr>
-              <w:t>7600Hz</w:t>
-            </w:r>
-            <w:r>
-              <w:rPr>
-                <w:rStyle w:val="eop"/>
-                <w:rFonts w:ascii="Aptos" w:hAnsi="Aptos"/>
-              </w:rPr>
-              <w:t> </w:t>
-            </w:r>
-          </w:p>
-        </w:tc>
-      </w:tr>
-      <w:tr>
-        <w:trPr>
-          <w:trHeight w:val="300"/>
-          <w:jc w:val="center"/>
-        </w:trPr>
-        <w:tc>
-          <w:tcPr>
-            <w:tcW w:w="1800" w:type="dxa"/>
-            <w:tcBorders>
-              <w:top w:val="single" w:sz="6" w:space="0" w:color="auto"/>
-              <w:left w:val="single" w:sz="6" w:space="0" w:color="auto"/>
-              <w:bottom w:val="single" w:sz="6" w:space="0" w:color="auto"/>
-              <w:right w:val="single" w:sz="6" w:space="0" w:color="auto"/>
-            </w:tcBorders>
-            <w:vAlign w:val="center"/>
-            <w:hideMark/>
-          </w:tcPr>
-          <w:p>
-            <w:pPr>
-              <w:pStyle w:val="paragraph"/>
-              <w:spacing w:before="0" w:beforeAutospacing="0" w:after="0" w:afterAutospacing="0"/>
-              <w:textAlignment w:val="baseline"/>
-            </w:pPr>
-            <w:r>
-              <w:rPr>
-                <w:rStyle w:val="eop"/>
-                <w:rFonts w:ascii="Aptos" w:hAnsi="Aptos"/>
-              </w:rPr>
-              <w:t> </w:t>
-            </w:r>
-          </w:p>
-        </w:tc>
-        <w:tc>
-          <w:tcPr>
-            <w:tcW w:w="1800" w:type="dxa"/>
-            <w:tcBorders>
-              <w:top w:val="single" w:sz="6" w:space="0" w:color="auto"/>
-              <w:left w:val="single" w:sz="6" w:space="0" w:color="auto"/>
-              <w:bottom w:val="single" w:sz="6" w:space="0" w:color="auto"/>
-              <w:right w:val="single" w:sz="6" w:space="0" w:color="auto"/>
-            </w:tcBorders>
-            <w:vAlign w:val="center"/>
-            <w:hideMark/>
-          </w:tcPr>
-          <w:p>
-            <w:pPr>
-              <w:pStyle w:val="paragraph"/>
-              <w:spacing w:before="0" w:beforeAutospacing="0" w:after="0" w:afterAutospacing="0"/>
-              <w:textAlignment w:val="baseline"/>
             </w:pPr>
             <w:r>
               <w:rPr>
@@ -6164,84 +6502,14 @@
                 <w:rFonts w:ascii="Aptos" w:hAnsi="Aptos"/>
                 <w:lang w:val="en-US"/>
               </w:rPr>
-              <w:t>A-100</w:t>
+              <w:t>7</w:t>
             </w:r>
             <w:r>
               <w:rPr>
-                <w:rStyle w:val="eop"/>
-                <w:rFonts w:ascii="Aptos" w:hAnsi="Aptos"/>
-              </w:rPr>
-              <w:t> </w:t>
-            </w:r>
-          </w:p>
-        </w:tc>
-        <w:tc>
-          <w:tcPr>
-            <w:tcW w:w="1800" w:type="dxa"/>
-            <w:tcBorders>
-              <w:top w:val="single" w:sz="6" w:space="0" w:color="auto"/>
-              <w:left w:val="single" w:sz="6" w:space="0" w:color="auto"/>
-              <w:bottom w:val="single" w:sz="6" w:space="0" w:color="auto"/>
-              <w:right w:val="single" w:sz="6" w:space="0" w:color="auto"/>
-            </w:tcBorders>
-            <w:vAlign w:val="center"/>
-            <w:hideMark/>
-          </w:tcPr>
-          <w:p>
-            <w:pPr>
-              <w:pStyle w:val="paragraph"/>
-              <w:spacing w:before="0" w:beforeAutospacing="0" w:after="0" w:afterAutospacing="0"/>
-              <w:textAlignment w:val="baseline"/>
-            </w:pPr>
-            <w:r>
-              <w:rPr>
                 <w:rStyle w:val="normaltextrun"/>
                 <w:rFonts w:ascii="Aptos" w:hAnsi="Aptos"/>
-                <w:lang w:val="en-US"/>
-              </w:rPr>
-              <w:t>7780Hz</w:t>
-            </w:r>
-            <w:r>
-              <w:rPr>
-                <w:rStyle w:val="eop"/>
-                <w:rFonts w:ascii="Aptos" w:hAnsi="Aptos"/>
-              </w:rPr>
-              <w:t> </w:t>
-            </w:r>
-          </w:p>
-        </w:tc>
-        <w:tc>
-          <w:tcPr>
-            <w:tcW w:w="1800" w:type="dxa"/>
-            <w:tcBorders>
-              <w:top w:val="single" w:sz="6" w:space="0" w:color="auto"/>
-              <w:left w:val="single" w:sz="6" w:space="0" w:color="auto"/>
-              <w:bottom w:val="single" w:sz="6" w:space="0" w:color="auto"/>
-              <w:right w:val="single" w:sz="6" w:space="0" w:color="auto"/>
-            </w:tcBorders>
-            <w:vAlign w:val="center"/>
-            <w:hideMark/>
-          </w:tcPr>
-          <w:p>
-            <w:pPr>
-              <w:pStyle w:val="paragraph"/>
-              <w:spacing w:before="0" w:beforeAutospacing="0" w:after="0" w:afterAutospacing="0"/>
-              <w:textAlignment w:val="baseline"/>
-            </w:pPr>
-            <w:r>
-              <w:rPr>
-                <w:rStyle w:val="normaltextrun"/>
-                <w:rFonts w:ascii="Aptos" w:hAnsi="Aptos"/>
-                <w:lang w:val="en-US"/>
-              </w:rPr>
-              <w:t>7670Hz</w:t>
-            </w:r>
-            <w:r>
-              <w:rPr>
-                <w:rStyle w:val="eop"/>
-                <w:rFonts w:ascii="Aptos" w:hAnsi="Aptos"/>
-              </w:rPr>
-              <w:t> </w:t>
+              </w:rPr>
+              <w:t>67kHz</w:t>
             </w:r>
           </w:p>
         </w:tc>
@@ -6256,6 +6524,35 @@
     </w:p>
     <w:p>
       <w:pPr>
+        <w:rPr>
+          <w:lang w:val="en-US"/>
+        </w:rPr>
+      </w:pPr>
+      <w:r>
+        <w:lastRenderedPageBreak/>
+        <w:t>The simulated GBW of the voltage follower</w:t>
+      </w:r>
+      <w:r>
+        <w:t>,</w:t>
+      </w:r>
+      <w:r>
+        <w:t>1.15MHz</w:t>
+      </w:r>
+      <w:r>
+        <w:t xml:space="preserve">, </w:t>
+      </w:r>
+      <w:r>
+        <w:t xml:space="preserve">agrees closely with the datasheet value of 1.2MHz (Texas Instruments, 2024), but the measured values in Table 1 are lower. At a gain of 100 the measured GBW is about 0.77MHz, in good agreement with the simulated values of about 0.78 to 0.79MHz, although still below the datasheet value. At unity gain the measured results are much lower, at 84kHz for the voltage follower and 28kHz for the inverting amplifier. The non-inverting voltage follower performs better than the inverting amplifier at unity gain, in both simulation and measurement, while the two configurations </w:t>
+      </w:r>
+      <w:r>
+        <w:t xml:space="preserve">with a gain of 100 (40dB) </w:t>
+      </w:r>
+      <w:r>
+        <w:t>have about the same GBW.</w:t>
+      </w:r>
+    </w:p>
+    <w:p>
+      <w:pPr>
         <w:pStyle w:val="Heading2"/>
         <w:rPr>
           <w:lang w:val="en-US"/>
@@ -6399,7 +6696,6 @@
         <w:rPr>
           <w:noProof/>
         </w:rPr>
-        <w:lastRenderedPageBreak/>
         <w:drawing>
           <wp:inline distT="0" distB="0" distL="0" distR="0" wp14:anchorId="7C282BF3" wp14:editId="0C72240A">
             <wp:extent cx="6189345" cy="1970405"/>
@@ -6639,6 +6935,7 @@
         <w:rPr>
           <w:lang w:val="en-US"/>
         </w:rPr>
+        <w:lastRenderedPageBreak/>
         <w:t xml:space="preserve">Figure </w:t>
       </w:r>
       <w:r>
@@ -7090,7 +7387,6 @@
         <w:rPr>
           <w:noProof/>
         </w:rPr>
-        <w:lastRenderedPageBreak/>
         <w:drawing>
           <wp:inline distT="0" distB="0" distL="0" distR="0" wp14:anchorId="2BFC1939" wp14:editId="0BF68FAC">
             <wp:extent cx="6189345" cy="1959610"/>
@@ -7437,6 +7733,7 @@
       </w:pPr>
       <w:proofErr w:type="spellStart"/>
       <w:r>
+        <w:lastRenderedPageBreak/>
         <w:t>Step</w:t>
       </w:r>
       <w:proofErr w:type="spellEnd"/>
@@ -7485,7 +7782,6 @@
           <w:noProof/>
           <w:lang w:val="en-US" w:eastAsia="fi-FI"/>
         </w:rPr>
-        <w:lastRenderedPageBreak/>
         <w:drawing>
           <wp:inline distT="0" distB="0" distL="0" distR="0" wp14:anchorId="35A74B86" wp14:editId="75673E38">
             <wp:extent cx="6189345" cy="2936240"/>
@@ -7701,6 +7997,7 @@
           <w:noProof/>
           <w:lang w:val="fi-FI" w:eastAsia="fi-FI"/>
         </w:rPr>
+        <w:lastRenderedPageBreak/>
         <w:drawing>
           <wp:inline distT="0" distB="0" distL="0" distR="0" wp14:anchorId="6378C04A" wp14:editId="332E8D60">
             <wp:extent cx="6189345" cy="2970530"/>
@@ -7827,7 +8124,6 @@
         </w:rPr>
       </w:pPr>
       <w:r>
-        <w:lastRenderedPageBreak/>
         <w:t>Using cursors on the oscilloscope, ΔV and Δt were read from the output ramp and the slew rate calculated as</w:t>
       </w:r>
       <w:r>
@@ -7973,6 +8269,7 @@
         <w:rPr>
           <w:noProof/>
         </w:rPr>
+        <w:lastRenderedPageBreak/>
         <w:drawing>
           <wp:inline distT="0" distB="0" distL="0" distR="0" wp14:anchorId="4643D3C4" wp14:editId="522256E4">
             <wp:extent cx="6189345" cy="2921635"/>
@@ -8084,7 +8381,7 @@
         <w:rPr>
           <w:noProof/>
         </w:rPr>
-        <w:t>1</w:t>
+        <w:t>2</w:t>
       </w:r>
       <w:r>
         <w:fldChar w:fldCharType="end"/>
@@ -8739,7 +9036,7 @@
         <w:rPr>
           <w:lang w:eastAsia="fi-FI"/>
         </w:rPr>
-        <w:t>The results in Table 1 are consistent with the LM358 being a single-supply op-amp, as described in the methods: the output can swing much closer to the negative rail than to the positive rail. The datasheet gives typical values of 1.4 V and 0.75 V from the positive and negative rails respectively for a load drawing 1 mA (Texas Instruments, 2024). The 10 kΩ load in the simulation draws about 0.9 mA, which is close to that condition, and the output reaches within 0.75 V of the positive rail and 0.08 V of the negative rail, which is better than the datasheet values. The swing also widens as the load resistance increases, from 18.75 V at 1 kΩ to 19.17 V at 10 kΩ.</w:t>
+        <w:t>The results in Table 1 are consistent with the LM358 being a single-supply op-amp, as described in the methods: the output can swing much closer to the negative rail than to the positive rail. The datasheet gives typical values of 1.4V and 0.75V from the positive and negative rails respectively for a load drawing 1mA (Texas Instruments, 2024). The 10kΩ load in the simulation draws about 0.9mA, which is close to that condition, and the output reaches within 0.75V of the positive rail and 0.08V of the negative rail, which is better than the datasheet values. The swing also widens as the load resistance increases, from 18.75V at 1kΩ to 19.17V at 10kΩ.</w:t>
       </w:r>
     </w:p>
     <w:p>
@@ -8751,13 +9048,14 @@
     </w:p>
     <w:p>
       <w:pPr>
-        <w:keepNext/>
+        <w:pStyle w:val="Caption"/>
       </w:pPr>
       <w:r>
         <w:rPr>
           <w:noProof/>
           <w:lang w:eastAsia="fi-FI"/>
         </w:rPr>
+        <w:lastRenderedPageBreak/>
         <w:drawing>
           <wp:inline distT="0" distB="0" distL="0" distR="0" wp14:anchorId="3AC12515" wp14:editId="69554FE5">
             <wp:extent cx="6189345" cy="2679065"/>
@@ -8794,6 +9092,30 @@
           </wp:inline>
         </w:drawing>
       </w:r>
+      <w:r>
+        <w:t xml:space="preserve">Table </w:t>
+      </w:r>
+      <w:r>
+        <w:fldChar w:fldCharType="begin"/>
+      </w:r>
+      <w:r>
+        <w:instrText xml:space="preserve"> SEQ Table \* ARABIC </w:instrText>
+      </w:r>
+      <w:r>
+        <w:fldChar w:fldCharType="separate"/>
+      </w:r>
+      <w:r>
+        <w:rPr>
+          <w:noProof/>
+        </w:rPr>
+        <w:t>3</w:t>
+      </w:r>
+      <w:r>
+        <w:fldChar w:fldCharType="end"/>
+      </w:r>
+      <w:r>
+        <w:t>.</w:t>
+      </w:r>
     </w:p>
     <w:p>
       <w:pPr>
@@ -8983,31 +9305,28 @@
         <w:t>OH</w:t>
       </w:r>
       <w:r>
-        <w:t xml:space="preserve"> = 3.613V </w:t>
-      </w:r>
-      <w:r>
+        <w:t xml:space="preserve"> = 3.613V and V</w:t>
+      </w:r>
+      <w:r>
+        <w:rPr>
+          <w:vertAlign w:val="subscript"/>
+        </w:rPr>
+        <w:t>OL</w:t>
+      </w:r>
+      <w:r>
+        <w:t xml:space="preserve"> = −2.598V. The clipped parts of the waveform in Figure 25 are therefore set by the output current limit of the op-amp rather than by the supply voltage.</w:t>
+      </w:r>
+    </w:p>
+    <w:p/>
+    <w:p>
+      <w:pPr>
+        <w:keepNext/>
+      </w:pPr>
+      <w:r>
+        <w:rPr>
+          <w:noProof/>
+        </w:rPr>
         <w:lastRenderedPageBreak/>
-        <w:t>and V</w:t>
-      </w:r>
-      <w:r>
-        <w:rPr>
-          <w:vertAlign w:val="subscript"/>
-        </w:rPr>
-        <w:t>OL</w:t>
-      </w:r>
-      <w:r>
-        <w:t xml:space="preserve"> = −2.598V. The clipped parts of the waveform in Figure 25 are therefore set by the output current limit of the op-amp rather than by the supply voltage.</w:t>
-      </w:r>
-    </w:p>
-    <w:p/>
-    <w:p>
-      <w:pPr>
-        <w:keepNext/>
-      </w:pPr>
-      <w:r>
-        <w:rPr>
-          <w:noProof/>
-        </w:rPr>
         <w:drawing>
           <wp:inline distT="0" distB="0" distL="0" distR="0" wp14:anchorId="251CF27A" wp14:editId="1CED4459">
             <wp:extent cx="6189345" cy="2679065"/>
@@ -9377,9 +9696,108 @@
       </w:r>
     </w:p>
     <w:p/>
+    <w:p>
+      <w:pPr>
+        <w:keepNext/>
+      </w:pPr>
+      <w:r>
+        <w:rPr>
+          <w:noProof/>
+        </w:rPr>
+        <w:lastRenderedPageBreak/>
+        <w:drawing>
+          <wp:inline distT="0" distB="0" distL="0" distR="0" wp14:anchorId="39012C91" wp14:editId="7AD54E8B">
+            <wp:extent cx="6189345" cy="3984625"/>
+            <wp:effectExtent l="0" t="0" r="0" b="3175"/>
+            <wp:docPr id="1867589635" name="Picture 26"/>
+            <wp:cNvGraphicFramePr>
+              <a:graphicFrameLocks xmlns:a="http://schemas.openxmlformats.org/drawingml/2006/main" noChangeAspect="1"/>
+            </wp:cNvGraphicFramePr>
+            <a:graphic xmlns:a="http://schemas.openxmlformats.org/drawingml/2006/main">
+              <a:graphicData uri="http://schemas.openxmlformats.org/drawingml/2006/picture">
+                <pic:pic xmlns:pic="http://schemas.openxmlformats.org/drawingml/2006/picture">
+                  <pic:nvPicPr>
+                    <pic:cNvPr id="1867589635" name="Picture 1867589635"/>
+                    <pic:cNvPicPr/>
+                  </pic:nvPicPr>
+                  <pic:blipFill>
+                    <a:blip r:embed="rId42">
+                      <a:extLst>
+                        <a:ext uri="{28A0092B-C50C-407E-A947-70E740481C1C}">
+                          <a14:useLocalDpi xmlns:a14="http://schemas.microsoft.com/office/drawing/2010/main" val="0"/>
+                        </a:ext>
+                      </a:extLst>
+                    </a:blip>
+                    <a:stretch>
+                      <a:fillRect/>
+                    </a:stretch>
+                  </pic:blipFill>
+                  <pic:spPr>
+                    <a:xfrm>
+                      <a:off x="0" y="0"/>
+                      <a:ext cx="6189345" cy="3984625"/>
+                    </a:xfrm>
+                    <a:prstGeom prst="rect">
+                      <a:avLst/>
+                    </a:prstGeom>
+                  </pic:spPr>
+                </pic:pic>
+              </a:graphicData>
+            </a:graphic>
+          </wp:inline>
+        </w:drawing>
+      </w:r>
+    </w:p>
+    <w:p>
+      <w:pPr>
+        <w:pStyle w:val="Caption"/>
+      </w:pPr>
+      <w:r>
+        <w:t xml:space="preserve">Figure </w:t>
+      </w:r>
+      <w:r>
+        <w:fldChar w:fldCharType="begin"/>
+      </w:r>
+      <w:r>
+        <w:instrText xml:space="preserve"> SEQ Figure \* ARABIC </w:instrText>
+      </w:r>
+      <w:r>
+        <w:fldChar w:fldCharType="separate"/>
+      </w:r>
+      <w:r>
+        <w:rPr>
+          <w:noProof/>
+        </w:rPr>
+        <w:t>30</w:t>
+      </w:r>
+      <w:r>
+        <w:fldChar w:fldCharType="end"/>
+      </w:r>
+      <w:r>
+        <w:t>.</w:t>
+      </w:r>
+    </w:p>
     <w:p/>
     <w:p>
       <w:pPr>
+        <w:pStyle w:val="Heading2"/>
+      </w:pPr>
+      <w:r>
+        <w:t>Input offset voltage</w:t>
+      </w:r>
+    </w:p>
+    <w:p/>
+    <w:p>
+      <w:pPr>
+        <w:pStyle w:val="Heading2"/>
+      </w:pPr>
+      <w:r>
+        <w:t>Input-referred noise</w:t>
+      </w:r>
+    </w:p>
+    <w:p/>
+    <w:p>
+      <w:pPr>
         <w:rPr>
           <w:lang w:val="en-US"/>
         </w:rPr>
@@ -9591,6 +10009,7 @@
         <w:rPr>
           <w:lang w:val="en-US"/>
         </w:rPr>
+        <w:lastRenderedPageBreak/>
         <w:t>The measurement results should b</w:t>
       </w:r>
       <w:r>
@@ -11562,7 +11981,7 @@
                           </pic:cNvPicPr>
                         </pic:nvPicPr>
                         <pic:blipFill>
-                          <a:blip r:embed="rId42"/>
+                          <a:blip r:embed="rId43"/>
                           <a:stretch>
                             <a:fillRect/>
                           </a:stretch>
@@ -11591,7 +12010,7 @@
                           </pic:cNvPicPr>
                         </pic:nvPicPr>
                         <pic:blipFill>
-                          <a:blip r:embed="rId43"/>
+                          <a:blip r:embed="rId44"/>
                           <a:stretch>
                             <a:fillRect/>
                           </a:stretch>
@@ -11620,7 +12039,7 @@
                           </pic:cNvPicPr>
                         </pic:nvPicPr>
                         <pic:blipFill>
-                          <a:blip r:embed="rId44"/>
+                          <a:blip r:embed="rId45"/>
                           <a:stretch>
                             <a:fillRect/>
                           </a:stretch>
@@ -11649,7 +12068,7 @@
                           </pic:cNvPicPr>
                         </pic:nvPicPr>
                         <pic:blipFill>
-                          <a:blip r:embed="rId45"/>
+                          <a:blip r:embed="rId46"/>
                           <a:stretch>
                             <a:fillRect/>
                           </a:stretch>
@@ -11678,7 +12097,7 @@
                           </pic:cNvPicPr>
                         </pic:nvPicPr>
                         <pic:blipFill>
-                          <a:blip r:embed="rId46"/>
+                          <a:blip r:embed="rId47"/>
                           <a:stretch>
                             <a:fillRect/>
                           </a:stretch>
@@ -11728,19 +12147,19 @@
                   <o:lock v:ext="edit" aspectratio="t"/>
                 </v:shapetype>
                 <v:shape id="Picture 2" o:spid="_x0000_s1027" type="#_x0000_t75" style="position:absolute;width:22384;height:19252;visibility:visible;mso-wrap-style:square" o:gfxdata="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">
-                  <v:imagedata r:id="rId47" o:title=""/>
+                  <v:imagedata r:id="rId48" o:title=""/>
                 </v:shape>
                 <v:shape id="Picture 3" o:spid="_x0000_s1028" type="#_x0000_t75" style="position:absolute;left:23399;width:22385;height:19252;visibility:visible;mso-wrap-style:square" o:gfxdata="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">
-                  <v:imagedata r:id="rId48" o:title=""/>
+                  <v:imagedata r:id="rId49" o:title=""/>
                 </v:shape>
                 <v:shape id="Picture 4" o:spid="_x0000_s1029" type="#_x0000_t75" style="position:absolute;top:18071;width:22384;height:18417;visibility:visible;mso-wrap-style:square" o:gfxdata="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">
-                  <v:imagedata r:id="rId49" o:title=""/>
+                  <v:imagedata r:id="rId50" o:title=""/>
                 </v:shape>
                 <v:shape id="Picture 5" o:spid="_x0000_s1030" type="#_x0000_t75" style="position:absolute;left:22384;top:17653;width:23400;height:19253;visibility:visible;mso-wrap-style:square" o:gfxdata="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">
-                  <v:imagedata r:id="rId50" o:title=""/>
+                  <v:imagedata r:id="rId51" o:title=""/>
                 </v:shape>
                 <v:shape id="Picture 6" o:spid="_x0000_s1031" type="#_x0000_t75" style="position:absolute;left:11688;top:36756;width:22396;height:3494;visibility:visible;mso-wrap-style:square" o:gfxdata="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">
-                  <v:imagedata r:id="rId51" o:title=""/>
+                  <v:imagedata r:id="rId52" o:title=""/>
                 </v:shape>
                 <w10:wrap type="topAndBottom" anchory="page"/>
               </v:group>
@@ -12465,7 +12884,7 @@
         </w:rPr>
         <w:t xml:space="preserve"> Available </w:t>
       </w:r>
-      <w:hyperlink r:id="rId52" w:history="1">
+      <w:hyperlink r:id="rId53" w:history="1">
         <w:r>
           <w:rPr>
             <w:rStyle w:val="Hyperlink"/>
@@ -12559,7 +12978,7 @@
         </w:rPr>
         <w:t xml:space="preserve">. Dallas, TX: Texas Instruments. Available at: </w:t>
       </w:r>
-      <w:hyperlink r:id="rId53" w:history="1">
+      <w:hyperlink r:id="rId54" w:history="1">
         <w:r>
           <w:rPr>
             <w:rStyle w:val="Hyperlink"/>
@@ -12647,7 +13066,7 @@
       <w:r>
         <w:t xml:space="preserve">Available at: </w:t>
       </w:r>
-      <w:hyperlink r:id="rId54" w:history="1">
+      <w:hyperlink r:id="rId55" w:history="1">
         <w:r>
           <w:rPr>
             <w:rStyle w:val="Hyperlink"/>
@@ -12757,7 +13176,7 @@
       <w:r>
         <w:t xml:space="preserve">Available at: </w:t>
       </w:r>
-      <w:hyperlink r:id="rId55" w:tgtFrame="_blank" w:history="1">
+      <w:hyperlink r:id="rId56" w:tgtFrame="_blank" w:history="1">
         <w:r>
           <w:rPr>
             <w:rStyle w:val="Hyperlink"/>
@@ -12991,10 +13410,10 @@
       </w:pPr>
     </w:p>
     <w:sectPr>
-      <w:headerReference w:type="default" r:id="rId56"/>
-      <w:footerReference w:type="default" r:id="rId57"/>
-      <w:headerReference w:type="first" r:id="rId58"/>
-      <w:footerReference w:type="first" r:id="rId59"/>
+      <w:headerReference w:type="default" r:id="rId57"/>
+      <w:footerReference w:type="default" r:id="rId58"/>
+      <w:headerReference w:type="first" r:id="rId59"/>
+      <w:footerReference w:type="first" r:id="rId60"/>
       <w:type w:val="continuous"/>
       <w:pgSz w:w="11907" w:h="16840" w:code="9"/>
       <w:pgMar w:top="1440" w:right="1080" w:bottom="1440" w:left="1080" w:header="708" w:footer="708" w:gutter="0"/>

</xml_diff>

<commit_message>
corssover distortion done maybe
</commit_message>
<xml_diff>
--- a/report_lab3.docx
+++ b/report_lab3.docx
@@ -3167,6 +3167,17 @@
       </w:r>
     </w:p>
     <w:p/>
+    <w:p>
+      <w:pPr>
+        <w:pStyle w:val="Heading2"/>
+      </w:pPr>
+      <w:r>
+        <w:t>Input offset voltage</w:t>
+      </w:r>
+    </w:p>
+    <w:p/>
+    <w:p/>
+    <w:p/>
     <w:p/>
     <w:p/>
     <w:p>
@@ -3487,6 +3498,7 @@
         <w:rPr>
           <w:lang w:val="en-US"/>
         </w:rPr>
+        <w:lastRenderedPageBreak/>
         <w:t>Sometimes using equations is necessary</w:t>
       </w:r>
       <w:r>
@@ -3969,7 +3981,6 @@
         <w:rPr>
           <w:noProof/>
         </w:rPr>
-        <w:lastRenderedPageBreak/>
         <w:drawing>
           <wp:inline distT="0" distB="0" distL="0" distR="0" wp14:anchorId="04ADC335" wp14:editId="3777AD4C">
             <wp:extent cx="4381641" cy="2690397"/>
@@ -9574,9 +9585,9 @@
           <w:noProof/>
         </w:rPr>
         <w:drawing>
-          <wp:inline distT="0" distB="0" distL="0" distR="0" wp14:anchorId="440F53BE" wp14:editId="59D77281">
-            <wp:extent cx="4981204" cy="3206839"/>
-            <wp:effectExtent l="0" t="0" r="0" b="0"/>
+          <wp:inline distT="0" distB="0" distL="0" distR="0" wp14:anchorId="440F53BE" wp14:editId="47B6CCC2">
+            <wp:extent cx="4617720" cy="2972833"/>
+            <wp:effectExtent l="0" t="0" r="5080" b="0"/>
             <wp:docPr id="906249422" name="Picture 23"/>
             <wp:cNvGraphicFramePr>
               <a:graphicFrameLocks xmlns:a="http://schemas.openxmlformats.org/drawingml/2006/main" noChangeAspect="1"/>
@@ -9603,7 +9614,7 @@
                   <pic:spPr>
                     <a:xfrm>
                       <a:off x="0" y="0"/>
-                      <a:ext cx="5003624" cy="3221273"/>
+                      <a:ext cx="4662960" cy="3001958"/>
                     </a:xfrm>
                     <a:prstGeom prst="rect">
                       <a:avLst/>
@@ -9669,19 +9680,22 @@
     </w:p>
     <w:p/>
     <w:p>
+      <w:r>
+        <w:t>The crossover distortion is not caused by the input stage, since the LM358 has no complementary NPN and PNP input pairs as found in dual-input rail-to-rail amplifiers. Instead, each input has a single composite darlington pair. Most of the distortion therefore originates in the output stage, where control passes between the Darlington pair that sources current and the PNP transistor connected to the output that sinks current to the load, as seen in Figure 31.</w:t>
+      </w:r>
+    </w:p>
+    <w:p/>
+    <w:p>
       <w:pPr>
         <w:keepNext/>
         <w:jc w:val="center"/>
       </w:pPr>
       <w:r>
-        <w:rPr>
-          <w:noProof/>
-        </w:rPr>
         <w:drawing>
-          <wp:inline distT="0" distB="0" distL="0" distR="0" wp14:anchorId="4F499D70" wp14:editId="71DD822A">
-            <wp:extent cx="4978400" cy="3205034"/>
-            <wp:effectExtent l="0" t="0" r="0" b="0"/>
-            <wp:docPr id="1045293125" name="Picture 24"/>
+          <wp:inline distT="0" distB="0" distL="0" distR="0" wp14:anchorId="6F6D6834" wp14:editId="7F915924">
+            <wp:extent cx="4070751" cy="2640330"/>
+            <wp:effectExtent l="0" t="0" r="6350" b="1270"/>
+            <wp:docPr id="1728756466" name="Picture 1"/>
             <wp:cNvGraphicFramePr>
               <a:graphicFrameLocks xmlns:a="http://schemas.openxmlformats.org/drawingml/2006/main" noChangeAspect="1"/>
             </wp:cNvGraphicFramePr>
@@ -9689,17 +9703,11 @@
               <a:graphicData uri="http://schemas.openxmlformats.org/drawingml/2006/picture">
                 <pic:pic xmlns:pic="http://schemas.openxmlformats.org/drawingml/2006/picture">
                   <pic:nvPicPr>
-                    <pic:cNvPr id="1045293125" name="Picture 1045293125"/>
+                    <pic:cNvPr id="1728756466" name=""/>
                     <pic:cNvPicPr/>
                   </pic:nvPicPr>
                   <pic:blipFill>
-                    <a:blip r:embed="rId41" cstate="print">
-                      <a:extLst>
-                        <a:ext uri="{28A0092B-C50C-407E-A947-70E740481C1C}">
-                          <a14:useLocalDpi xmlns:a14="http://schemas.microsoft.com/office/drawing/2010/main" val="0"/>
-                        </a:ext>
-                      </a:extLst>
-                    </a:blip>
+                    <a:blip r:embed="rId41"/>
                     <a:stretch>
                       <a:fillRect/>
                     </a:stretch>
@@ -9707,7 +9715,7 @@
                   <pic:spPr>
                     <a:xfrm>
                       <a:off x="0" y="0"/>
-                      <a:ext cx="5021296" cy="3232650"/>
+                      <a:ext cx="4148180" cy="2690551"/>
                     </a:xfrm>
                     <a:prstGeom prst="rect">
                       <a:avLst/>
@@ -9723,7 +9731,6 @@
     <w:p>
       <w:pPr>
         <w:pStyle w:val="Caption"/>
-        <w:ind w:left="0" w:firstLine="0"/>
       </w:pPr>
       <w:r>
         <w:t xml:space="preserve">Figure </w:t>
@@ -9741,43 +9748,30 @@
         <w:rPr>
           <w:noProof/>
         </w:rPr>
-        <w:t>29</w:t>
+        <w:t>31</w:t>
       </w:r>
       <w:r>
         <w:fldChar w:fldCharType="end"/>
       </w:r>
       <w:r>
+        <w:t xml:space="preserve">. Functional block diagram of LM358 </w:t>
+      </w:r>
+      <w:r>
+        <w:rPr>
+          <w:lang w:eastAsia="fi-FI"/>
+        </w:rPr>
+        <w:t>(Texas Instruments, 2024</w:t>
+      </w:r>
+      <w:r>
+        <w:rPr>
+          <w:lang w:eastAsia="fi-FI"/>
+        </w:rPr>
+        <w:t>)</w:t>
+      </w:r>
+      <w:r>
         <w:t>.</w:t>
       </w:r>
-      <w:r>
-        <w:t xml:space="preserve"> </w:t>
-      </w:r>
-      <w:r>
-        <w:t xml:space="preserve">Input and output of the non-inverting amplifier with a 100Ω load </w:t>
-      </w:r>
-      <w:r>
-        <w:t>and a 5</w:t>
-      </w:r>
-      <w:r>
-        <w:t>0</w:t>
-      </w:r>
-      <w:r>
-        <w:t>mV</w:t>
-      </w:r>
-      <w:r>
-        <w:t>pp</w:t>
-      </w:r>
-      <w:r>
-        <w:t xml:space="preserve"> input signal</w:t>
-      </w:r>
-      <w:r>
-        <w:t xml:space="preserve"> </w:t>
-      </w:r>
-      <w:r>
-        <w:t>and no capacitors connected to the power rails. The output is heavily distorted, with crossover distortion and clipped peaks.</w:t>
-      </w:r>
-    </w:p>
-    <w:p/>
+    </w:p>
     <w:p/>
     <w:p>
       <w:pPr>
@@ -9789,10 +9783,10 @@
           <w:noProof/>
         </w:rPr>
         <w:drawing>
-          <wp:inline distT="0" distB="0" distL="0" distR="0" wp14:anchorId="39012C91" wp14:editId="1C7E440F">
-            <wp:extent cx="5046562" cy="3248915"/>
-            <wp:effectExtent l="0" t="0" r="0" b="2540"/>
-            <wp:docPr id="1867589635" name="Picture 26"/>
+          <wp:inline distT="0" distB="0" distL="0" distR="0" wp14:anchorId="4F499D70" wp14:editId="34D0C232">
+            <wp:extent cx="4720590" cy="3039059"/>
+            <wp:effectExtent l="0" t="0" r="3810" b="0"/>
+            <wp:docPr id="1045293125" name="Picture 24"/>
             <wp:cNvGraphicFramePr>
               <a:graphicFrameLocks xmlns:a="http://schemas.openxmlformats.org/drawingml/2006/main" noChangeAspect="1"/>
             </wp:cNvGraphicFramePr>
@@ -9800,7 +9794,7 @@
               <a:graphicData uri="http://schemas.openxmlformats.org/drawingml/2006/picture">
                 <pic:pic xmlns:pic="http://schemas.openxmlformats.org/drawingml/2006/picture">
                   <pic:nvPicPr>
-                    <pic:cNvPr id="1867589635" name="Picture 1867589635"/>
+                    <pic:cNvPr id="1045293125" name="Picture 1045293125"/>
                     <pic:cNvPicPr/>
                   </pic:nvPicPr>
                   <pic:blipFill>
@@ -9818,7 +9812,7 @@
                   <pic:spPr>
                     <a:xfrm>
                       <a:off x="0" y="0"/>
-                      <a:ext cx="5096015" cy="3280752"/>
+                      <a:ext cx="4772205" cy="3072288"/>
                     </a:xfrm>
                     <a:prstGeom prst="rect">
                       <a:avLst/>
@@ -9852,6 +9846,134 @@
         <w:rPr>
           <w:noProof/>
         </w:rPr>
+        <w:t>29</w:t>
+      </w:r>
+      <w:r>
+        <w:fldChar w:fldCharType="end"/>
+      </w:r>
+      <w:r>
+        <w:t>.</w:t>
+      </w:r>
+      <w:r>
+        <w:t xml:space="preserve"> </w:t>
+      </w:r>
+      <w:r>
+        <w:t>Input and output of the non-inverting amplifier with a 100 Ω load and a 50 mV p-p input signal, with no capacitors connected to the power rails. The positive half-cycle of the output is almost completely lost (V</w:t>
+      </w:r>
+      <w:r>
+        <w:rPr>
+          <w:vertAlign w:val="subscript"/>
+        </w:rPr>
+        <w:t>OH</w:t>
+      </w:r>
+      <w:r>
+        <w:t xml:space="preserve"> stays close to 0V), while the negative half-cycle is reproduced with the expected amplitude</w:t>
+      </w:r>
+      <w:r>
+        <w:t>.</w:t>
+      </w:r>
+    </w:p>
+    <w:p/>
+    <w:p>
+      <w:r>
+        <w:t xml:space="preserve">When the filter and bypass capacitors are removed, the positive half-cycle of the output is lost while the negative half-cycle is still reproduced. The load and the input signal are unchanged from Figure 28, so the difference must be due to the supply. The positive half-cycle is sourced from the </w:t>
+      </w:r>
+      <w:r>
+        <w:t>V</w:t>
+      </w:r>
+      <w:r>
+        <w:t xml:space="preserve">+ rail, so the load current of up to about 25 mA must be delivered through the supply leads. </w:t>
+      </w:r>
+      <w:r>
+        <w:t>T</w:t>
+      </w:r>
+      <w:r>
+        <w:t>he resistance and inductance of the leads most likely prevent the rail from holding its voltage at the op-amp, and</w:t>
+      </w:r>
+      <w:r>
+        <w:t xml:space="preserve"> </w:t>
+      </w:r>
+      <w:r>
+        <w:t>also make the op-amp unstable, so the output cannot be driven positive</w:t>
+      </w:r>
+      <w:r>
+        <w:t>.</w:t>
+      </w:r>
+    </w:p>
+    <w:p/>
+    <w:p>
+      <w:pPr>
+        <w:keepNext/>
+        <w:jc w:val="center"/>
+      </w:pPr>
+      <w:r>
+        <w:rPr>
+          <w:noProof/>
+        </w:rPr>
+        <w:drawing>
+          <wp:inline distT="0" distB="0" distL="0" distR="0" wp14:anchorId="39012C91" wp14:editId="5C72A27F">
+            <wp:extent cx="4743450" cy="3053775"/>
+            <wp:effectExtent l="0" t="0" r="0" b="0"/>
+            <wp:docPr id="1867589635" name="Picture 26"/>
+            <wp:cNvGraphicFramePr>
+              <a:graphicFrameLocks xmlns:a="http://schemas.openxmlformats.org/drawingml/2006/main" noChangeAspect="1"/>
+            </wp:cNvGraphicFramePr>
+            <a:graphic xmlns:a="http://schemas.openxmlformats.org/drawingml/2006/main">
+              <a:graphicData uri="http://schemas.openxmlformats.org/drawingml/2006/picture">
+                <pic:pic xmlns:pic="http://schemas.openxmlformats.org/drawingml/2006/picture">
+                  <pic:nvPicPr>
+                    <pic:cNvPr id="1867589635" name="Picture 1867589635"/>
+                    <pic:cNvPicPr/>
+                  </pic:nvPicPr>
+                  <pic:blipFill>
+                    <a:blip r:embed="rId43" cstate="print">
+                      <a:extLst>
+                        <a:ext uri="{28A0092B-C50C-407E-A947-70E740481C1C}">
+                          <a14:useLocalDpi xmlns:a14="http://schemas.microsoft.com/office/drawing/2010/main" val="0"/>
+                        </a:ext>
+                      </a:extLst>
+                    </a:blip>
+                    <a:stretch>
+                      <a:fillRect/>
+                    </a:stretch>
+                  </pic:blipFill>
+                  <pic:spPr>
+                    <a:xfrm>
+                      <a:off x="0" y="0"/>
+                      <a:ext cx="4802592" cy="3091850"/>
+                    </a:xfrm>
+                    <a:prstGeom prst="rect">
+                      <a:avLst/>
+                    </a:prstGeom>
+                  </pic:spPr>
+                </pic:pic>
+              </a:graphicData>
+            </a:graphic>
+          </wp:inline>
+        </w:drawing>
+      </w:r>
+    </w:p>
+    <w:p>
+      <w:pPr>
+        <w:pStyle w:val="Caption"/>
+        <w:ind w:left="0" w:firstLine="0"/>
+      </w:pPr>
+      <w:r>
+        <w:t xml:space="preserve">Figure </w:t>
+      </w:r>
+      <w:r>
+        <w:fldChar w:fldCharType="begin"/>
+      </w:r>
+      <w:r>
+        <w:instrText xml:space="preserve"> SEQ Figure \* ARABIC </w:instrText>
+      </w:r>
+      <w:r>
+        <w:fldChar w:fldCharType="separate"/>
+      </w:r>
+      <w:r>
+        <w:rPr>
+          <w:noProof/>
+        </w:rPr>
         <w:t>30</w:t>
       </w:r>
       <w:r>
@@ -9900,6 +10022,18 @@
         <w:t>distortion.</w:t>
       </w:r>
     </w:p>
+    <w:p/>
+    <w:p>
+      <w:r>
+        <w:t xml:space="preserve">When the load is removed and no large current is drawn, the crossover distortion disappears </w:t>
+      </w:r>
+      <w:r>
+        <w:t xml:space="preserve">as seen in </w:t>
+      </w:r>
+      <w:r>
+        <w:t>Figure 30. With almost no output current to supply or reverse, the feedback loop can correct the small dead zone as the output stage passes through zero, so the output follows the input without visible distortion.</w:t>
+      </w:r>
+    </w:p>
     <w:p>
       <w:pPr>
         <w:pStyle w:val="Heading2"/>
@@ -9909,6 +10043,8 @@
       </w:r>
     </w:p>
     <w:p/>
+    <w:p/>
+    <w:p/>
     <w:p>
       <w:pPr>
         <w:pStyle w:val="Heading2"/>
@@ -10131,7 +10267,6 @@
         <w:rPr>
           <w:lang w:val="en-US"/>
         </w:rPr>
-        <w:lastRenderedPageBreak/>
         <w:t>The measurement results should b</w:t>
       </w:r>
       <w:r>
@@ -10504,6 +10639,7 @@
                 <w:sz w:val="20"/>
                 <w:szCs w:val="20"/>
               </w:rPr>
+              <w:lastRenderedPageBreak/>
               <w:t>Charge</w:t>
             </w:r>
             <w:proofErr w:type="spellEnd"/>
@@ -11900,7 +12036,6 @@
         <w:rPr>
           <w:noProof/>
         </w:rPr>
-        <w:lastRenderedPageBreak/>
         <mc:AlternateContent>
           <mc:Choice Requires="wps">
             <w:drawing>
@@ -12103,7 +12238,7 @@
                           </pic:cNvPicPr>
                         </pic:nvPicPr>
                         <pic:blipFill>
-                          <a:blip r:embed="rId43"/>
+                          <a:blip r:embed="rId44"/>
                           <a:stretch>
                             <a:fillRect/>
                           </a:stretch>
@@ -12132,7 +12267,7 @@
                           </pic:cNvPicPr>
                         </pic:nvPicPr>
                         <pic:blipFill>
-                          <a:blip r:embed="rId44"/>
+                          <a:blip r:embed="rId45"/>
                           <a:stretch>
                             <a:fillRect/>
                           </a:stretch>
@@ -12161,7 +12296,7 @@
                           </pic:cNvPicPr>
                         </pic:nvPicPr>
                         <pic:blipFill>
-                          <a:blip r:embed="rId45"/>
+                          <a:blip r:embed="rId46"/>
                           <a:stretch>
                             <a:fillRect/>
                           </a:stretch>
@@ -12190,7 +12325,7 @@
                           </pic:cNvPicPr>
                         </pic:nvPicPr>
                         <pic:blipFill>
-                          <a:blip r:embed="rId46"/>
+                          <a:blip r:embed="rId47"/>
                           <a:stretch>
                             <a:fillRect/>
                           </a:stretch>
@@ -12219,7 +12354,7 @@
                           </pic:cNvPicPr>
                         </pic:nvPicPr>
                         <pic:blipFill>
-                          <a:blip r:embed="rId47"/>
+                          <a:blip r:embed="rId48"/>
                           <a:stretch>
                             <a:fillRect/>
                           </a:stretch>
@@ -12269,19 +12404,19 @@
                   <o:lock v:ext="edit" aspectratio="t"/>
                 </v:shapetype>
                 <v:shape id="Picture 2" o:spid="_x0000_s1027" type="#_x0000_t75" style="position:absolute;width:22384;height:19252;visibility:visible;mso-wrap-style:square" o:gfxdata="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">
-                  <v:imagedata r:id="rId48" o:title=""/>
+                  <v:imagedata r:id="rId49" o:title=""/>
                 </v:shape>
                 <v:shape id="Picture 3" o:spid="_x0000_s1028" type="#_x0000_t75" style="position:absolute;left:23399;width:22385;height:19252;visibility:visible;mso-wrap-style:square" o:gfxdata="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">
-                  <v:imagedata r:id="rId49" o:title=""/>
+                  <v:imagedata r:id="rId50" o:title=""/>
                 </v:shape>
                 <v:shape id="Picture 4" o:spid="_x0000_s1029" type="#_x0000_t75" style="position:absolute;top:18071;width:22384;height:18417;visibility:visible;mso-wrap-style:square" o:gfxdata="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">
-                  <v:imagedata r:id="rId50" o:title=""/>
+                  <v:imagedata r:id="rId51" o:title=""/>
                 </v:shape>
                 <v:shape id="Picture 5" o:spid="_x0000_s1030" type="#_x0000_t75" style="position:absolute;left:22384;top:17653;width:23400;height:19253;visibility:visible;mso-wrap-style:square" o:gfxdata="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">
-                  <v:imagedata r:id="rId51" o:title=""/>
+                  <v:imagedata r:id="rId52" o:title=""/>
                 </v:shape>
                 <v:shape id="Picture 6" o:spid="_x0000_s1031" type="#_x0000_t75" style="position:absolute;left:11688;top:36756;width:22396;height:3494;visibility:visible;mso-wrap-style:square" o:gfxdata="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">
-                  <v:imagedata r:id="rId52" o:title=""/>
+                  <v:imagedata r:id="rId53" o:title=""/>
                 </v:shape>
                 <w10:wrap type="topAndBottom" anchory="page"/>
               </v:group>
@@ -12534,6 +12669,7 @@
         <w:rPr>
           <w:lang w:val="en-US"/>
         </w:rPr>
+        <w:lastRenderedPageBreak/>
         <w:t>”</w:t>
       </w:r>
       <w:r>
@@ -12871,14 +13007,7 @@
         <w:rPr>
           <w:lang w:val="en-US"/>
         </w:rPr>
-        <w:t xml:space="preserve"> The </w:t>
-      </w:r>
-      <w:r>
-        <w:rPr>
-          <w:lang w:val="en-US"/>
-        </w:rPr>
-        <w:lastRenderedPageBreak/>
-        <w:t>charger is specified to have output voltage between 45.5 and 5.5 V. According to our measurements, this specification is fulfilled.</w:t>
+        <w:t xml:space="preserve"> The charger is specified to have output voltage between 45.5 and 5.5 V. According to our measurements, this specification is fulfilled.</w:t>
       </w:r>
       <w:r>
         <w:rPr>
@@ -13006,7 +13135,7 @@
         </w:rPr>
         <w:t xml:space="preserve"> Available </w:t>
       </w:r>
-      <w:hyperlink r:id="rId53" w:history="1">
+      <w:hyperlink r:id="rId54" w:history="1">
         <w:r>
           <w:rPr>
             <w:rStyle w:val="Hyperlink"/>
@@ -13100,7 +13229,7 @@
         </w:rPr>
         <w:t xml:space="preserve">. Dallas, TX: Texas Instruments. Available at: </w:t>
       </w:r>
-      <w:hyperlink r:id="rId54" w:history="1">
+      <w:hyperlink r:id="rId55" w:history="1">
         <w:r>
           <w:rPr>
             <w:rStyle w:val="Hyperlink"/>
@@ -13188,7 +13317,7 @@
       <w:r>
         <w:t xml:space="preserve">Available at: </w:t>
       </w:r>
-      <w:hyperlink r:id="rId55" w:history="1">
+      <w:hyperlink r:id="rId56" w:history="1">
         <w:r>
           <w:rPr>
             <w:rStyle w:val="Hyperlink"/>
@@ -13298,7 +13427,7 @@
       <w:r>
         <w:t xml:space="preserve">Available at: </w:t>
       </w:r>
-      <w:hyperlink r:id="rId56" w:tgtFrame="_blank" w:history="1">
+      <w:hyperlink r:id="rId57" w:tgtFrame="_blank" w:history="1">
         <w:r>
           <w:rPr>
             <w:rStyle w:val="Hyperlink"/>
@@ -13424,6 +13553,7 @@
         <w:rPr>
           <w:lang w:val="en-US"/>
         </w:rPr>
+        <w:lastRenderedPageBreak/>
         <w:t>Note, that “Appendix” does n</w:t>
       </w:r>
       <w:r>
@@ -13532,10 +13662,10 @@
       </w:pPr>
     </w:p>
     <w:sectPr>
-      <w:headerReference w:type="default" r:id="rId57"/>
-      <w:footerReference w:type="default" r:id="rId58"/>
-      <w:headerReference w:type="first" r:id="rId59"/>
-      <w:footerReference w:type="first" r:id="rId60"/>
+      <w:headerReference w:type="default" r:id="rId58"/>
+      <w:footerReference w:type="default" r:id="rId59"/>
+      <w:headerReference w:type="first" r:id="rId60"/>
+      <w:footerReference w:type="first" r:id="rId61"/>
       <w:type w:val="continuous"/>
       <w:pgSz w:w="11907" w:h="16840" w:code="9"/>
       <w:pgMar w:top="1440" w:right="1080" w:bottom="1440" w:left="1080" w:header="708" w:footer="708" w:gutter="0"/>

</xml_diff>